<commit_message>
Refactor document generation and formatting for collaborative and individual protocols
- Updated collaborative and individual protocol templates to ensure consistent formatting.
- Implemented strict rules for bullet points and bibliography formatting in both protocols.
- Changed font style to Times New Roman across all document exports (DOCX and PDF).
- Enhanced bibliography handling to prevent numbering and bold formatting.
- Improved extraction and formatting logic for discussion summaries, agreements, and disagreements.
- Added tests to verify formatting rules and content extraction for protocols.
</commit_message>
<xml_diff>
--- a/public/templates/PLANTILLA PROTOCOLO COLABORATIVO.docx
+++ b/public/templates/PLANTILLA PROTOCOLO COLABORATIVO.docx
@@ -9,7 +9,7 @@
         <w:ind/>
         <w:jc w:val="center"/>
         <w:rPr>
-          <w:rFonts w:ascii="Arial" w:hAnsi="Arial" w:eastAsia="Arial" w:cs="Arial"/>
+          <w:rFonts w:ascii="Times New Roman" w:hAnsi="Times New Roman" w:eastAsia="Times New Roman" w:cs="Times New Roman"/>
           <w:b/>
           <w:bCs/>
           <w:color w:val="002060"/>
@@ -19,7 +19,7 @@
       </w:pPr>
       <w:r>
         <w:rPr>
-          <w:rFonts w:ascii="Arial" w:hAnsi="Arial" w:eastAsia="Arial" w:cs="Arial"/>
+          <w:rFonts w:ascii="Times New Roman" w:hAnsi="Times New Roman" w:eastAsia="Times New Roman" w:cs="Times New Roman"/>
           <w:b/>
           <w:bCs/>
           <w:color w:val="002060"/>
@@ -31,7 +31,7 @@
       </w:r>
       <w:r>
         <w:rPr>
-          <w:rFonts w:ascii="Arial" w:hAnsi="Arial" w:eastAsia="Arial" w:cs="Arial"/>
+          <w:rFonts w:ascii="Times New Roman" w:hAnsi="Times New Roman" w:eastAsia="Times New Roman" w:cs="Times New Roman"/>
           <w:b/>
           <w:bCs/>
           <w:color w:val="002060"/>
@@ -47,7 +47,7 @@
         <w:ind/>
         <w:jc w:val="both"/>
         <w:rPr>
-          <w:rFonts w:ascii="Arial" w:hAnsi="Arial" w:eastAsia="Arial" w:cs="Arial"/>
+          <w:rFonts w:ascii="Times New Roman" w:hAnsi="Times New Roman" w:eastAsia="Times New Roman" w:cs="Times New Roman"/>
           <w:b/>
           <w:bCs/>
         </w:rPr>
@@ -61,7 +61,7 @@
       </w:r>
       <w:r>
         <w:rPr>
-          <w:rFonts w:ascii="Arial" w:hAnsi="Arial" w:eastAsia="Arial" w:cs="Arial"/>
+          <w:rFonts w:ascii="Times New Roman" w:hAnsi="Times New Roman" w:eastAsia="Times New Roman" w:cs="Times New Roman"/>
           <w:b/>
           <w:bCs/>
         </w:rPr>
@@ -105,7 +105,7 @@
               <w:ind/>
               <w:jc w:val="both"/>
               <w:rPr>
-                <w:rFonts w:ascii="Arial" w:hAnsi="Arial" w:eastAsia="Arial" w:cs="Arial"/>
+                <w:rFonts w:ascii="Times New Roman" w:hAnsi="Times New Roman" w:eastAsia="Times New Roman" w:cs="Times New Roman"/>
                 <w:b/>
                 <w:bCs/>
               </w:rPr>
@@ -126,7 +126,7 @@
             <w:bookmarkEnd w:id="0"/>
             <w:r>
               <w:rPr>
-                <w:rFonts w:ascii="Arial" w:hAnsi="Arial" w:eastAsia="Arial" w:cs="Arial"/>
+                <w:rFonts w:ascii="Times New Roman" w:hAnsi="Times New Roman" w:eastAsia="Times New Roman" w:cs="Times New Roman"/>
                 <w:b/>
                 <w:bCs/>
                 <w:rtl w:val="0"/>
@@ -135,7 +135,7 @@
             </w:r>
             <w:r>
               <w:rPr>
-                <w:rFonts w:ascii="Arial" w:hAnsi="Arial" w:eastAsia="Arial" w:cs="Arial"/>
+                <w:rFonts w:ascii="Times New Roman" w:hAnsi="Times New Roman" w:eastAsia="Times New Roman" w:cs="Times New Roman"/>
                 <w:b/>
                 <w:bCs/>
                 <w:rtl w:val="0"/>
@@ -144,7 +144,7 @@
             </w:r>
             <w:r>
               <w:rPr>
-                <w:rFonts w:ascii="Arial" w:hAnsi="Arial" w:eastAsia="Arial" w:cs="Arial"/>
+                <w:rFonts w:ascii="Times New Roman" w:hAnsi="Times New Roman" w:eastAsia="Times New Roman" w:cs="Times New Roman"/>
                 <w:b/>
                 <w:bCs/>
               </w:rPr>
@@ -167,14 +167,14 @@
               <w:ind/>
               <w:jc w:val="both"/>
               <w:rPr>
-                <w:rFonts w:ascii="Arial" w:hAnsi="Arial" w:eastAsia="Arial" w:cs="Arial"/>
+                <w:rFonts w:ascii="Times New Roman" w:hAnsi="Times New Roman" w:eastAsia="Times New Roman" w:cs="Times New Roman"/>
                 <w:b/>
                 <w:bCs/>
               </w:rPr>
             </w:pPr>
             <w:r>
               <w:rPr>
-                <w:rFonts w:ascii="Arial" w:hAnsi="Arial" w:eastAsia="Arial" w:cs="Arial"/>
+                <w:rFonts w:ascii="Times New Roman" w:hAnsi="Times New Roman" w:eastAsia="Times New Roman" w:cs="Times New Roman"/>
                 <w:b/>
                 <w:bCs/>
                 <w:rtl w:val="0"/>
@@ -183,7 +183,7 @@
             </w:r>
             <w:r>
               <w:rPr>
-                <w:rFonts w:ascii="Arial" w:hAnsi="Arial" w:eastAsia="Arial" w:cs="Arial"/>
+                <w:rFonts w:ascii="Times New Roman" w:hAnsi="Times New Roman" w:eastAsia="Times New Roman" w:cs="Times New Roman"/>
                 <w:b/>
                 <w:bCs/>
               </w:rPr>
@@ -196,7 +196,7 @@
               <w:ind/>
               <w:jc w:val="both"/>
               <w:rPr>
-                <w:rFonts w:ascii="Arial" w:hAnsi="Arial" w:eastAsia="Arial" w:cs="Arial"/>
+                <w:rFonts w:ascii="Times New Roman" w:hAnsi="Times New Roman" w:eastAsia="Times New Roman" w:cs="Times New Roman"/>
                 <w:b/>
                 <w:bCs/>
               </w:rPr>
@@ -210,7 +210,7 @@
             </w:r>
             <w:r>
               <w:rPr>
-                <w:rFonts w:ascii="Arial" w:hAnsi="Arial" w:eastAsia="Arial" w:cs="Arial"/>
+                <w:rFonts w:ascii="Times New Roman" w:hAnsi="Times New Roman" w:eastAsia="Times New Roman" w:cs="Times New Roman"/>
                 <w:b/>
                 <w:bCs/>
               </w:rPr>
@@ -233,14 +233,14 @@
               <w:ind/>
               <w:jc w:val="both"/>
               <w:rPr>
-                <w:rFonts w:ascii="Arial" w:hAnsi="Arial" w:eastAsia="Arial" w:cs="Arial"/>
+                <w:rFonts w:ascii="Times New Roman" w:hAnsi="Times New Roman" w:eastAsia="Times New Roman" w:cs="Times New Roman"/>
                 <w:b/>
                 <w:bCs/>
               </w:rPr>
             </w:pPr>
             <w:r>
               <w:rPr>
-                <w:rFonts w:ascii="Arial" w:hAnsi="Arial" w:eastAsia="Arial" w:cs="Arial"/>
+                <w:rFonts w:ascii="Times New Roman" w:hAnsi="Times New Roman" w:eastAsia="Times New Roman" w:cs="Times New Roman"/>
                 <w:b/>
                 <w:bCs/>
                 <w:rtl w:val="0"/>
@@ -249,7 +249,7 @@
             </w:r>
             <w:r>
               <w:rPr>
-                <w:rFonts w:ascii="Arial" w:hAnsi="Arial" w:eastAsia="Arial" w:cs="Arial"/>
+                <w:rFonts w:ascii="Times New Roman" w:hAnsi="Times New Roman" w:eastAsia="Times New Roman" w:cs="Times New Roman"/>
                 <w:b/>
                 <w:bCs/>
               </w:rPr>
@@ -272,7 +272,7 @@
               <w:ind/>
               <w:jc w:val="both"/>
               <w:rPr>
-                <w:rFonts w:ascii="Arial" w:hAnsi="Arial" w:eastAsia="Arial" w:cs="Arial"/>
+                <w:rFonts w:ascii="Times New Roman" w:hAnsi="Times New Roman" w:eastAsia="Times New Roman" w:cs="Times New Roman"/>
                 <w:b/>
                 <w:bCs/>
                 <w:color w:val="002060"/>
@@ -282,7 +282,7 @@
             </w:pPr>
             <w:r>
               <w:rPr>
-                <w:rFonts w:ascii="Arial" w:hAnsi="Arial" w:eastAsia="Arial" w:cs="Arial"/>
+                <w:rFonts w:ascii="Times New Roman" w:hAnsi="Times New Roman" w:eastAsia="Times New Roman" w:cs="Times New Roman"/>
                 <w:b/>
                 <w:bCs/>
                 <w:rtl w:val="0"/>
@@ -298,7 +298,7 @@
             </w:r>
             <w:r>
               <w:rPr>
-                <w:rFonts w:ascii="Arial" w:hAnsi="Arial" w:eastAsia="Arial" w:cs="Arial"/>
+                <w:rFonts w:ascii="Times New Roman" w:hAnsi="Times New Roman" w:eastAsia="Times New Roman" w:cs="Times New Roman"/>
                 <w:b/>
                 <w:bCs/>
                 <w:color w:val="002060"/>
@@ -314,7 +314,7 @@
               <w:ind/>
               <w:jc w:val="both"/>
               <w:rPr>
-                <w:rFonts w:ascii="Arial" w:hAnsi="Arial" w:eastAsia="Arial" w:cs="Arial"/>
+                <w:rFonts w:ascii="Times New Roman" w:hAnsi="Times New Roman" w:eastAsia="Times New Roman" w:cs="Times New Roman"/>
                 <w:b/>
                 <w:bCs/>
                 <w:color w:val="002060"/>
@@ -331,7 +331,7 @@
             </w:r>
             <w:r>
               <w:rPr>
-                <w:rFonts w:ascii="Arial" w:hAnsi="Arial" w:eastAsia="Arial" w:cs="Arial"/>
+                <w:rFonts w:ascii="Times New Roman" w:hAnsi="Times New Roman" w:eastAsia="Times New Roman" w:cs="Times New Roman"/>
                 <w:b/>
                 <w:bCs/>
                 <w:color w:val="002060"/>
@@ -357,14 +357,14 @@
               <w:ind/>
               <w:jc w:val="both"/>
               <w:rPr>
-                <w:rFonts w:ascii="Arial" w:hAnsi="Arial" w:eastAsia="Arial" w:cs="Arial"/>
+                <w:rFonts w:ascii="Times New Roman" w:hAnsi="Times New Roman" w:eastAsia="Times New Roman" w:cs="Times New Roman"/>
                 <w:b/>
                 <w:bCs/>
               </w:rPr>
             </w:pPr>
             <w:r>
               <w:rPr>
-                <w:rFonts w:ascii="Arial" w:hAnsi="Arial" w:eastAsia="Arial" w:cs="Arial"/>
+                <w:rFonts w:ascii="Times New Roman" w:hAnsi="Times New Roman" w:eastAsia="Times New Roman" w:cs="Times New Roman"/>
                 <w:b/>
                 <w:bCs/>
                 <w:rtl w:val="0"/>
@@ -373,7 +373,7 @@
             </w:r>
             <w:r>
               <w:rPr>
-                <w:rFonts w:ascii="Arial" w:hAnsi="Arial" w:eastAsia="Arial" w:cs="Arial"/>
+                <w:rFonts w:ascii="Times New Roman" w:hAnsi="Times New Roman" w:eastAsia="Times New Roman" w:cs="Times New Roman"/>
                 <w:b/>
                 <w:bCs/>
               </w:rPr>
@@ -396,14 +396,14 @@
               <w:ind/>
               <w:jc w:val="both"/>
               <w:rPr>
-                <w:rFonts w:ascii="Arial" w:hAnsi="Arial" w:eastAsia="Arial" w:cs="Arial"/>
+                <w:rFonts w:ascii="Times New Roman" w:hAnsi="Times New Roman" w:eastAsia="Times New Roman" w:cs="Times New Roman"/>
                 <w:b/>
                 <w:bCs/>
               </w:rPr>
             </w:pPr>
             <w:r>
               <w:rPr>
-                <w:rFonts w:ascii="Arial" w:hAnsi="Arial" w:eastAsia="Arial" w:cs="Arial"/>
+                <w:rFonts w:ascii="Times New Roman" w:hAnsi="Times New Roman" w:eastAsia="Times New Roman" w:cs="Times New Roman"/>
                 <w:b/>
                 <w:bCs/>
                 <w:rtl w:val="0"/>
@@ -412,7 +412,7 @@
             </w:r>
             <w:r>
               <w:rPr>
-                <w:rFonts w:ascii="Arial" w:hAnsi="Arial" w:eastAsia="Arial" w:cs="Arial"/>
+                <w:rFonts w:ascii="Times New Roman" w:hAnsi="Times New Roman" w:eastAsia="Times New Roman" w:cs="Times New Roman"/>
                 <w:b/>
                 <w:bCs/>
                 <w:rtl w:val="0"/>
@@ -422,7 +422,7 @@
             </w:r>
             <w:r>
               <w:rPr>
-                <w:rFonts w:ascii="Arial" w:hAnsi="Arial" w:eastAsia="Arial" w:cs="Arial"/>
+                <w:rFonts w:ascii="Times New Roman" w:hAnsi="Times New Roman" w:eastAsia="Times New Roman" w:cs="Times New Roman"/>
                 <w:b/>
                 <w:bCs/>
               </w:rPr>
@@ -445,14 +445,14 @@
               <w:ind/>
               <w:jc w:val="both"/>
               <w:rPr>
-                <w:rFonts w:ascii="Arial" w:hAnsi="Arial" w:eastAsia="Arial" w:cs="Arial"/>
+                <w:rFonts w:ascii="Times New Roman" w:hAnsi="Times New Roman" w:eastAsia="Times New Roman" w:cs="Times New Roman"/>
                 <w:b/>
                 <w:bCs/>
               </w:rPr>
             </w:pPr>
             <w:r>
               <w:rPr>
-                <w:rFonts w:ascii="Arial" w:hAnsi="Arial" w:eastAsia="Arial" w:cs="Arial"/>
+                <w:rFonts w:ascii="Times New Roman" w:hAnsi="Times New Roman" w:eastAsia="Times New Roman" w:cs="Times New Roman"/>
                 <w:b/>
                 <w:bCs/>
                 <w:rtl w:val="0"/>
@@ -461,7 +461,7 @@
             </w:r>
             <w:r>
               <w:rPr>
-                <w:rFonts w:ascii="Arial" w:hAnsi="Arial" w:eastAsia="Arial" w:cs="Arial"/>
+                <w:rFonts w:ascii="Times New Roman" w:hAnsi="Times New Roman" w:eastAsia="Times New Roman" w:cs="Times New Roman"/>
                 <w:b/>
                 <w:bCs/>
               </w:rPr>
@@ -484,14 +484,14 @@
               <w:ind/>
               <w:jc w:val="both"/>
               <w:rPr>
-                <w:rFonts w:ascii="Arial" w:hAnsi="Arial" w:eastAsia="Arial" w:cs="Arial"/>
+                <w:rFonts w:ascii="Times New Roman" w:hAnsi="Times New Roman" w:eastAsia="Times New Roman" w:cs="Times New Roman"/>
                 <w:b/>
                 <w:bCs/>
               </w:rPr>
             </w:pPr>
             <w:r>
               <w:rPr>
-                <w:rFonts w:ascii="Arial" w:hAnsi="Arial" w:eastAsia="Arial" w:cs="Arial"/>
+                <w:rFonts w:ascii="Times New Roman" w:hAnsi="Times New Roman" w:eastAsia="Times New Roman" w:cs="Times New Roman"/>
                 <w:b/>
                 <w:bCs/>
                 <w:rtl w:val="0"/>
@@ -500,7 +500,7 @@
             </w:r>
             <w:r>
               <w:rPr>
-                <w:rFonts w:ascii="Arial" w:hAnsi="Arial" w:eastAsia="Arial" w:cs="Arial"/>
+                <w:rFonts w:ascii="Times New Roman" w:hAnsi="Times New Roman" w:eastAsia="Times New Roman" w:cs="Times New Roman"/>
                 <w:b/>
                 <w:bCs/>
               </w:rPr>
@@ -523,14 +523,14 @@
               <w:ind/>
               <w:jc w:val="both"/>
               <w:rPr>
-                <w:rFonts w:ascii="Arial" w:hAnsi="Arial" w:eastAsia="Arial" w:cs="Arial"/>
+                <w:rFonts w:ascii="Times New Roman" w:hAnsi="Times New Roman" w:eastAsia="Times New Roman" w:cs="Times New Roman"/>
                 <w:b/>
                 <w:bCs/>
               </w:rPr>
             </w:pPr>
             <w:r>
               <w:rPr>
-                <w:rFonts w:ascii="Arial" w:hAnsi="Arial" w:eastAsia="Arial" w:cs="Arial"/>
+                <w:rFonts w:ascii="Times New Roman" w:hAnsi="Times New Roman" w:eastAsia="Times New Roman" w:cs="Times New Roman"/>
                 <w:b/>
                 <w:bCs/>
                 <w:rtl w:val="0"/>
@@ -539,7 +539,7 @@
             </w:r>
             <w:r>
               <w:rPr>
-                <w:rFonts w:ascii="Arial" w:hAnsi="Arial" w:eastAsia="Arial" w:cs="Arial"/>
+                <w:rFonts w:ascii="Times New Roman" w:hAnsi="Times New Roman" w:eastAsia="Times New Roman" w:cs="Times New Roman"/>
                 <w:b/>
                 <w:bCs/>
                 <w:rtl w:val="0"/>
@@ -549,7 +549,7 @@
             </w:r>
             <w:r>
               <w:rPr>
-                <w:rFonts w:ascii="Arial" w:hAnsi="Arial" w:eastAsia="Arial" w:cs="Arial"/>
+                <w:rFonts w:ascii="Times New Roman" w:hAnsi="Times New Roman" w:eastAsia="Times New Roman" w:cs="Times New Roman"/>
                 <w:b/>
                 <w:bCs/>
               </w:rPr>
@@ -572,14 +572,14 @@
               <w:ind/>
               <w:jc w:val="both"/>
               <w:rPr>
-                <w:rFonts w:ascii="Arial" w:hAnsi="Arial" w:eastAsia="Arial" w:cs="Arial"/>
+                <w:rFonts w:ascii="Times New Roman" w:hAnsi="Times New Roman" w:eastAsia="Times New Roman" w:cs="Times New Roman"/>
                 <w:b/>
                 <w:bCs/>
               </w:rPr>
             </w:pPr>
             <w:r>
               <w:rPr>
-                <w:rFonts w:ascii="Arial" w:hAnsi="Arial" w:eastAsia="Arial" w:cs="Arial"/>
+                <w:rFonts w:ascii="Times New Roman" w:hAnsi="Times New Roman" w:eastAsia="Times New Roman" w:cs="Times New Roman"/>
                 <w:b/>
                 <w:bCs/>
                 <w:rtl w:val="0"/>
@@ -588,7 +588,7 @@
             </w:r>
             <w:r>
               <w:rPr>
-                <w:rFonts w:ascii="Arial" w:hAnsi="Arial" w:eastAsia="Arial" w:cs="Arial"/>
+                <w:rFonts w:ascii="Times New Roman" w:hAnsi="Times New Roman" w:eastAsia="Times New Roman" w:cs="Times New Roman"/>
                 <w:b/>
                 <w:bCs/>
                 <w:rtl w:val="0"/>
@@ -598,7 +598,7 @@
             </w:r>
             <w:r>
               <w:rPr>
-                <w:rFonts w:ascii="Arial" w:hAnsi="Arial" w:eastAsia="Arial" w:cs="Arial"/>
+                <w:rFonts w:ascii="Times New Roman" w:hAnsi="Times New Roman" w:eastAsia="Times New Roman" w:cs="Times New Roman"/>
                 <w:b/>
                 <w:bCs/>
               </w:rPr>
@@ -621,14 +621,14 @@
               <w:ind/>
               <w:jc w:val="both"/>
               <w:rPr>
-                <w:rFonts w:ascii="Arial" w:hAnsi="Arial" w:eastAsia="Arial" w:cs="Arial"/>
+                <w:rFonts w:ascii="Times New Roman" w:hAnsi="Times New Roman" w:eastAsia="Times New Roman" w:cs="Times New Roman"/>
                 <w:b/>
                 <w:bCs/>
               </w:rPr>
             </w:pPr>
             <w:r>
               <w:rPr>
-                <w:rFonts w:ascii="Arial" w:hAnsi="Arial" w:eastAsia="Arial" w:cs="Arial"/>
+                <w:rFonts w:ascii="Times New Roman" w:hAnsi="Times New Roman" w:eastAsia="Times New Roman" w:cs="Times New Roman"/>
                 <w:b/>
                 <w:bCs/>
                 <w:rtl w:val="0"/>
@@ -637,7 +637,7 @@
             </w:r>
             <w:r>
               <w:rPr>
-                <w:rFonts w:ascii="Arial" w:hAnsi="Arial" w:eastAsia="Arial" w:cs="Arial"/>
+                <w:rFonts w:ascii="Times New Roman" w:hAnsi="Times New Roman" w:eastAsia="Times New Roman" w:cs="Times New Roman"/>
                 <w:b/>
                 <w:bCs/>
                 <w:rtl w:val="0"/>
@@ -647,7 +647,7 @@
             </w:r>
             <w:r>
               <w:rPr>
-                <w:rFonts w:ascii="Arial" w:hAnsi="Arial" w:eastAsia="Arial" w:cs="Arial"/>
+                <w:rFonts w:ascii="Times New Roman" w:hAnsi="Times New Roman" w:eastAsia="Times New Roman" w:cs="Times New Roman"/>
                 <w:b/>
                 <w:bCs/>
               </w:rPr>
@@ -670,14 +670,14 @@
               <w:ind/>
               <w:jc w:val="both"/>
               <w:rPr>
-                <w:rFonts w:ascii="Arial" w:hAnsi="Arial" w:eastAsia="Arial" w:cs="Arial"/>
+                <w:rFonts w:ascii="Times New Roman" w:hAnsi="Times New Roman" w:eastAsia="Times New Roman" w:cs="Times New Roman"/>
                 <w:b/>
                 <w:bCs/>
               </w:rPr>
             </w:pPr>
             <w:r>
               <w:rPr>
-                <w:rFonts w:ascii="Arial" w:hAnsi="Arial" w:eastAsia="Arial" w:cs="Arial"/>
+                <w:rFonts w:ascii="Times New Roman" w:hAnsi="Times New Roman" w:eastAsia="Times New Roman" w:cs="Times New Roman"/>
                 <w:b/>
                 <w:bCs/>
                 <w:rtl w:val="0"/>
@@ -686,7 +686,7 @@
             </w:r>
             <w:r>
               <w:rPr>
-                <w:rFonts w:ascii="Arial" w:hAnsi="Arial" w:eastAsia="Arial" w:cs="Arial"/>
+                <w:rFonts w:ascii="Times New Roman" w:hAnsi="Times New Roman" w:eastAsia="Times New Roman" w:cs="Times New Roman"/>
                 <w:b/>
                 <w:bCs/>
                 <w:rtl w:val="0"/>
@@ -696,7 +696,7 @@
             </w:r>
             <w:r>
               <w:rPr>
-                <w:rFonts w:ascii="Arial" w:hAnsi="Arial" w:eastAsia="Arial" w:cs="Arial"/>
+                <w:rFonts w:ascii="Times New Roman" w:hAnsi="Times New Roman" w:eastAsia="Times New Roman" w:cs="Times New Roman"/>
                 <w:b/>
                 <w:bCs/>
               </w:rPr>
@@ -719,14 +719,14 @@
               <w:ind/>
               <w:jc w:val="both"/>
               <w:rPr>
-                <w:rFonts w:ascii="Arial" w:hAnsi="Arial" w:eastAsia="Arial" w:cs="Arial"/>
+                <w:rFonts w:ascii="Times New Roman" w:hAnsi="Times New Roman" w:eastAsia="Times New Roman" w:cs="Times New Roman"/>
                 <w:b/>
                 <w:bCs/>
               </w:rPr>
             </w:pPr>
             <w:r>
               <w:rPr>
-                <w:rFonts w:ascii="Arial" w:hAnsi="Arial" w:eastAsia="Arial" w:cs="Arial"/>
+                <w:rFonts w:ascii="Times New Roman" w:hAnsi="Times New Roman" w:eastAsia="Times New Roman" w:cs="Times New Roman"/>
                 <w:b/>
                 <w:bCs/>
                 <w:rtl w:val="0"/>
@@ -735,7 +735,7 @@
             </w:r>
             <w:r>
               <w:rPr>
-                <w:rFonts w:ascii="Arial" w:hAnsi="Arial" w:eastAsia="Arial" w:cs="Arial"/>
+                <w:rFonts w:ascii="Times New Roman" w:hAnsi="Times New Roman" w:eastAsia="Times New Roman" w:cs="Times New Roman"/>
                 <w:b/>
                 <w:bCs/>
               </w:rPr>
@@ -1296,7 +1296,7 @@
       <w:rPr>
         <w:sz w:val="24"/>
         <w:szCs w:val="24"/>
-        <w:lang w:val="es-CO" w:eastAsia="zh-CN" w:bidi="ar-SA"/>
+        <w:lang w:val="es-CO" w:eastAsia="Times New Roman" w:bidi="ar-SA"/>
       </w:rPr>
     </w:rPrDefault>
     <w:pPrDefault>
@@ -1730,7 +1730,7 @@
     </w:tblStylePr>
     <w:tblStylePr w:type="firstCol">
       <w:rPr>
-        <w:rFonts w:ascii="Arial" w:hAnsi="Arial"/>
+        <w:rFonts w:ascii="Times New Roman" w:hAnsi="Times New Roman"/>
         <w:b/>
         <w:color w:val="404040"/>
         <w:sz w:val="22"/>
@@ -1749,7 +1749,7 @@
     </w:tblStylePr>
     <w:tblStylePr w:type="firstRow">
       <w:rPr>
-        <w:rFonts w:ascii="Arial" w:hAnsi="Arial"/>
+        <w:rFonts w:ascii="Times New Roman" w:hAnsi="Times New Roman"/>
         <w:b/>
         <w:color w:val="404040"/>
         <w:sz w:val="22"/>
@@ -1768,7 +1768,7 @@
     </w:tblStylePr>
     <w:tblStylePr w:type="lastCol">
       <w:rPr>
-        <w:rFonts w:ascii="Arial" w:hAnsi="Arial"/>
+        <w:rFonts w:ascii="Times New Roman" w:hAnsi="Times New Roman"/>
         <w:b/>
         <w:color w:val="404040"/>
         <w:sz w:val="22"/>
@@ -1787,7 +1787,7 @@
     </w:tblStylePr>
     <w:tblStylePr w:type="lastRow">
       <w:rPr>
-        <w:rFonts w:ascii="Arial" w:hAnsi="Arial"/>
+        <w:rFonts w:ascii="Times New Roman" w:hAnsi="Times New Roman"/>
         <w:b/>
         <w:color w:val="404040"/>
         <w:sz w:val="22"/>
@@ -1960,7 +1960,7 @@
     </w:tblStylePr>
     <w:tblStylePr w:type="firstCol">
       <w:rPr>
-        <w:rFonts w:ascii="Arial" w:hAnsi="Arial"/>
+        <w:rFonts w:ascii="Times New Roman" w:hAnsi="Times New Roman"/>
         <w:b/>
         <w:color w:val="404040"/>
         <w:sz w:val="22"/>
@@ -1979,7 +1979,7 @@
     </w:tblStylePr>
     <w:tblStylePr w:type="firstRow">
       <w:rPr>
-        <w:rFonts w:ascii="Arial" w:hAnsi="Arial"/>
+        <w:rFonts w:ascii="Times New Roman" w:hAnsi="Times New Roman"/>
         <w:b/>
         <w:color w:val="404040"/>
         <w:sz w:val="22"/>
@@ -2001,7 +2001,7 @@
     </w:tblStylePr>
     <w:tblStylePr w:type="lastCol">
       <w:rPr>
-        <w:rFonts w:ascii="Arial" w:hAnsi="Arial"/>
+        <w:rFonts w:ascii="Times New Roman" w:hAnsi="Times New Roman"/>
         <w:b/>
         <w:color w:val="404040"/>
         <w:sz w:val="22"/>
@@ -2020,7 +2020,7 @@
     </w:tblStylePr>
     <w:tblStylePr w:type="lastRow">
       <w:rPr>
-        <w:rFonts w:ascii="Arial" w:hAnsi="Arial"/>
+        <w:rFonts w:ascii="Times New Roman" w:hAnsi="Times New Roman"/>
         <w:b/>
         <w:color w:val="404040"/>
         <w:sz w:val="22"/>
@@ -2123,7 +2123,7 @@
     </w:tcPr>
     <w:tblStylePr w:type="band1Horz">
       <w:rPr>
-        <w:rFonts w:ascii="Arial" w:hAnsi="Arial"/>
+        <w:rFonts w:ascii="Times New Roman" w:hAnsi="Times New Roman"/>
         <w:color w:val="404040"/>
         <w:sz w:val="22"/>
       </w:rPr>
@@ -2142,7 +2142,7 @@
     </w:tblStylePr>
     <w:tblStylePr w:type="band1Vert">
       <w:rPr>
-        <w:rFonts w:ascii="Arial" w:hAnsi="Arial"/>
+        <w:rFonts w:ascii="Times New Roman" w:hAnsi="Times New Roman"/>
         <w:color w:val="404040"/>
         <w:sz w:val="22"/>
       </w:rPr>
@@ -2353,7 +2353,7 @@
     </w:tcPr>
     <w:tblStylePr w:type="band1Horz">
       <w:rPr>
-        <w:rFonts w:ascii="Arial" w:hAnsi="Arial"/>
+        <w:rFonts w:ascii="Times New Roman" w:hAnsi="Times New Roman"/>
         <w:color w:val="404040"/>
         <w:sz w:val="22"/>
       </w:rPr>
@@ -2372,7 +2372,7 @@
     </w:tblStylePr>
     <w:tblStylePr w:type="band1Vert">
       <w:rPr>
-        <w:rFonts w:ascii="Arial" w:hAnsi="Arial"/>
+        <w:rFonts w:ascii="Times New Roman" w:hAnsi="Times New Roman"/>
         <w:color w:val="404040"/>
         <w:sz w:val="22"/>
       </w:rPr>
@@ -2569,7 +2569,7 @@
     </w:tcPr>
     <w:tblStylePr w:type="band1Horz">
       <w:rPr>
-        <w:rFonts w:ascii="Arial" w:hAnsi="Arial"/>
+        <w:rFonts w:ascii="Times New Roman" w:hAnsi="Times New Roman"/>
         <w:color w:val="404040"/>
         <w:sz w:val="22"/>
       </w:rPr>
@@ -2588,7 +2588,7 @@
     </w:tblStylePr>
     <w:tblStylePr w:type="band1Vert">
       <w:rPr>
-        <w:rFonts w:ascii="Arial" w:hAnsi="Arial"/>
+        <w:rFonts w:ascii="Times New Roman" w:hAnsi="Times New Roman"/>
         <w:color w:val="404040"/>
         <w:sz w:val="22"/>
       </w:rPr>
@@ -2809,7 +2809,7 @@
     </w:tcPr>
     <w:tblStylePr w:type="band1Horz">
       <w:rPr>
-        <w:rFonts w:ascii="Arial" w:hAnsi="Arial"/>
+        <w:rFonts w:ascii="Times New Roman" w:hAnsi="Times New Roman"/>
         <w:color w:val="404040"/>
         <w:sz w:val="22"/>
       </w:rPr>
@@ -3032,7 +3032,7 @@
     </w:tcPr>
     <w:tblStylePr w:type="band1Horz">
       <w:rPr>
-        <w:rFonts w:ascii="Arial" w:hAnsi="Arial"/>
+        <w:rFonts w:ascii="Times New Roman" w:hAnsi="Times New Roman"/>
         <w:color w:val="404040"/>
         <w:sz w:val="22"/>
       </w:rPr>
@@ -3255,7 +3255,7 @@
     </w:tcPr>
     <w:tblStylePr w:type="band1Horz">
       <w:rPr>
-        <w:rFonts w:ascii="Arial" w:hAnsi="Arial"/>
+        <w:rFonts w:ascii="Times New Roman" w:hAnsi="Times New Roman"/>
         <w:color w:val="404040"/>
         <w:sz w:val="22"/>
       </w:rPr>
@@ -3478,7 +3478,7 @@
     </w:tcPr>
     <w:tblStylePr w:type="band1Horz">
       <w:rPr>
-        <w:rFonts w:ascii="Arial" w:hAnsi="Arial"/>
+        <w:rFonts w:ascii="Times New Roman" w:hAnsi="Times New Roman"/>
         <w:color w:val="404040"/>
         <w:sz w:val="22"/>
       </w:rPr>
@@ -3701,7 +3701,7 @@
     </w:tcPr>
     <w:tblStylePr w:type="band1Horz">
       <w:rPr>
-        <w:rFonts w:ascii="Arial" w:hAnsi="Arial"/>
+        <w:rFonts w:ascii="Times New Roman" w:hAnsi="Times New Roman"/>
         <w:color w:val="404040"/>
         <w:sz w:val="22"/>
       </w:rPr>
@@ -3924,7 +3924,7 @@
     </w:tcPr>
     <w:tblStylePr w:type="band1Horz">
       <w:rPr>
-        <w:rFonts w:ascii="Arial" w:hAnsi="Arial"/>
+        <w:rFonts w:ascii="Times New Roman" w:hAnsi="Times New Roman"/>
         <w:color w:val="404040"/>
         <w:sz w:val="22"/>
       </w:rPr>
@@ -4147,7 +4147,7 @@
     </w:tcPr>
     <w:tblStylePr w:type="band1Horz">
       <w:rPr>
-        <w:rFonts w:ascii="Arial" w:hAnsi="Arial"/>
+        <w:rFonts w:ascii="Times New Roman" w:hAnsi="Times New Roman"/>
         <w:color w:val="404040"/>
         <w:sz w:val="22"/>
       </w:rPr>
@@ -4367,7 +4367,7 @@
     </w:tcPr>
     <w:tblStylePr w:type="band1Horz">
       <w:rPr>
-        <w:rFonts w:ascii="Arial" w:hAnsi="Arial"/>
+        <w:rFonts w:ascii="Times New Roman" w:hAnsi="Times New Roman"/>
         <w:color w:val="404040"/>
         <w:sz w:val="22"/>
       </w:rPr>
@@ -4386,7 +4386,7 @@
     </w:tblStylePr>
     <w:tblStylePr w:type="band1Vert">
       <w:rPr>
-        <w:rFonts w:ascii="Arial" w:hAnsi="Arial"/>
+        <w:rFonts w:ascii="Times New Roman" w:hAnsi="Times New Roman"/>
         <w:color w:val="404040"/>
         <w:sz w:val="22"/>
       </w:rPr>
@@ -4599,7 +4599,7 @@
     </w:tcPr>
     <w:tblStylePr w:type="band1Horz">
       <w:rPr>
-        <w:rFonts w:ascii="Arial" w:hAnsi="Arial"/>
+        <w:rFonts w:ascii="Times New Roman" w:hAnsi="Times New Roman"/>
         <w:color w:val="404040"/>
         <w:sz w:val="22"/>
       </w:rPr>
@@ -4618,7 +4618,7 @@
     </w:tblStylePr>
     <w:tblStylePr w:type="band1Vert">
       <w:rPr>
-        <w:rFonts w:ascii="Arial" w:hAnsi="Arial"/>
+        <w:rFonts w:ascii="Times New Roman" w:hAnsi="Times New Roman"/>
         <w:color w:val="404040"/>
         <w:sz w:val="22"/>
       </w:rPr>
@@ -4831,7 +4831,7 @@
     </w:tcPr>
     <w:tblStylePr w:type="band1Horz">
       <w:rPr>
-        <w:rFonts w:ascii="Arial" w:hAnsi="Arial"/>
+        <w:rFonts w:ascii="Times New Roman" w:hAnsi="Times New Roman"/>
         <w:color w:val="404040"/>
         <w:sz w:val="22"/>
       </w:rPr>
@@ -4850,7 +4850,7 @@
     </w:tblStylePr>
     <w:tblStylePr w:type="band1Vert">
       <w:rPr>
-        <w:rFonts w:ascii="Arial" w:hAnsi="Arial"/>
+        <w:rFonts w:ascii="Times New Roman" w:hAnsi="Times New Roman"/>
         <w:color w:val="404040"/>
         <w:sz w:val="22"/>
       </w:rPr>
@@ -5063,7 +5063,7 @@
     </w:tcPr>
     <w:tblStylePr w:type="band1Horz">
       <w:rPr>
-        <w:rFonts w:ascii="Arial" w:hAnsi="Arial"/>
+        <w:rFonts w:ascii="Times New Roman" w:hAnsi="Times New Roman"/>
         <w:color w:val="404040"/>
         <w:sz w:val="22"/>
       </w:rPr>
@@ -5082,7 +5082,7 @@
     </w:tblStylePr>
     <w:tblStylePr w:type="band1Vert">
       <w:rPr>
-        <w:rFonts w:ascii="Arial" w:hAnsi="Arial"/>
+        <w:rFonts w:ascii="Times New Roman" w:hAnsi="Times New Roman"/>
         <w:color w:val="404040"/>
         <w:sz w:val="22"/>
       </w:rPr>
@@ -5295,7 +5295,7 @@
     </w:tcPr>
     <w:tblStylePr w:type="band1Horz">
       <w:rPr>
-        <w:rFonts w:ascii="Arial" w:hAnsi="Arial"/>
+        <w:rFonts w:ascii="Times New Roman" w:hAnsi="Times New Roman"/>
         <w:color w:val="404040"/>
         <w:sz w:val="22"/>
       </w:rPr>
@@ -5314,7 +5314,7 @@
     </w:tblStylePr>
     <w:tblStylePr w:type="band1Vert">
       <w:rPr>
-        <w:rFonts w:ascii="Arial" w:hAnsi="Arial"/>
+        <w:rFonts w:ascii="Times New Roman" w:hAnsi="Times New Roman"/>
         <w:color w:val="404040"/>
         <w:sz w:val="22"/>
       </w:rPr>
@@ -5527,7 +5527,7 @@
     </w:tcPr>
     <w:tblStylePr w:type="band1Horz">
       <w:rPr>
-        <w:rFonts w:ascii="Arial" w:hAnsi="Arial"/>
+        <w:rFonts w:ascii="Times New Roman" w:hAnsi="Times New Roman"/>
         <w:color w:val="404040"/>
         <w:sz w:val="22"/>
       </w:rPr>
@@ -5546,7 +5546,7 @@
     </w:tblStylePr>
     <w:tblStylePr w:type="band1Vert">
       <w:rPr>
-        <w:rFonts w:ascii="Arial" w:hAnsi="Arial"/>
+        <w:rFonts w:ascii="Times New Roman" w:hAnsi="Times New Roman"/>
         <w:color w:val="404040"/>
         <w:sz w:val="22"/>
       </w:rPr>
@@ -5759,7 +5759,7 @@
     </w:tcPr>
     <w:tblStylePr w:type="band1Horz">
       <w:rPr>
-        <w:rFonts w:ascii="Arial" w:hAnsi="Arial"/>
+        <w:rFonts w:ascii="Times New Roman" w:hAnsi="Times New Roman"/>
         <w:color w:val="404040"/>
         <w:sz w:val="22"/>
       </w:rPr>
@@ -5778,7 +5778,7 @@
     </w:tblStylePr>
     <w:tblStylePr w:type="band1Vert">
       <w:rPr>
-        <w:rFonts w:ascii="Arial" w:hAnsi="Arial"/>
+        <w:rFonts w:ascii="Times New Roman" w:hAnsi="Times New Roman"/>
         <w:color w:val="404040"/>
         <w:sz w:val="22"/>
       </w:rPr>
@@ -5991,7 +5991,7 @@
     </w:tcPr>
     <w:tblStylePr w:type="band1Horz">
       <w:rPr>
-        <w:rFonts w:ascii="Arial" w:hAnsi="Arial"/>
+        <w:rFonts w:ascii="Times New Roman" w:hAnsi="Times New Roman"/>
         <w:color w:val="404040"/>
         <w:sz w:val="22"/>
       </w:rPr>
@@ -6010,7 +6010,7 @@
     </w:tblStylePr>
     <w:tblStylePr w:type="band1Vert">
       <w:rPr>
-        <w:rFonts w:ascii="Arial" w:hAnsi="Arial"/>
+        <w:rFonts w:ascii="Times New Roman" w:hAnsi="Times New Roman"/>
         <w:color w:val="404040"/>
         <w:sz w:val="22"/>
       </w:rPr>
@@ -6236,7 +6236,7 @@
     </w:tcPr>
     <w:tblStylePr w:type="band1Horz">
       <w:rPr>
-        <w:rFonts w:ascii="Arial" w:hAnsi="Arial"/>
+        <w:rFonts w:ascii="Times New Roman" w:hAnsi="Times New Roman"/>
         <w:color w:val="404040"/>
         <w:sz w:val="22"/>
       </w:rPr>
@@ -6255,7 +6255,7 @@
     </w:tblStylePr>
     <w:tblStylePr w:type="band1Vert">
       <w:rPr>
-        <w:rFonts w:ascii="Arial" w:hAnsi="Arial"/>
+        <w:rFonts w:ascii="Times New Roman" w:hAnsi="Times New Roman"/>
         <w:color w:val="404040"/>
         <w:sz w:val="22"/>
       </w:rPr>
@@ -6481,7 +6481,7 @@
     </w:tcPr>
     <w:tblStylePr w:type="band1Horz">
       <w:rPr>
-        <w:rFonts w:ascii="Arial" w:hAnsi="Arial"/>
+        <w:rFonts w:ascii="Times New Roman" w:hAnsi="Times New Roman"/>
         <w:color w:val="404040"/>
         <w:sz w:val="22"/>
       </w:rPr>
@@ -6500,7 +6500,7 @@
     </w:tblStylePr>
     <w:tblStylePr w:type="band1Vert">
       <w:rPr>
-        <w:rFonts w:ascii="Arial" w:hAnsi="Arial"/>
+        <w:rFonts w:ascii="Times New Roman" w:hAnsi="Times New Roman"/>
         <w:color w:val="404040"/>
         <w:sz w:val="22"/>
       </w:rPr>
@@ -6726,7 +6726,7 @@
     </w:tcPr>
     <w:tblStylePr w:type="band1Horz">
       <w:rPr>
-        <w:rFonts w:ascii="Arial" w:hAnsi="Arial"/>
+        <w:rFonts w:ascii="Times New Roman" w:hAnsi="Times New Roman"/>
         <w:color w:val="404040"/>
         <w:sz w:val="22"/>
       </w:rPr>
@@ -6745,7 +6745,7 @@
     </w:tblStylePr>
     <w:tblStylePr w:type="band1Vert">
       <w:rPr>
-        <w:rFonts w:ascii="Arial" w:hAnsi="Arial"/>
+        <w:rFonts w:ascii="Times New Roman" w:hAnsi="Times New Roman"/>
         <w:color w:val="404040"/>
         <w:sz w:val="22"/>
       </w:rPr>
@@ -6971,7 +6971,7 @@
     </w:tcPr>
     <w:tblStylePr w:type="band1Horz">
       <w:rPr>
-        <w:rFonts w:ascii="Arial" w:hAnsi="Arial"/>
+        <w:rFonts w:ascii="Times New Roman" w:hAnsi="Times New Roman"/>
         <w:color w:val="404040"/>
         <w:sz w:val="22"/>
       </w:rPr>
@@ -6990,7 +6990,7 @@
     </w:tblStylePr>
     <w:tblStylePr w:type="band1Vert">
       <w:rPr>
-        <w:rFonts w:ascii="Arial" w:hAnsi="Arial"/>
+        <w:rFonts w:ascii="Times New Roman" w:hAnsi="Times New Roman"/>
         <w:color w:val="404040"/>
         <w:sz w:val="22"/>
       </w:rPr>
@@ -7216,7 +7216,7 @@
     </w:tcPr>
     <w:tblStylePr w:type="band1Horz">
       <w:rPr>
-        <w:rFonts w:ascii="Arial" w:hAnsi="Arial"/>
+        <w:rFonts w:ascii="Times New Roman" w:hAnsi="Times New Roman"/>
         <w:color w:val="404040"/>
         <w:sz w:val="22"/>
       </w:rPr>
@@ -7235,7 +7235,7 @@
     </w:tblStylePr>
     <w:tblStylePr w:type="band1Vert">
       <w:rPr>
-        <w:rFonts w:ascii="Arial" w:hAnsi="Arial"/>
+        <w:rFonts w:ascii="Times New Roman" w:hAnsi="Times New Roman"/>
         <w:color w:val="404040"/>
         <w:sz w:val="22"/>
       </w:rPr>
@@ -7461,7 +7461,7 @@
     </w:tcPr>
     <w:tblStylePr w:type="band1Horz">
       <w:rPr>
-        <w:rFonts w:ascii="Arial" w:hAnsi="Arial"/>
+        <w:rFonts w:ascii="Times New Roman" w:hAnsi="Times New Roman"/>
         <w:color w:val="404040"/>
         <w:sz w:val="22"/>
       </w:rPr>
@@ -7480,7 +7480,7 @@
     </w:tblStylePr>
     <w:tblStylePr w:type="band1Vert">
       <w:rPr>
-        <w:rFonts w:ascii="Arial" w:hAnsi="Arial"/>
+        <w:rFonts w:ascii="Times New Roman" w:hAnsi="Times New Roman"/>
         <w:color w:val="404040"/>
         <w:sz w:val="22"/>
       </w:rPr>
@@ -7709,7 +7709,7 @@
     </w:tcPr>
     <w:tblStylePr w:type="band1Horz">
       <w:rPr>
-        <w:rFonts w:ascii="Arial" w:hAnsi="Arial"/>
+        <w:rFonts w:ascii="Times New Roman" w:hAnsi="Times New Roman"/>
         <w:color w:val="404040"/>
         <w:sz w:val="22"/>
       </w:rPr>
@@ -7728,7 +7728,7 @@
     </w:tblStylePr>
     <w:tblStylePr w:type="band1Vert">
       <w:rPr>
-        <w:rFonts w:ascii="Arial" w:hAnsi="Arial"/>
+        <w:rFonts w:ascii="Times New Roman" w:hAnsi="Times New Roman"/>
         <w:color w:val="404040"/>
         <w:sz w:val="22"/>
       </w:rPr>
@@ -7790,7 +7790,7 @@
     </w:tblStylePr>
     <w:tblStylePr w:type="firstRow">
       <w:rPr>
-        <w:rFonts w:ascii="Arial" w:hAnsi="Arial"/>
+        <w:rFonts w:ascii="Times New Roman" w:hAnsi="Times New Roman"/>
         <w:b/>
         <w:color w:val="ffffff"/>
         <w:sz w:val="22"/>
@@ -7942,7 +7942,7 @@
     </w:tcPr>
     <w:tblStylePr w:type="band1Horz">
       <w:rPr>
-        <w:rFonts w:ascii="Arial" w:hAnsi="Arial"/>
+        <w:rFonts w:ascii="Times New Roman" w:hAnsi="Times New Roman"/>
         <w:color w:val="404040"/>
         <w:sz w:val="22"/>
       </w:rPr>
@@ -7961,7 +7961,7 @@
     </w:tblStylePr>
     <w:tblStylePr w:type="band1Vert">
       <w:rPr>
-        <w:rFonts w:ascii="Arial" w:hAnsi="Arial"/>
+        <w:rFonts w:ascii="Times New Roman" w:hAnsi="Times New Roman"/>
         <w:color w:val="404040"/>
         <w:sz w:val="22"/>
       </w:rPr>
@@ -8023,7 +8023,7 @@
     </w:tblStylePr>
     <w:tblStylePr w:type="firstRow">
       <w:rPr>
-        <w:rFonts w:ascii="Arial" w:hAnsi="Arial"/>
+        <w:rFonts w:ascii="Times New Roman" w:hAnsi="Times New Roman"/>
         <w:b/>
         <w:color w:val="ffffff"/>
         <w:sz w:val="22"/>
@@ -8175,7 +8175,7 @@
     </w:tcPr>
     <w:tblStylePr w:type="band1Horz">
       <w:rPr>
-        <w:rFonts w:ascii="Arial" w:hAnsi="Arial"/>
+        <w:rFonts w:ascii="Times New Roman" w:hAnsi="Times New Roman"/>
         <w:color w:val="404040"/>
         <w:sz w:val="22"/>
       </w:rPr>
@@ -8194,7 +8194,7 @@
     </w:tblStylePr>
     <w:tblStylePr w:type="band1Vert">
       <w:rPr>
-        <w:rFonts w:ascii="Arial" w:hAnsi="Arial"/>
+        <w:rFonts w:ascii="Times New Roman" w:hAnsi="Times New Roman"/>
         <w:color w:val="404040"/>
         <w:sz w:val="22"/>
       </w:rPr>
@@ -8256,7 +8256,7 @@
     </w:tblStylePr>
     <w:tblStylePr w:type="firstRow">
       <w:rPr>
-        <w:rFonts w:ascii="Arial" w:hAnsi="Arial"/>
+        <w:rFonts w:ascii="Times New Roman" w:hAnsi="Times New Roman"/>
         <w:b/>
         <w:color w:val="ffffff"/>
         <w:sz w:val="22"/>
@@ -8408,7 +8408,7 @@
     </w:tcPr>
     <w:tblStylePr w:type="band1Horz">
       <w:rPr>
-        <w:rFonts w:ascii="Arial" w:hAnsi="Arial"/>
+        <w:rFonts w:ascii="Times New Roman" w:hAnsi="Times New Roman"/>
         <w:color w:val="404040"/>
         <w:sz w:val="22"/>
       </w:rPr>
@@ -8427,7 +8427,7 @@
     </w:tblStylePr>
     <w:tblStylePr w:type="band1Vert">
       <w:rPr>
-        <w:rFonts w:ascii="Arial" w:hAnsi="Arial"/>
+        <w:rFonts w:ascii="Times New Roman" w:hAnsi="Times New Roman"/>
         <w:color w:val="404040"/>
         <w:sz w:val="22"/>
       </w:rPr>
@@ -8489,7 +8489,7 @@
     </w:tblStylePr>
     <w:tblStylePr w:type="firstRow">
       <w:rPr>
-        <w:rFonts w:ascii="Arial" w:hAnsi="Arial"/>
+        <w:rFonts w:ascii="Times New Roman" w:hAnsi="Times New Roman"/>
         <w:b/>
         <w:color w:val="ffffff"/>
         <w:sz w:val="22"/>
@@ -8641,7 +8641,7 @@
     </w:tcPr>
     <w:tblStylePr w:type="band1Horz">
       <w:rPr>
-        <w:rFonts w:ascii="Arial" w:hAnsi="Arial"/>
+        <w:rFonts w:ascii="Times New Roman" w:hAnsi="Times New Roman"/>
         <w:color w:val="404040"/>
         <w:sz w:val="22"/>
       </w:rPr>
@@ -8660,7 +8660,7 @@
     </w:tblStylePr>
     <w:tblStylePr w:type="band1Vert">
       <w:rPr>
-        <w:rFonts w:ascii="Arial" w:hAnsi="Arial"/>
+        <w:rFonts w:ascii="Times New Roman" w:hAnsi="Times New Roman"/>
         <w:color w:val="404040"/>
         <w:sz w:val="22"/>
       </w:rPr>
@@ -8722,7 +8722,7 @@
     </w:tblStylePr>
     <w:tblStylePr w:type="firstRow">
       <w:rPr>
-        <w:rFonts w:ascii="Arial" w:hAnsi="Arial"/>
+        <w:rFonts w:ascii="Times New Roman" w:hAnsi="Times New Roman"/>
         <w:b/>
         <w:color w:val="ffffff"/>
         <w:sz w:val="22"/>
@@ -8874,7 +8874,7 @@
     </w:tcPr>
     <w:tblStylePr w:type="band1Horz">
       <w:rPr>
-        <w:rFonts w:ascii="Arial" w:hAnsi="Arial"/>
+        <w:rFonts w:ascii="Times New Roman" w:hAnsi="Times New Roman"/>
         <w:color w:val="404040"/>
         <w:sz w:val="22"/>
       </w:rPr>
@@ -8893,7 +8893,7 @@
     </w:tblStylePr>
     <w:tblStylePr w:type="band1Vert">
       <w:rPr>
-        <w:rFonts w:ascii="Arial" w:hAnsi="Arial"/>
+        <w:rFonts w:ascii="Times New Roman" w:hAnsi="Times New Roman"/>
         <w:color w:val="404040"/>
         <w:sz w:val="22"/>
       </w:rPr>
@@ -8955,7 +8955,7 @@
     </w:tblStylePr>
     <w:tblStylePr w:type="firstRow">
       <w:rPr>
-        <w:rFonts w:ascii="Arial" w:hAnsi="Arial"/>
+        <w:rFonts w:ascii="Times New Roman" w:hAnsi="Times New Roman"/>
         <w:b/>
         <w:color w:val="ffffff"/>
         <w:sz w:val="22"/>
@@ -9107,7 +9107,7 @@
     </w:tcPr>
     <w:tblStylePr w:type="band1Horz">
       <w:rPr>
-        <w:rFonts w:ascii="Arial" w:hAnsi="Arial"/>
+        <w:rFonts w:ascii="Times New Roman" w:hAnsi="Times New Roman"/>
         <w:color w:val="404040"/>
         <w:sz w:val="22"/>
       </w:rPr>
@@ -9126,7 +9126,7 @@
     </w:tblStylePr>
     <w:tblStylePr w:type="band1Vert">
       <w:rPr>
-        <w:rFonts w:ascii="Arial" w:hAnsi="Arial"/>
+        <w:rFonts w:ascii="Times New Roman" w:hAnsi="Times New Roman"/>
         <w:color w:val="404040"/>
         <w:sz w:val="22"/>
       </w:rPr>
@@ -9188,7 +9188,7 @@
     </w:tblStylePr>
     <w:tblStylePr w:type="firstRow">
       <w:rPr>
-        <w:rFonts w:ascii="Arial" w:hAnsi="Arial"/>
+        <w:rFonts w:ascii="Times New Roman" w:hAnsi="Times New Roman"/>
         <w:b/>
         <w:color w:val="ffffff"/>
         <w:sz w:val="22"/>
@@ -9395,7 +9395,7 @@
     </w:tblStylePr>
     <w:tblStylePr w:type="firstCol">
       <w:rPr>
-        <w:rFonts w:ascii="Arial" w:hAnsi="Arial"/>
+        <w:rFonts w:ascii="Times New Roman" w:hAnsi="Times New Roman"/>
         <w:b/>
         <w:color w:val="ffffff"/>
         <w:sz w:val="22"/>
@@ -9415,7 +9415,7 @@
     </w:tblStylePr>
     <w:tblStylePr w:type="firstRow">
       <w:rPr>
-        <w:rFonts w:ascii="Arial" w:hAnsi="Arial"/>
+        <w:rFonts w:ascii="Times New Roman" w:hAnsi="Times New Roman"/>
         <w:b/>
         <w:color w:val="ffffff"/>
         <w:sz w:val="22"/>
@@ -9435,7 +9435,7 @@
     </w:tblStylePr>
     <w:tblStylePr w:type="lastCol">
       <w:rPr>
-        <w:rFonts w:ascii="Arial" w:hAnsi="Arial"/>
+        <w:rFonts w:ascii="Times New Roman" w:hAnsi="Times New Roman"/>
         <w:b/>
         <w:color w:val="ffffff"/>
         <w:sz w:val="22"/>
@@ -9455,7 +9455,7 @@
     </w:tblStylePr>
     <w:tblStylePr w:type="lastRow">
       <w:rPr>
-        <w:rFonts w:ascii="Arial" w:hAnsi="Arial"/>
+        <w:rFonts w:ascii="Times New Roman" w:hAnsi="Times New Roman"/>
         <w:b/>
         <w:color w:val="ffffff"/>
         <w:sz w:val="22"/>
@@ -9623,7 +9623,7 @@
     </w:tblStylePr>
     <w:tblStylePr w:type="firstCol">
       <w:rPr>
-        <w:rFonts w:ascii="Arial" w:hAnsi="Arial"/>
+        <w:rFonts w:ascii="Times New Roman" w:hAnsi="Times New Roman"/>
         <w:b/>
         <w:color w:val="ffffff"/>
         <w:sz w:val="22"/>
@@ -9643,7 +9643,7 @@
     </w:tblStylePr>
     <w:tblStylePr w:type="firstRow">
       <w:rPr>
-        <w:rFonts w:ascii="Arial" w:hAnsi="Arial"/>
+        <w:rFonts w:ascii="Times New Roman" w:hAnsi="Times New Roman"/>
         <w:b/>
         <w:color w:val="ffffff"/>
         <w:sz w:val="22"/>
@@ -9663,7 +9663,7 @@
     </w:tblStylePr>
     <w:tblStylePr w:type="lastCol">
       <w:rPr>
-        <w:rFonts w:ascii="Arial" w:hAnsi="Arial"/>
+        <w:rFonts w:ascii="Times New Roman" w:hAnsi="Times New Roman"/>
         <w:b/>
         <w:color w:val="ffffff"/>
         <w:sz w:val="22"/>
@@ -9683,7 +9683,7 @@
     </w:tblStylePr>
     <w:tblStylePr w:type="lastRow">
       <w:rPr>
-        <w:rFonts w:ascii="Arial" w:hAnsi="Arial"/>
+        <w:rFonts w:ascii="Times New Roman" w:hAnsi="Times New Roman"/>
         <w:b/>
         <w:color w:val="ffffff"/>
         <w:sz w:val="22"/>
@@ -9851,7 +9851,7 @@
     </w:tblStylePr>
     <w:tblStylePr w:type="firstCol">
       <w:rPr>
-        <w:rFonts w:ascii="Arial" w:hAnsi="Arial"/>
+        <w:rFonts w:ascii="Times New Roman" w:hAnsi="Times New Roman"/>
         <w:b/>
         <w:color w:val="ffffff"/>
         <w:sz w:val="22"/>
@@ -9871,7 +9871,7 @@
     </w:tblStylePr>
     <w:tblStylePr w:type="firstRow">
       <w:rPr>
-        <w:rFonts w:ascii="Arial" w:hAnsi="Arial"/>
+        <w:rFonts w:ascii="Times New Roman" w:hAnsi="Times New Roman"/>
         <w:b/>
         <w:color w:val="ffffff"/>
         <w:sz w:val="22"/>
@@ -9891,7 +9891,7 @@
     </w:tblStylePr>
     <w:tblStylePr w:type="lastCol">
       <w:rPr>
-        <w:rFonts w:ascii="Arial" w:hAnsi="Arial"/>
+        <w:rFonts w:ascii="Times New Roman" w:hAnsi="Times New Roman"/>
         <w:b/>
         <w:color w:val="ffffff"/>
         <w:sz w:val="22"/>
@@ -9911,7 +9911,7 @@
     </w:tblStylePr>
     <w:tblStylePr w:type="lastRow">
       <w:rPr>
-        <w:rFonts w:ascii="Arial" w:hAnsi="Arial"/>
+        <w:rFonts w:ascii="Times New Roman" w:hAnsi="Times New Roman"/>
         <w:b/>
         <w:color w:val="ffffff"/>
         <w:sz w:val="22"/>
@@ -10079,7 +10079,7 @@
     </w:tblStylePr>
     <w:tblStylePr w:type="firstCol">
       <w:rPr>
-        <w:rFonts w:ascii="Arial" w:hAnsi="Arial"/>
+        <w:rFonts w:ascii="Times New Roman" w:hAnsi="Times New Roman"/>
         <w:b/>
         <w:color w:val="ffffff"/>
         <w:sz w:val="22"/>
@@ -10099,7 +10099,7 @@
     </w:tblStylePr>
     <w:tblStylePr w:type="firstRow">
       <w:rPr>
-        <w:rFonts w:ascii="Arial" w:hAnsi="Arial"/>
+        <w:rFonts w:ascii="Times New Roman" w:hAnsi="Times New Roman"/>
         <w:b/>
         <w:color w:val="ffffff"/>
         <w:sz w:val="22"/>
@@ -10119,7 +10119,7 @@
     </w:tblStylePr>
     <w:tblStylePr w:type="lastCol">
       <w:rPr>
-        <w:rFonts w:ascii="Arial" w:hAnsi="Arial"/>
+        <w:rFonts w:ascii="Times New Roman" w:hAnsi="Times New Roman"/>
         <w:b/>
         <w:color w:val="ffffff"/>
         <w:sz w:val="22"/>
@@ -10139,7 +10139,7 @@
     </w:tblStylePr>
     <w:tblStylePr w:type="lastRow">
       <w:rPr>
-        <w:rFonts w:ascii="Arial" w:hAnsi="Arial"/>
+        <w:rFonts w:ascii="Times New Roman" w:hAnsi="Times New Roman"/>
         <w:b/>
         <w:color w:val="ffffff"/>
         <w:sz w:val="22"/>
@@ -10307,7 +10307,7 @@
     </w:tblStylePr>
     <w:tblStylePr w:type="firstCol">
       <w:rPr>
-        <w:rFonts w:ascii="Arial" w:hAnsi="Arial"/>
+        <w:rFonts w:ascii="Times New Roman" w:hAnsi="Times New Roman"/>
         <w:b/>
         <w:color w:val="ffffff"/>
         <w:sz w:val="22"/>
@@ -10327,7 +10327,7 @@
     </w:tblStylePr>
     <w:tblStylePr w:type="firstRow">
       <w:rPr>
-        <w:rFonts w:ascii="Arial" w:hAnsi="Arial"/>
+        <w:rFonts w:ascii="Times New Roman" w:hAnsi="Times New Roman"/>
         <w:b/>
         <w:color w:val="ffffff"/>
         <w:sz w:val="22"/>
@@ -10347,7 +10347,7 @@
     </w:tblStylePr>
     <w:tblStylePr w:type="lastCol">
       <w:rPr>
-        <w:rFonts w:ascii="Arial" w:hAnsi="Arial"/>
+        <w:rFonts w:ascii="Times New Roman" w:hAnsi="Times New Roman"/>
         <w:b/>
         <w:color w:val="ffffff"/>
         <w:sz w:val="22"/>
@@ -10367,7 +10367,7 @@
     </w:tblStylePr>
     <w:tblStylePr w:type="lastRow">
       <w:rPr>
-        <w:rFonts w:ascii="Arial" w:hAnsi="Arial"/>
+        <w:rFonts w:ascii="Times New Roman" w:hAnsi="Times New Roman"/>
         <w:b/>
         <w:color w:val="ffffff"/>
         <w:sz w:val="22"/>
@@ -10535,7 +10535,7 @@
     </w:tblStylePr>
     <w:tblStylePr w:type="firstCol">
       <w:rPr>
-        <w:rFonts w:ascii="Arial" w:hAnsi="Arial"/>
+        <w:rFonts w:ascii="Times New Roman" w:hAnsi="Times New Roman"/>
         <w:b/>
         <w:color w:val="ffffff"/>
         <w:sz w:val="22"/>
@@ -10555,7 +10555,7 @@
     </w:tblStylePr>
     <w:tblStylePr w:type="firstRow">
       <w:rPr>
-        <w:rFonts w:ascii="Arial" w:hAnsi="Arial"/>
+        <w:rFonts w:ascii="Times New Roman" w:hAnsi="Times New Roman"/>
         <w:b/>
         <w:color w:val="ffffff"/>
         <w:sz w:val="22"/>
@@ -10575,7 +10575,7 @@
     </w:tblStylePr>
     <w:tblStylePr w:type="lastCol">
       <w:rPr>
-        <w:rFonts w:ascii="Arial" w:hAnsi="Arial"/>
+        <w:rFonts w:ascii="Times New Roman" w:hAnsi="Times New Roman"/>
         <w:b/>
         <w:color w:val="ffffff"/>
         <w:sz w:val="22"/>
@@ -10595,7 +10595,7 @@
     </w:tblStylePr>
     <w:tblStylePr w:type="lastRow">
       <w:rPr>
-        <w:rFonts w:ascii="Arial" w:hAnsi="Arial"/>
+        <w:rFonts w:ascii="Times New Roman" w:hAnsi="Times New Roman"/>
         <w:b/>
         <w:color w:val="ffffff"/>
         <w:sz w:val="22"/>
@@ -10763,7 +10763,7 @@
     </w:tblStylePr>
     <w:tblStylePr w:type="firstCol">
       <w:rPr>
-        <w:rFonts w:ascii="Arial" w:hAnsi="Arial"/>
+        <w:rFonts w:ascii="Times New Roman" w:hAnsi="Times New Roman"/>
         <w:b/>
         <w:color w:val="ffffff"/>
         <w:sz w:val="22"/>
@@ -10783,7 +10783,7 @@
     </w:tblStylePr>
     <w:tblStylePr w:type="firstRow">
       <w:rPr>
-        <w:rFonts w:ascii="Arial" w:hAnsi="Arial"/>
+        <w:rFonts w:ascii="Times New Roman" w:hAnsi="Times New Roman"/>
         <w:b/>
         <w:color w:val="ffffff"/>
         <w:sz w:val="22"/>
@@ -10803,7 +10803,7 @@
     </w:tblStylePr>
     <w:tblStylePr w:type="lastCol">
       <w:rPr>
-        <w:rFonts w:ascii="Arial" w:hAnsi="Arial"/>
+        <w:rFonts w:ascii="Times New Roman" w:hAnsi="Times New Roman"/>
         <w:b/>
         <w:color w:val="ffffff"/>
         <w:sz w:val="22"/>
@@ -10823,7 +10823,7 @@
     </w:tblStylePr>
     <w:tblStylePr w:type="lastRow">
       <w:rPr>
-        <w:rFonts w:ascii="Arial" w:hAnsi="Arial"/>
+        <w:rFonts w:ascii="Times New Roman" w:hAnsi="Times New Roman"/>
         <w:b/>
         <w:color w:val="ffffff"/>
         <w:sz w:val="22"/>
@@ -10936,7 +10936,7 @@
     </w:tcPr>
     <w:tblStylePr w:type="band1Horz">
       <w:rPr>
-        <w:rFonts w:ascii="Arial" w:hAnsi="Arial"/>
+        <w:rFonts w:ascii="Times New Roman" w:hAnsi="Times New Roman"/>
         <w:color w:val="404040" w:themeColor="text1" w:themeTint="80" w:themeShade="95"/>
         <w:sz w:val="22"/>
       </w:rPr>
@@ -10969,7 +10969,7 @@
     </w:tblStylePr>
     <w:tblStylePr w:type="band2Horz">
       <w:rPr>
-        <w:rFonts w:ascii="Arial" w:hAnsi="Arial"/>
+        <w:rFonts w:ascii="Times New Roman" w:hAnsi="Times New Roman"/>
         <w:color w:val="404040" w:themeColor="text1" w:themeTint="80" w:themeShade="95"/>
         <w:sz w:val="22"/>
       </w:rPr>
@@ -11122,7 +11122,7 @@
     </w:tblStylePr>
     <w:tblStylePr w:type="wholeTable">
       <w:rPr>
-        <w:rFonts w:ascii="Arial" w:hAnsi="Arial"/>
+        <w:rFonts w:ascii="Times New Roman" w:hAnsi="Times New Roman"/>
         <w:color w:val="404040" w:themeColor="text1" w:themeTint="80" w:themeShade="95"/>
         <w:sz w:val="22"/>
       </w:rPr>
@@ -11166,7 +11166,7 @@
     </w:tcPr>
     <w:tblStylePr w:type="band1Horz">
       <w:rPr>
-        <w:rFonts w:ascii="Arial" w:hAnsi="Arial"/>
+        <w:rFonts w:ascii="Times New Roman" w:hAnsi="Times New Roman"/>
         <w:color w:val="404040" w:themeColor="accent1" w:themeTint="80" w:themeShade="95"/>
         <w:sz w:val="22"/>
       </w:rPr>
@@ -11199,7 +11199,7 @@
     </w:tblStylePr>
     <w:tblStylePr w:type="band2Horz">
       <w:rPr>
-        <w:rFonts w:ascii="Arial" w:hAnsi="Arial"/>
+        <w:rFonts w:ascii="Times New Roman" w:hAnsi="Times New Roman"/>
         <w:color w:val="404040" w:themeColor="accent1" w:themeTint="80" w:themeShade="95"/>
         <w:sz w:val="22"/>
       </w:rPr>
@@ -11352,7 +11352,7 @@
     </w:tblStylePr>
     <w:tblStylePr w:type="wholeTable">
       <w:rPr>
-        <w:rFonts w:ascii="Arial" w:hAnsi="Arial"/>
+        <w:rFonts w:ascii="Times New Roman" w:hAnsi="Times New Roman"/>
         <w:color w:val="404040" w:themeColor="accent1" w:themeTint="80" w:themeShade="95"/>
         <w:sz w:val="22"/>
       </w:rPr>
@@ -11396,7 +11396,7 @@
     </w:tcPr>
     <w:tblStylePr w:type="band1Horz">
       <w:rPr>
-        <w:rFonts w:ascii="Arial" w:hAnsi="Arial"/>
+        <w:rFonts w:ascii="Times New Roman" w:hAnsi="Times New Roman"/>
         <w:color w:val="404040" w:themeColor="accent2" w:themeTint="97" w:themeShade="95"/>
         <w:sz w:val="22"/>
       </w:rPr>
@@ -11429,7 +11429,7 @@
     </w:tblStylePr>
     <w:tblStylePr w:type="band2Horz">
       <w:rPr>
-        <w:rFonts w:ascii="Arial" w:hAnsi="Arial"/>
+        <w:rFonts w:ascii="Times New Roman" w:hAnsi="Times New Roman"/>
         <w:color w:val="404040" w:themeColor="accent2" w:themeTint="97" w:themeShade="95"/>
         <w:sz w:val="22"/>
       </w:rPr>
@@ -11582,7 +11582,7 @@
     </w:tblStylePr>
     <w:tblStylePr w:type="wholeTable">
       <w:rPr>
-        <w:rFonts w:ascii="Arial" w:hAnsi="Arial"/>
+        <w:rFonts w:ascii="Times New Roman" w:hAnsi="Times New Roman"/>
         <w:color w:val="404040" w:themeColor="accent2" w:themeTint="97" w:themeShade="95"/>
         <w:sz w:val="22"/>
       </w:rPr>
@@ -11626,7 +11626,7 @@
     </w:tcPr>
     <w:tblStylePr w:type="band1Horz">
       <w:rPr>
-        <w:rFonts w:ascii="Arial" w:hAnsi="Arial"/>
+        <w:rFonts w:ascii="Times New Roman" w:hAnsi="Times New Roman"/>
         <w:color w:val="404040" w:themeColor="accent3" w:themeTint="FE" w:themeShade="95"/>
         <w:sz w:val="22"/>
       </w:rPr>
@@ -11659,7 +11659,7 @@
     </w:tblStylePr>
     <w:tblStylePr w:type="band2Horz">
       <w:rPr>
-        <w:rFonts w:ascii="Arial" w:hAnsi="Arial"/>
+        <w:rFonts w:ascii="Times New Roman" w:hAnsi="Times New Roman"/>
         <w:color w:val="404040" w:themeColor="accent3" w:themeTint="FE" w:themeShade="95"/>
         <w:sz w:val="22"/>
       </w:rPr>
@@ -11812,7 +11812,7 @@
     </w:tblStylePr>
     <w:tblStylePr w:type="wholeTable">
       <w:rPr>
-        <w:rFonts w:ascii="Arial" w:hAnsi="Arial"/>
+        <w:rFonts w:ascii="Times New Roman" w:hAnsi="Times New Roman"/>
         <w:color w:val="404040" w:themeColor="accent3" w:themeTint="FE" w:themeShade="95"/>
         <w:sz w:val="22"/>
       </w:rPr>
@@ -11856,7 +11856,7 @@
     </w:tcPr>
     <w:tblStylePr w:type="band1Horz">
       <w:rPr>
-        <w:rFonts w:ascii="Arial" w:hAnsi="Arial"/>
+        <w:rFonts w:ascii="Times New Roman" w:hAnsi="Times New Roman"/>
         <w:color w:val="404040" w:themeColor="accent4" w:themeTint="9A" w:themeShade="95"/>
         <w:sz w:val="22"/>
       </w:rPr>
@@ -11889,7 +11889,7 @@
     </w:tblStylePr>
     <w:tblStylePr w:type="band2Horz">
       <w:rPr>
-        <w:rFonts w:ascii="Arial" w:hAnsi="Arial"/>
+        <w:rFonts w:ascii="Times New Roman" w:hAnsi="Times New Roman"/>
         <w:color w:val="404040" w:themeColor="accent4" w:themeTint="9A" w:themeShade="95"/>
         <w:sz w:val="22"/>
       </w:rPr>
@@ -12042,7 +12042,7 @@
     </w:tblStylePr>
     <w:tblStylePr w:type="wholeTable">
       <w:rPr>
-        <w:rFonts w:ascii="Arial" w:hAnsi="Arial"/>
+        <w:rFonts w:ascii="Times New Roman" w:hAnsi="Times New Roman"/>
         <w:color w:val="404040" w:themeColor="accent4" w:themeTint="9A" w:themeShade="95"/>
         <w:sz w:val="22"/>
       </w:rPr>
@@ -12086,7 +12086,7 @@
     </w:tcPr>
     <w:tblStylePr w:type="band1Horz">
       <w:rPr>
-        <w:rFonts w:ascii="Arial" w:hAnsi="Arial"/>
+        <w:rFonts w:ascii="Times New Roman" w:hAnsi="Times New Roman"/>
         <w:color w:val="404040" w:themeColor="accent5" w:themeShade="95"/>
         <w:sz w:val="22"/>
       </w:rPr>
@@ -12119,7 +12119,7 @@
     </w:tblStylePr>
     <w:tblStylePr w:type="band2Horz">
       <w:rPr>
-        <w:rFonts w:ascii="Arial" w:hAnsi="Arial"/>
+        <w:rFonts w:ascii="Times New Roman" w:hAnsi="Times New Roman"/>
         <w:color w:val="404040" w:themeColor="accent5" w:themeShade="95"/>
         <w:sz w:val="22"/>
       </w:rPr>
@@ -12272,7 +12272,7 @@
     </w:tblStylePr>
     <w:tblStylePr w:type="wholeTable">
       <w:rPr>
-        <w:rFonts w:ascii="Arial" w:hAnsi="Arial"/>
+        <w:rFonts w:ascii="Times New Roman" w:hAnsi="Times New Roman"/>
         <w:color w:val="404040" w:themeColor="accent5" w:themeShade="95"/>
         <w:sz w:val="22"/>
       </w:rPr>
@@ -12316,7 +12316,7 @@
     </w:tcPr>
     <w:tblStylePr w:type="band1Horz">
       <w:rPr>
-        <w:rFonts w:ascii="Arial" w:hAnsi="Arial"/>
+        <w:rFonts w:ascii="Times New Roman" w:hAnsi="Times New Roman"/>
         <w:color w:val="404040" w:themeColor="accent5" w:themeShade="95"/>
         <w:sz w:val="22"/>
       </w:rPr>
@@ -12349,7 +12349,7 @@
     </w:tblStylePr>
     <w:tblStylePr w:type="band2Horz">
       <w:rPr>
-        <w:rFonts w:ascii="Arial" w:hAnsi="Arial"/>
+        <w:rFonts w:ascii="Times New Roman" w:hAnsi="Times New Roman"/>
         <w:color w:val="404040" w:themeColor="accent5" w:themeShade="95"/>
         <w:sz w:val="22"/>
       </w:rPr>
@@ -12502,7 +12502,7 @@
     </w:tblStylePr>
     <w:tblStylePr w:type="wholeTable">
       <w:rPr>
-        <w:rFonts w:ascii="Arial" w:hAnsi="Arial"/>
+        <w:rFonts w:ascii="Times New Roman" w:hAnsi="Times New Roman"/>
         <w:color w:val="404040" w:themeColor="accent5" w:themeShade="95"/>
         <w:sz w:val="22"/>
       </w:rPr>
@@ -12544,7 +12544,7 @@
     </w:tcPr>
     <w:tblStylePr w:type="band1Horz">
       <w:rPr>
-        <w:rFonts w:ascii="Arial" w:hAnsi="Arial"/>
+        <w:rFonts w:ascii="Times New Roman" w:hAnsi="Times New Roman"/>
         <w:color w:val="4a4a4a" w:themeColor="text1" w:themeTint="80" w:themeShade="95"/>
         <w:sz w:val="22"/>
       </w:rPr>
@@ -12577,7 +12577,7 @@
     </w:tblStylePr>
     <w:tblStylePr w:type="band2Horz">
       <w:rPr>
-        <w:rFonts w:ascii="Arial" w:hAnsi="Arial"/>
+        <w:rFonts w:ascii="Times New Roman" w:hAnsi="Times New Roman"/>
         <w:color w:val="4a4a4a" w:themeColor="text1" w:themeTint="80" w:themeShade="95"/>
         <w:sz w:val="22"/>
       </w:rPr>
@@ -12608,7 +12608,7 @@
     </w:tblStylePr>
     <w:tblStylePr w:type="firstCol">
       <w:rPr>
-        <w:rFonts w:ascii="Arial" w:hAnsi="Arial"/>
+        <w:rFonts w:ascii="Times New Roman" w:hAnsi="Times New Roman"/>
         <w:i/>
         <w:color w:val="4a4a4a" w:themeColor="text1" w:themeTint="80" w:themeShade="95"/>
         <w:sz w:val="22"/>
@@ -12634,7 +12634,7 @@
     </w:tblStylePr>
     <w:tblStylePr w:type="firstRow">
       <w:rPr>
-        <w:rFonts w:ascii="Arial" w:hAnsi="Arial"/>
+        <w:rFonts w:ascii="Times New Roman" w:hAnsi="Times New Roman"/>
         <w:b/>
         <w:color w:val="4a4a4a" w:themeColor="text1" w:themeTint="80" w:themeShade="95"/>
         <w:sz w:val="22"/>
@@ -12659,7 +12659,7 @@
     </w:tblStylePr>
     <w:tblStylePr w:type="lastCol">
       <w:rPr>
-        <w:rFonts w:ascii="Arial" w:hAnsi="Arial"/>
+        <w:rFonts w:ascii="Times New Roman" w:hAnsi="Times New Roman"/>
         <w:i/>
         <w:color w:val="4a4a4a" w:themeColor="text1" w:themeTint="80" w:themeShade="95"/>
         <w:sz w:val="22"/>
@@ -12684,7 +12684,7 @@
     </w:tblStylePr>
     <w:tblStylePr w:type="lastRow">
       <w:rPr>
-        <w:rFonts w:ascii="Arial" w:hAnsi="Arial"/>
+        <w:rFonts w:ascii="Times New Roman" w:hAnsi="Times New Roman"/>
         <w:b/>
         <w:color w:val="4a4a4a" w:themeColor="text1" w:themeTint="80" w:themeShade="95"/>
         <w:sz w:val="22"/>
@@ -12798,7 +12798,7 @@
     </w:tcPr>
     <w:tblStylePr w:type="band1Horz">
       <w:rPr>
-        <w:rFonts w:ascii="Arial" w:hAnsi="Arial"/>
+        <w:rFonts w:ascii="Times New Roman" w:hAnsi="Times New Roman"/>
         <w:color w:val="3660ac" w:themeColor="accent1" w:themeTint="80" w:themeShade="95"/>
         <w:sz w:val="22"/>
       </w:rPr>
@@ -12831,7 +12831,7 @@
     </w:tblStylePr>
     <w:tblStylePr w:type="band2Horz">
       <w:rPr>
-        <w:rFonts w:ascii="Arial" w:hAnsi="Arial"/>
+        <w:rFonts w:ascii="Times New Roman" w:hAnsi="Times New Roman"/>
         <w:color w:val="3660ac" w:themeColor="accent1" w:themeTint="80" w:themeShade="95"/>
         <w:sz w:val="22"/>
       </w:rPr>
@@ -12862,7 +12862,7 @@
     </w:tblStylePr>
     <w:tblStylePr w:type="firstCol">
       <w:rPr>
-        <w:rFonts w:ascii="Arial" w:hAnsi="Arial"/>
+        <w:rFonts w:ascii="Times New Roman" w:hAnsi="Times New Roman"/>
         <w:i/>
         <w:color w:val="3660ac" w:themeColor="accent1" w:themeTint="80" w:themeShade="95"/>
         <w:sz w:val="22"/>
@@ -12888,7 +12888,7 @@
     </w:tblStylePr>
     <w:tblStylePr w:type="firstRow">
       <w:rPr>
-        <w:rFonts w:ascii="Arial" w:hAnsi="Arial"/>
+        <w:rFonts w:ascii="Times New Roman" w:hAnsi="Times New Roman"/>
         <w:b/>
         <w:color w:val="3660ac" w:themeColor="accent1" w:themeTint="80" w:themeShade="95"/>
         <w:sz w:val="22"/>
@@ -12913,7 +12913,7 @@
     </w:tblStylePr>
     <w:tblStylePr w:type="lastCol">
       <w:rPr>
-        <w:rFonts w:ascii="Arial" w:hAnsi="Arial"/>
+        <w:rFonts w:ascii="Times New Roman" w:hAnsi="Times New Roman"/>
         <w:i/>
         <w:color w:val="3660ac" w:themeColor="accent1" w:themeTint="80" w:themeShade="95"/>
         <w:sz w:val="22"/>
@@ -12938,7 +12938,7 @@
     </w:tblStylePr>
     <w:tblStylePr w:type="lastRow">
       <w:rPr>
-        <w:rFonts w:ascii="Arial" w:hAnsi="Arial"/>
+        <w:rFonts w:ascii="Times New Roman" w:hAnsi="Times New Roman"/>
         <w:b/>
         <w:color w:val="3660ac" w:themeColor="accent1" w:themeTint="80" w:themeShade="95"/>
         <w:sz w:val="22"/>
@@ -13052,7 +13052,7 @@
     </w:tcPr>
     <w:tblStylePr w:type="band1Horz">
       <w:rPr>
-        <w:rFonts w:ascii="Arial" w:hAnsi="Arial"/>
+        <w:rFonts w:ascii="Times New Roman" w:hAnsi="Times New Roman"/>
         <w:color w:val="cb5d12" w:themeColor="accent2" w:themeTint="97" w:themeShade="95"/>
         <w:sz w:val="22"/>
       </w:rPr>
@@ -13085,7 +13085,7 @@
     </w:tblStylePr>
     <w:tblStylePr w:type="band2Horz">
       <w:rPr>
-        <w:rFonts w:ascii="Arial" w:hAnsi="Arial"/>
+        <w:rFonts w:ascii="Times New Roman" w:hAnsi="Times New Roman"/>
         <w:color w:val="cb5d12" w:themeColor="accent2" w:themeTint="97" w:themeShade="95"/>
         <w:sz w:val="22"/>
       </w:rPr>
@@ -13116,7 +13116,7 @@
     </w:tblStylePr>
     <w:tblStylePr w:type="firstCol">
       <w:rPr>
-        <w:rFonts w:ascii="Arial" w:hAnsi="Arial"/>
+        <w:rFonts w:ascii="Times New Roman" w:hAnsi="Times New Roman"/>
         <w:i/>
         <w:color w:val="cb5d12" w:themeColor="accent2" w:themeTint="97" w:themeShade="95"/>
         <w:sz w:val="22"/>
@@ -13142,7 +13142,7 @@
     </w:tblStylePr>
     <w:tblStylePr w:type="firstRow">
       <w:rPr>
-        <w:rFonts w:ascii="Arial" w:hAnsi="Arial"/>
+        <w:rFonts w:ascii="Times New Roman" w:hAnsi="Times New Roman"/>
         <w:b/>
         <w:color w:val="cb5d12" w:themeColor="accent2" w:themeTint="97" w:themeShade="95"/>
         <w:sz w:val="22"/>
@@ -13167,7 +13167,7 @@
     </w:tblStylePr>
     <w:tblStylePr w:type="lastCol">
       <w:rPr>
-        <w:rFonts w:ascii="Arial" w:hAnsi="Arial"/>
+        <w:rFonts w:ascii="Times New Roman" w:hAnsi="Times New Roman"/>
         <w:i/>
         <w:color w:val="cb5d12" w:themeColor="accent2" w:themeTint="97" w:themeShade="95"/>
         <w:sz w:val="22"/>
@@ -13192,7 +13192,7 @@
     </w:tblStylePr>
     <w:tblStylePr w:type="lastRow">
       <w:rPr>
-        <w:rFonts w:ascii="Arial" w:hAnsi="Arial"/>
+        <w:rFonts w:ascii="Times New Roman" w:hAnsi="Times New Roman"/>
         <w:b/>
         <w:color w:val="cb5d12" w:themeColor="accent2" w:themeTint="97" w:themeShade="95"/>
         <w:sz w:val="22"/>
@@ -13306,7 +13306,7 @@
     </w:tcPr>
     <w:tblStylePr w:type="band1Horz">
       <w:rPr>
-        <w:rFonts w:ascii="Arial" w:hAnsi="Arial"/>
+        <w:rFonts w:ascii="Times New Roman" w:hAnsi="Times New Roman"/>
         <w:color w:val="616161" w:themeColor="accent3" w:themeTint="FE" w:themeShade="95"/>
         <w:sz w:val="22"/>
       </w:rPr>
@@ -13339,7 +13339,7 @@
     </w:tblStylePr>
     <w:tblStylePr w:type="band2Horz">
       <w:rPr>
-        <w:rFonts w:ascii="Arial" w:hAnsi="Arial"/>
+        <w:rFonts w:ascii="Times New Roman" w:hAnsi="Times New Roman"/>
         <w:color w:val="616161" w:themeColor="accent3" w:themeTint="FE" w:themeShade="95"/>
         <w:sz w:val="22"/>
       </w:rPr>
@@ -13370,7 +13370,7 @@
     </w:tblStylePr>
     <w:tblStylePr w:type="firstCol">
       <w:rPr>
-        <w:rFonts w:ascii="Arial" w:hAnsi="Arial"/>
+        <w:rFonts w:ascii="Times New Roman" w:hAnsi="Times New Roman"/>
         <w:i/>
         <w:color w:val="616161" w:themeColor="accent3" w:themeTint="FE" w:themeShade="95"/>
         <w:sz w:val="22"/>
@@ -13396,7 +13396,7 @@
     </w:tblStylePr>
     <w:tblStylePr w:type="firstRow">
       <w:rPr>
-        <w:rFonts w:ascii="Arial" w:hAnsi="Arial"/>
+        <w:rFonts w:ascii="Times New Roman" w:hAnsi="Times New Roman"/>
         <w:b/>
         <w:color w:val="616161" w:themeColor="accent3" w:themeTint="FE" w:themeShade="95"/>
         <w:sz w:val="22"/>
@@ -13421,7 +13421,7 @@
     </w:tblStylePr>
     <w:tblStylePr w:type="lastCol">
       <w:rPr>
-        <w:rFonts w:ascii="Arial" w:hAnsi="Arial"/>
+        <w:rFonts w:ascii="Times New Roman" w:hAnsi="Times New Roman"/>
         <w:i/>
         <w:color w:val="616161" w:themeColor="accent3" w:themeTint="FE" w:themeShade="95"/>
         <w:sz w:val="22"/>
@@ -13446,7 +13446,7 @@
     </w:tblStylePr>
     <w:tblStylePr w:type="lastRow">
       <w:rPr>
-        <w:rFonts w:ascii="Arial" w:hAnsi="Arial"/>
+        <w:rFonts w:ascii="Times New Roman" w:hAnsi="Times New Roman"/>
         <w:b/>
         <w:color w:val="616161" w:themeColor="accent3" w:themeTint="FE" w:themeShade="95"/>
         <w:sz w:val="22"/>
@@ -13560,7 +13560,7 @@
     </w:tcPr>
     <w:tblStylePr w:type="band1Horz">
       <w:rPr>
-        <w:rFonts w:ascii="Arial" w:hAnsi="Arial"/>
+        <w:rFonts w:ascii="Times New Roman" w:hAnsi="Times New Roman"/>
         <w:color w:val="d09d00" w:themeColor="accent4" w:themeTint="9A" w:themeShade="95"/>
         <w:sz w:val="22"/>
       </w:rPr>
@@ -13593,7 +13593,7 @@
     </w:tblStylePr>
     <w:tblStylePr w:type="band2Horz">
       <w:rPr>
-        <w:rFonts w:ascii="Arial" w:hAnsi="Arial"/>
+        <w:rFonts w:ascii="Times New Roman" w:hAnsi="Times New Roman"/>
         <w:color w:val="d09d00" w:themeColor="accent4" w:themeTint="9A" w:themeShade="95"/>
         <w:sz w:val="22"/>
       </w:rPr>
@@ -13624,7 +13624,7 @@
     </w:tblStylePr>
     <w:tblStylePr w:type="firstCol">
       <w:rPr>
-        <w:rFonts w:ascii="Arial" w:hAnsi="Arial"/>
+        <w:rFonts w:ascii="Times New Roman" w:hAnsi="Times New Roman"/>
         <w:i/>
         <w:color w:val="d09d00" w:themeColor="accent4" w:themeTint="9A" w:themeShade="95"/>
         <w:sz w:val="22"/>
@@ -13650,7 +13650,7 @@
     </w:tblStylePr>
     <w:tblStylePr w:type="firstRow">
       <w:rPr>
-        <w:rFonts w:ascii="Arial" w:hAnsi="Arial"/>
+        <w:rFonts w:ascii="Times New Roman" w:hAnsi="Times New Roman"/>
         <w:b/>
         <w:color w:val="d09d00" w:themeColor="accent4" w:themeTint="9A" w:themeShade="95"/>
         <w:sz w:val="22"/>
@@ -13675,7 +13675,7 @@
     </w:tblStylePr>
     <w:tblStylePr w:type="lastCol">
       <w:rPr>
-        <w:rFonts w:ascii="Arial" w:hAnsi="Arial"/>
+        <w:rFonts w:ascii="Times New Roman" w:hAnsi="Times New Roman"/>
         <w:i/>
         <w:color w:val="d09d00" w:themeColor="accent4" w:themeTint="9A" w:themeShade="95"/>
         <w:sz w:val="22"/>
@@ -13700,7 +13700,7 @@
     </w:tblStylePr>
     <w:tblStylePr w:type="lastRow">
       <w:rPr>
-        <w:rFonts w:ascii="Arial" w:hAnsi="Arial"/>
+        <w:rFonts w:ascii="Times New Roman" w:hAnsi="Times New Roman"/>
         <w:b/>
         <w:color w:val="d09d00" w:themeColor="accent4" w:themeTint="9A" w:themeShade="95"/>
         <w:sz w:val="22"/>
@@ -13814,7 +13814,7 @@
     </w:tcPr>
     <w:tblStylePr w:type="band1Horz">
       <w:rPr>
-        <w:rFonts w:ascii="Arial" w:hAnsi="Arial"/>
+        <w:rFonts w:ascii="Times New Roman" w:hAnsi="Times New Roman"/>
         <w:color w:val="245b8d" w:themeColor="accent5" w:themeShade="95"/>
         <w:sz w:val="22"/>
       </w:rPr>
@@ -13847,7 +13847,7 @@
     </w:tblStylePr>
     <w:tblStylePr w:type="band2Horz">
       <w:rPr>
-        <w:rFonts w:ascii="Arial" w:hAnsi="Arial"/>
+        <w:rFonts w:ascii="Times New Roman" w:hAnsi="Times New Roman"/>
         <w:color w:val="245b8d" w:themeColor="accent5" w:themeShade="95"/>
         <w:sz w:val="22"/>
       </w:rPr>
@@ -13878,7 +13878,7 @@
     </w:tblStylePr>
     <w:tblStylePr w:type="firstCol">
       <w:rPr>
-        <w:rFonts w:ascii="Arial" w:hAnsi="Arial"/>
+        <w:rFonts w:ascii="Times New Roman" w:hAnsi="Times New Roman"/>
         <w:i/>
         <w:color w:val="245b8d" w:themeColor="accent5" w:themeShade="95"/>
         <w:sz w:val="22"/>
@@ -13904,7 +13904,7 @@
     </w:tblStylePr>
     <w:tblStylePr w:type="firstRow">
       <w:rPr>
-        <w:rFonts w:ascii="Arial" w:hAnsi="Arial"/>
+        <w:rFonts w:ascii="Times New Roman" w:hAnsi="Times New Roman"/>
         <w:b/>
         <w:color w:val="245b8d" w:themeColor="accent5" w:themeShade="95"/>
         <w:sz w:val="22"/>
@@ -13929,7 +13929,7 @@
     </w:tblStylePr>
     <w:tblStylePr w:type="lastCol">
       <w:rPr>
-        <w:rFonts w:ascii="Arial" w:hAnsi="Arial"/>
+        <w:rFonts w:ascii="Times New Roman" w:hAnsi="Times New Roman"/>
         <w:i/>
         <w:color w:val="245b8d" w:themeColor="accent5" w:themeShade="95"/>
         <w:sz w:val="22"/>
@@ -13954,7 +13954,7 @@
     </w:tblStylePr>
     <w:tblStylePr w:type="lastRow">
       <w:rPr>
-        <w:rFonts w:ascii="Arial" w:hAnsi="Arial"/>
+        <w:rFonts w:ascii="Times New Roman" w:hAnsi="Times New Roman"/>
         <w:b/>
         <w:color w:val="245b8d" w:themeColor="accent5" w:themeShade="95"/>
         <w:sz w:val="22"/>
@@ -14068,7 +14068,7 @@
     </w:tcPr>
     <w:tblStylePr w:type="band1Horz">
       <w:rPr>
-        <w:rFonts w:ascii="Arial" w:hAnsi="Arial"/>
+        <w:rFonts w:ascii="Times New Roman" w:hAnsi="Times New Roman"/>
         <w:color w:val="416529" w:themeColor="accent6" w:themeShade="95"/>
         <w:sz w:val="22"/>
       </w:rPr>
@@ -14101,7 +14101,7 @@
     </w:tblStylePr>
     <w:tblStylePr w:type="band2Horz">
       <w:rPr>
-        <w:rFonts w:ascii="Arial" w:hAnsi="Arial"/>
+        <w:rFonts w:ascii="Times New Roman" w:hAnsi="Times New Roman"/>
         <w:color w:val="416529" w:themeColor="accent6" w:themeShade="95"/>
         <w:sz w:val="22"/>
       </w:rPr>
@@ -14132,7 +14132,7 @@
     </w:tblStylePr>
     <w:tblStylePr w:type="firstCol">
       <w:rPr>
-        <w:rFonts w:ascii="Arial" w:hAnsi="Arial"/>
+        <w:rFonts w:ascii="Times New Roman" w:hAnsi="Times New Roman"/>
         <w:i/>
         <w:color w:val="416529" w:themeColor="accent6" w:themeShade="95"/>
         <w:sz w:val="22"/>
@@ -14158,7 +14158,7 @@
     </w:tblStylePr>
     <w:tblStylePr w:type="firstRow">
       <w:rPr>
-        <w:rFonts w:ascii="Arial" w:hAnsi="Arial"/>
+        <w:rFonts w:ascii="Times New Roman" w:hAnsi="Times New Roman"/>
         <w:b/>
         <w:color w:val="416529" w:themeColor="accent6" w:themeShade="95"/>
         <w:sz w:val="22"/>
@@ -14183,7 +14183,7 @@
     </w:tblStylePr>
     <w:tblStylePr w:type="lastCol">
       <w:rPr>
-        <w:rFonts w:ascii="Arial" w:hAnsi="Arial"/>
+        <w:rFonts w:ascii="Times New Roman" w:hAnsi="Times New Roman"/>
         <w:i/>
         <w:color w:val="416529" w:themeColor="accent6" w:themeShade="95"/>
         <w:sz w:val="22"/>
@@ -14208,7 +14208,7 @@
     </w:tblStylePr>
     <w:tblStylePr w:type="lastRow">
       <w:rPr>
-        <w:rFonts w:ascii="Arial" w:hAnsi="Arial"/>
+        <w:rFonts w:ascii="Times New Roman" w:hAnsi="Times New Roman"/>
         <w:b/>
         <w:color w:val="416529" w:themeColor="accent6" w:themeShade="95"/>
         <w:sz w:val="22"/>
@@ -15833,7 +15833,7 @@
     </w:tcPr>
     <w:tblStylePr w:type="band1Horz">
       <w:rPr>
-        <w:rFonts w:ascii="Arial" w:hAnsi="Arial"/>
+        <w:rFonts w:ascii="Times New Roman" w:hAnsi="Times New Roman"/>
         <w:color w:val="404040"/>
         <w:sz w:val="22"/>
       </w:rPr>
@@ -15852,7 +15852,7 @@
     </w:tblStylePr>
     <w:tblStylePr w:type="band1Vert">
       <w:rPr>
-        <w:rFonts w:ascii="Arial" w:hAnsi="Arial"/>
+        <w:rFonts w:ascii="Times New Roman" w:hAnsi="Times New Roman"/>
         <w:color w:val="404040"/>
         <w:sz w:val="22"/>
       </w:rPr>
@@ -15897,7 +15897,7 @@
     </w:tblStylePr>
     <w:tblStylePr w:type="firstCol">
       <w:rPr>
-        <w:rFonts w:ascii="Arial" w:hAnsi="Arial"/>
+        <w:rFonts w:ascii="Times New Roman" w:hAnsi="Times New Roman"/>
         <w:b/>
         <w:color w:val="404040"/>
         <w:sz w:val="22"/>
@@ -15916,7 +15916,7 @@
     </w:tblStylePr>
     <w:tblStylePr w:type="firstRow">
       <w:rPr>
-        <w:rFonts w:ascii="Arial" w:hAnsi="Arial"/>
+        <w:rFonts w:ascii="Times New Roman" w:hAnsi="Times New Roman"/>
         <w:b/>
         <w:color w:val="404040"/>
         <w:sz w:val="22"/>
@@ -15940,7 +15940,7 @@
     </w:tblStylePr>
     <w:tblStylePr w:type="lastCol">
       <w:rPr>
-        <w:rFonts w:ascii="Arial" w:hAnsi="Arial"/>
+        <w:rFonts w:ascii="Times New Roman" w:hAnsi="Times New Roman"/>
         <w:b/>
         <w:color w:val="404040"/>
         <w:sz w:val="22"/>
@@ -15959,7 +15959,7 @@
     </w:tblStylePr>
     <w:tblStylePr w:type="lastRow">
       <w:rPr>
-        <w:rFonts w:ascii="Arial" w:hAnsi="Arial"/>
+        <w:rFonts w:ascii="Times New Roman" w:hAnsi="Times New Roman"/>
         <w:b/>
         <w:color w:val="404040"/>
         <w:sz w:val="22"/>
@@ -16071,7 +16071,7 @@
     </w:tcPr>
     <w:tblStylePr w:type="band1Horz">
       <w:rPr>
-        <w:rFonts w:ascii="Arial" w:hAnsi="Arial"/>
+        <w:rFonts w:ascii="Times New Roman" w:hAnsi="Times New Roman"/>
         <w:color w:val="404040"/>
         <w:sz w:val="22"/>
       </w:rPr>
@@ -16090,7 +16090,7 @@
     </w:tblStylePr>
     <w:tblStylePr w:type="band1Vert">
       <w:rPr>
-        <w:rFonts w:ascii="Arial" w:hAnsi="Arial"/>
+        <w:rFonts w:ascii="Times New Roman" w:hAnsi="Times New Roman"/>
         <w:color w:val="404040"/>
         <w:sz w:val="22"/>
       </w:rPr>
@@ -16135,7 +16135,7 @@
     </w:tblStylePr>
     <w:tblStylePr w:type="firstCol">
       <w:rPr>
-        <w:rFonts w:ascii="Arial" w:hAnsi="Arial"/>
+        <w:rFonts w:ascii="Times New Roman" w:hAnsi="Times New Roman"/>
         <w:b/>
         <w:color w:val="404040"/>
         <w:sz w:val="22"/>
@@ -16154,7 +16154,7 @@
     </w:tblStylePr>
     <w:tblStylePr w:type="firstRow">
       <w:rPr>
-        <w:rFonts w:ascii="Arial" w:hAnsi="Arial"/>
+        <w:rFonts w:ascii="Times New Roman" w:hAnsi="Times New Roman"/>
         <w:b/>
         <w:color w:val="404040"/>
         <w:sz w:val="22"/>
@@ -16178,7 +16178,7 @@
     </w:tblStylePr>
     <w:tblStylePr w:type="lastCol">
       <w:rPr>
-        <w:rFonts w:ascii="Arial" w:hAnsi="Arial"/>
+        <w:rFonts w:ascii="Times New Roman" w:hAnsi="Times New Roman"/>
         <w:b/>
         <w:color w:val="404040"/>
         <w:sz w:val="22"/>
@@ -16197,7 +16197,7 @@
     </w:tblStylePr>
     <w:tblStylePr w:type="lastRow">
       <w:rPr>
-        <w:rFonts w:ascii="Arial" w:hAnsi="Arial"/>
+        <w:rFonts w:ascii="Times New Roman" w:hAnsi="Times New Roman"/>
         <w:b/>
         <w:color w:val="404040"/>
         <w:sz w:val="22"/>
@@ -16309,7 +16309,7 @@
     </w:tcPr>
     <w:tblStylePr w:type="band1Horz">
       <w:rPr>
-        <w:rFonts w:ascii="Arial" w:hAnsi="Arial"/>
+        <w:rFonts w:ascii="Times New Roman" w:hAnsi="Times New Roman"/>
         <w:color w:val="404040"/>
         <w:sz w:val="22"/>
       </w:rPr>
@@ -16328,7 +16328,7 @@
     </w:tblStylePr>
     <w:tblStylePr w:type="band1Vert">
       <w:rPr>
-        <w:rFonts w:ascii="Arial" w:hAnsi="Arial"/>
+        <w:rFonts w:ascii="Times New Roman" w:hAnsi="Times New Roman"/>
         <w:color w:val="404040"/>
         <w:sz w:val="22"/>
       </w:rPr>
@@ -16373,7 +16373,7 @@
     </w:tblStylePr>
     <w:tblStylePr w:type="firstCol">
       <w:rPr>
-        <w:rFonts w:ascii="Arial" w:hAnsi="Arial"/>
+        <w:rFonts w:ascii="Times New Roman" w:hAnsi="Times New Roman"/>
         <w:b/>
         <w:color w:val="404040"/>
         <w:sz w:val="22"/>
@@ -16392,7 +16392,7 @@
     </w:tblStylePr>
     <w:tblStylePr w:type="firstRow">
       <w:rPr>
-        <w:rFonts w:ascii="Arial" w:hAnsi="Arial"/>
+        <w:rFonts w:ascii="Times New Roman" w:hAnsi="Times New Roman"/>
         <w:b/>
         <w:color w:val="404040"/>
         <w:sz w:val="22"/>
@@ -16416,7 +16416,7 @@
     </w:tblStylePr>
     <w:tblStylePr w:type="lastCol">
       <w:rPr>
-        <w:rFonts w:ascii="Arial" w:hAnsi="Arial"/>
+        <w:rFonts w:ascii="Times New Roman" w:hAnsi="Times New Roman"/>
         <w:b/>
         <w:color w:val="404040"/>
         <w:sz w:val="22"/>
@@ -16435,7 +16435,7 @@
     </w:tblStylePr>
     <w:tblStylePr w:type="lastRow">
       <w:rPr>
-        <w:rFonts w:ascii="Arial" w:hAnsi="Arial"/>
+        <w:rFonts w:ascii="Times New Roman" w:hAnsi="Times New Roman"/>
         <w:b/>
         <w:color w:val="404040"/>
         <w:sz w:val="22"/>
@@ -16547,7 +16547,7 @@
     </w:tcPr>
     <w:tblStylePr w:type="band1Horz">
       <w:rPr>
-        <w:rFonts w:ascii="Arial" w:hAnsi="Arial"/>
+        <w:rFonts w:ascii="Times New Roman" w:hAnsi="Times New Roman"/>
         <w:color w:val="404040"/>
         <w:sz w:val="22"/>
       </w:rPr>
@@ -16566,7 +16566,7 @@
     </w:tblStylePr>
     <w:tblStylePr w:type="band1Vert">
       <w:rPr>
-        <w:rFonts w:ascii="Arial" w:hAnsi="Arial"/>
+        <w:rFonts w:ascii="Times New Roman" w:hAnsi="Times New Roman"/>
         <w:color w:val="404040"/>
         <w:sz w:val="22"/>
       </w:rPr>
@@ -16611,7 +16611,7 @@
     </w:tblStylePr>
     <w:tblStylePr w:type="firstCol">
       <w:rPr>
-        <w:rFonts w:ascii="Arial" w:hAnsi="Arial"/>
+        <w:rFonts w:ascii="Times New Roman" w:hAnsi="Times New Roman"/>
         <w:b/>
         <w:color w:val="404040"/>
         <w:sz w:val="22"/>
@@ -16630,7 +16630,7 @@
     </w:tblStylePr>
     <w:tblStylePr w:type="firstRow">
       <w:rPr>
-        <w:rFonts w:ascii="Arial" w:hAnsi="Arial"/>
+        <w:rFonts w:ascii="Times New Roman" w:hAnsi="Times New Roman"/>
         <w:b/>
         <w:color w:val="404040"/>
         <w:sz w:val="22"/>
@@ -16654,7 +16654,7 @@
     </w:tblStylePr>
     <w:tblStylePr w:type="lastCol">
       <w:rPr>
-        <w:rFonts w:ascii="Arial" w:hAnsi="Arial"/>
+        <w:rFonts w:ascii="Times New Roman" w:hAnsi="Times New Roman"/>
         <w:b/>
         <w:color w:val="404040"/>
         <w:sz w:val="22"/>
@@ -16673,7 +16673,7 @@
     </w:tblStylePr>
     <w:tblStylePr w:type="lastRow">
       <w:rPr>
-        <w:rFonts w:ascii="Arial" w:hAnsi="Arial"/>
+        <w:rFonts w:ascii="Times New Roman" w:hAnsi="Times New Roman"/>
         <w:b/>
         <w:color w:val="404040"/>
         <w:sz w:val="22"/>
@@ -16785,7 +16785,7 @@
     </w:tcPr>
     <w:tblStylePr w:type="band1Horz">
       <w:rPr>
-        <w:rFonts w:ascii="Arial" w:hAnsi="Arial"/>
+        <w:rFonts w:ascii="Times New Roman" w:hAnsi="Times New Roman"/>
         <w:color w:val="404040"/>
         <w:sz w:val="22"/>
       </w:rPr>
@@ -16804,7 +16804,7 @@
     </w:tblStylePr>
     <w:tblStylePr w:type="band1Vert">
       <w:rPr>
-        <w:rFonts w:ascii="Arial" w:hAnsi="Arial"/>
+        <w:rFonts w:ascii="Times New Roman" w:hAnsi="Times New Roman"/>
         <w:color w:val="404040"/>
         <w:sz w:val="22"/>
       </w:rPr>
@@ -16849,7 +16849,7 @@
     </w:tblStylePr>
     <w:tblStylePr w:type="firstCol">
       <w:rPr>
-        <w:rFonts w:ascii="Arial" w:hAnsi="Arial"/>
+        <w:rFonts w:ascii="Times New Roman" w:hAnsi="Times New Roman"/>
         <w:b/>
         <w:color w:val="404040"/>
         <w:sz w:val="22"/>
@@ -16868,7 +16868,7 @@
     </w:tblStylePr>
     <w:tblStylePr w:type="firstRow">
       <w:rPr>
-        <w:rFonts w:ascii="Arial" w:hAnsi="Arial"/>
+        <w:rFonts w:ascii="Times New Roman" w:hAnsi="Times New Roman"/>
         <w:b/>
         <w:color w:val="404040"/>
         <w:sz w:val="22"/>
@@ -16892,7 +16892,7 @@
     </w:tblStylePr>
     <w:tblStylePr w:type="lastCol">
       <w:rPr>
-        <w:rFonts w:ascii="Arial" w:hAnsi="Arial"/>
+        <w:rFonts w:ascii="Times New Roman" w:hAnsi="Times New Roman"/>
         <w:b/>
         <w:color w:val="404040"/>
         <w:sz w:val="22"/>
@@ -16911,7 +16911,7 @@
     </w:tblStylePr>
     <w:tblStylePr w:type="lastRow">
       <w:rPr>
-        <w:rFonts w:ascii="Arial" w:hAnsi="Arial"/>
+        <w:rFonts w:ascii="Times New Roman" w:hAnsi="Times New Roman"/>
         <w:b/>
         <w:color w:val="404040"/>
         <w:sz w:val="22"/>
@@ -17023,7 +17023,7 @@
     </w:tcPr>
     <w:tblStylePr w:type="band1Horz">
       <w:rPr>
-        <w:rFonts w:ascii="Arial" w:hAnsi="Arial"/>
+        <w:rFonts w:ascii="Times New Roman" w:hAnsi="Times New Roman"/>
         <w:color w:val="404040"/>
         <w:sz w:val="22"/>
       </w:rPr>
@@ -17042,7 +17042,7 @@
     </w:tblStylePr>
     <w:tblStylePr w:type="band1Vert">
       <w:rPr>
-        <w:rFonts w:ascii="Arial" w:hAnsi="Arial"/>
+        <w:rFonts w:ascii="Times New Roman" w:hAnsi="Times New Roman"/>
         <w:color w:val="404040"/>
         <w:sz w:val="22"/>
       </w:rPr>
@@ -17087,7 +17087,7 @@
     </w:tblStylePr>
     <w:tblStylePr w:type="firstCol">
       <w:rPr>
-        <w:rFonts w:ascii="Arial" w:hAnsi="Arial"/>
+        <w:rFonts w:ascii="Times New Roman" w:hAnsi="Times New Roman"/>
         <w:b/>
         <w:color w:val="404040"/>
         <w:sz w:val="22"/>
@@ -17106,7 +17106,7 @@
     </w:tblStylePr>
     <w:tblStylePr w:type="firstRow">
       <w:rPr>
-        <w:rFonts w:ascii="Arial" w:hAnsi="Arial"/>
+        <w:rFonts w:ascii="Times New Roman" w:hAnsi="Times New Roman"/>
         <w:b/>
         <w:color w:val="404040"/>
         <w:sz w:val="22"/>
@@ -17130,7 +17130,7 @@
     </w:tblStylePr>
     <w:tblStylePr w:type="lastCol">
       <w:rPr>
-        <w:rFonts w:ascii="Arial" w:hAnsi="Arial"/>
+        <w:rFonts w:ascii="Times New Roman" w:hAnsi="Times New Roman"/>
         <w:b/>
         <w:color w:val="404040"/>
         <w:sz w:val="22"/>
@@ -17149,7 +17149,7 @@
     </w:tblStylePr>
     <w:tblStylePr w:type="lastRow">
       <w:rPr>
-        <w:rFonts w:ascii="Arial" w:hAnsi="Arial"/>
+        <w:rFonts w:ascii="Times New Roman" w:hAnsi="Times New Roman"/>
         <w:b/>
         <w:color w:val="404040"/>
         <w:sz w:val="22"/>
@@ -17261,7 +17261,7 @@
     </w:tcPr>
     <w:tblStylePr w:type="band1Horz">
       <w:rPr>
-        <w:rFonts w:ascii="Arial" w:hAnsi="Arial"/>
+        <w:rFonts w:ascii="Times New Roman" w:hAnsi="Times New Roman"/>
         <w:color w:val="404040"/>
         <w:sz w:val="22"/>
       </w:rPr>
@@ -17280,7 +17280,7 @@
     </w:tblStylePr>
     <w:tblStylePr w:type="band1Vert">
       <w:rPr>
-        <w:rFonts w:ascii="Arial" w:hAnsi="Arial"/>
+        <w:rFonts w:ascii="Times New Roman" w:hAnsi="Times New Roman"/>
         <w:color w:val="404040"/>
         <w:sz w:val="22"/>
       </w:rPr>
@@ -17325,7 +17325,7 @@
     </w:tblStylePr>
     <w:tblStylePr w:type="firstCol">
       <w:rPr>
-        <w:rFonts w:ascii="Arial" w:hAnsi="Arial"/>
+        <w:rFonts w:ascii="Times New Roman" w:hAnsi="Times New Roman"/>
         <w:b/>
         <w:color w:val="404040"/>
         <w:sz w:val="22"/>
@@ -17344,7 +17344,7 @@
     </w:tblStylePr>
     <w:tblStylePr w:type="firstRow">
       <w:rPr>
-        <w:rFonts w:ascii="Arial" w:hAnsi="Arial"/>
+        <w:rFonts w:ascii="Times New Roman" w:hAnsi="Times New Roman"/>
         <w:b/>
         <w:color w:val="404040"/>
         <w:sz w:val="22"/>
@@ -17368,7 +17368,7 @@
     </w:tblStylePr>
     <w:tblStylePr w:type="lastCol">
       <w:rPr>
-        <w:rFonts w:ascii="Arial" w:hAnsi="Arial"/>
+        <w:rFonts w:ascii="Times New Roman" w:hAnsi="Times New Roman"/>
         <w:b/>
         <w:color w:val="404040"/>
         <w:sz w:val="22"/>
@@ -17387,7 +17387,7 @@
     </w:tblStylePr>
     <w:tblStylePr w:type="lastRow">
       <w:rPr>
-        <w:rFonts w:ascii="Arial" w:hAnsi="Arial"/>
+        <w:rFonts w:ascii="Times New Roman" w:hAnsi="Times New Roman"/>
         <w:b/>
         <w:color w:val="404040"/>
         <w:sz w:val="22"/>
@@ -17500,7 +17500,7 @@
     </w:tcPr>
     <w:tblStylePr w:type="band1Horz">
       <w:rPr>
-        <w:rFonts w:ascii="Arial" w:hAnsi="Arial"/>
+        <w:rFonts w:ascii="Times New Roman" w:hAnsi="Times New Roman"/>
         <w:color w:val="404040"/>
         <w:sz w:val="22"/>
       </w:rPr>
@@ -17521,7 +17521,7 @@
     </w:tblStylePr>
     <w:tblStylePr w:type="band1Vert">
       <w:rPr>
-        <w:rFonts w:ascii="Arial" w:hAnsi="Arial"/>
+        <w:rFonts w:ascii="Times New Roman" w:hAnsi="Times New Roman"/>
         <w:color w:val="404040"/>
         <w:sz w:val="22"/>
       </w:rPr>
@@ -17585,7 +17585,7 @@
     </w:tblStylePr>
     <w:tblStylePr w:type="firstRow">
       <w:rPr>
-        <w:rFonts w:ascii="Arial" w:hAnsi="Arial"/>
+        <w:rFonts w:ascii="Times New Roman" w:hAnsi="Times New Roman"/>
         <w:b/>
         <w:color w:val="ffffff"/>
         <w:sz w:val="22"/>
@@ -17728,7 +17728,7 @@
     </w:tcPr>
     <w:tblStylePr w:type="band1Horz">
       <w:rPr>
-        <w:rFonts w:ascii="Arial" w:hAnsi="Arial"/>
+        <w:rFonts w:ascii="Times New Roman" w:hAnsi="Times New Roman"/>
         <w:color w:val="404040"/>
         <w:sz w:val="22"/>
       </w:rPr>
@@ -17749,7 +17749,7 @@
     </w:tblStylePr>
     <w:tblStylePr w:type="band1Vert">
       <w:rPr>
-        <w:rFonts w:ascii="Arial" w:hAnsi="Arial"/>
+        <w:rFonts w:ascii="Times New Roman" w:hAnsi="Times New Roman"/>
         <w:color w:val="404040"/>
         <w:sz w:val="22"/>
       </w:rPr>
@@ -17813,7 +17813,7 @@
     </w:tblStylePr>
     <w:tblStylePr w:type="firstRow">
       <w:rPr>
-        <w:rFonts w:ascii="Arial" w:hAnsi="Arial"/>
+        <w:rFonts w:ascii="Times New Roman" w:hAnsi="Times New Roman"/>
         <w:b/>
         <w:color w:val="ffffff"/>
         <w:sz w:val="22"/>
@@ -17956,7 +17956,7 @@
     </w:tcPr>
     <w:tblStylePr w:type="band1Horz">
       <w:rPr>
-        <w:rFonts w:ascii="Arial" w:hAnsi="Arial"/>
+        <w:rFonts w:ascii="Times New Roman" w:hAnsi="Times New Roman"/>
         <w:color w:val="404040"/>
         <w:sz w:val="22"/>
       </w:rPr>
@@ -17977,7 +17977,7 @@
     </w:tblStylePr>
     <w:tblStylePr w:type="band1Vert">
       <w:rPr>
-        <w:rFonts w:ascii="Arial" w:hAnsi="Arial"/>
+        <w:rFonts w:ascii="Times New Roman" w:hAnsi="Times New Roman"/>
         <w:color w:val="404040"/>
         <w:sz w:val="22"/>
       </w:rPr>
@@ -18041,7 +18041,7 @@
     </w:tblStylePr>
     <w:tblStylePr w:type="firstRow">
       <w:rPr>
-        <w:rFonts w:ascii="Arial" w:hAnsi="Arial"/>
+        <w:rFonts w:ascii="Times New Roman" w:hAnsi="Times New Roman"/>
         <w:b/>
         <w:color w:val="ffffff"/>
         <w:sz w:val="22"/>
@@ -18184,7 +18184,7 @@
     </w:tcPr>
     <w:tblStylePr w:type="band1Horz">
       <w:rPr>
-        <w:rFonts w:ascii="Arial" w:hAnsi="Arial"/>
+        <w:rFonts w:ascii="Times New Roman" w:hAnsi="Times New Roman"/>
         <w:color w:val="404040"/>
         <w:sz w:val="22"/>
       </w:rPr>
@@ -18205,7 +18205,7 @@
     </w:tblStylePr>
     <w:tblStylePr w:type="band1Vert">
       <w:rPr>
-        <w:rFonts w:ascii="Arial" w:hAnsi="Arial"/>
+        <w:rFonts w:ascii="Times New Roman" w:hAnsi="Times New Roman"/>
         <w:color w:val="404040"/>
         <w:sz w:val="22"/>
       </w:rPr>
@@ -18269,7 +18269,7 @@
     </w:tblStylePr>
     <w:tblStylePr w:type="firstRow">
       <w:rPr>
-        <w:rFonts w:ascii="Arial" w:hAnsi="Arial"/>
+        <w:rFonts w:ascii="Times New Roman" w:hAnsi="Times New Roman"/>
         <w:b/>
         <w:color w:val="ffffff"/>
         <w:sz w:val="22"/>
@@ -18412,7 +18412,7 @@
     </w:tcPr>
     <w:tblStylePr w:type="band1Horz">
       <w:rPr>
-        <w:rFonts w:ascii="Arial" w:hAnsi="Arial"/>
+        <w:rFonts w:ascii="Times New Roman" w:hAnsi="Times New Roman"/>
         <w:color w:val="404040"/>
         <w:sz w:val="22"/>
       </w:rPr>
@@ -18433,7 +18433,7 @@
     </w:tblStylePr>
     <w:tblStylePr w:type="band1Vert">
       <w:rPr>
-        <w:rFonts w:ascii="Arial" w:hAnsi="Arial"/>
+        <w:rFonts w:ascii="Times New Roman" w:hAnsi="Times New Roman"/>
         <w:color w:val="404040"/>
         <w:sz w:val="22"/>
       </w:rPr>
@@ -18497,7 +18497,7 @@
     </w:tblStylePr>
     <w:tblStylePr w:type="firstRow">
       <w:rPr>
-        <w:rFonts w:ascii="Arial" w:hAnsi="Arial"/>
+        <w:rFonts w:ascii="Times New Roman" w:hAnsi="Times New Roman"/>
         <w:b/>
         <w:color w:val="ffffff"/>
         <w:sz w:val="22"/>
@@ -18640,7 +18640,7 @@
     </w:tcPr>
     <w:tblStylePr w:type="band1Horz">
       <w:rPr>
-        <w:rFonts w:ascii="Arial" w:hAnsi="Arial"/>
+        <w:rFonts w:ascii="Times New Roman" w:hAnsi="Times New Roman"/>
         <w:color w:val="404040"/>
         <w:sz w:val="22"/>
       </w:rPr>
@@ -18661,7 +18661,7 @@
     </w:tblStylePr>
     <w:tblStylePr w:type="band1Vert">
       <w:rPr>
-        <w:rFonts w:ascii="Arial" w:hAnsi="Arial"/>
+        <w:rFonts w:ascii="Times New Roman" w:hAnsi="Times New Roman"/>
         <w:color w:val="404040"/>
         <w:sz w:val="22"/>
       </w:rPr>
@@ -18725,7 +18725,7 @@
     </w:tblStylePr>
     <w:tblStylePr w:type="firstRow">
       <w:rPr>
-        <w:rFonts w:ascii="Arial" w:hAnsi="Arial"/>
+        <w:rFonts w:ascii="Times New Roman" w:hAnsi="Times New Roman"/>
         <w:b/>
         <w:color w:val="ffffff"/>
         <w:sz w:val="22"/>
@@ -18868,7 +18868,7 @@
     </w:tcPr>
     <w:tblStylePr w:type="band1Horz">
       <w:rPr>
-        <w:rFonts w:ascii="Arial" w:hAnsi="Arial"/>
+        <w:rFonts w:ascii="Times New Roman" w:hAnsi="Times New Roman"/>
         <w:color w:val="404040"/>
         <w:sz w:val="22"/>
       </w:rPr>
@@ -18889,7 +18889,7 @@
     </w:tblStylePr>
     <w:tblStylePr w:type="band1Vert">
       <w:rPr>
-        <w:rFonts w:ascii="Arial" w:hAnsi="Arial"/>
+        <w:rFonts w:ascii="Times New Roman" w:hAnsi="Times New Roman"/>
         <w:color w:val="404040"/>
         <w:sz w:val="22"/>
       </w:rPr>
@@ -18953,7 +18953,7 @@
     </w:tblStylePr>
     <w:tblStylePr w:type="firstRow">
       <w:rPr>
-        <w:rFonts w:ascii="Arial" w:hAnsi="Arial"/>
+        <w:rFonts w:ascii="Times New Roman" w:hAnsi="Times New Roman"/>
         <w:b/>
         <w:color w:val="ffffff"/>
         <w:sz w:val="22"/>
@@ -19097,7 +19097,7 @@
     </w:tcPr>
     <w:tblStylePr w:type="band1Horz">
       <w:rPr>
-        <w:rFonts w:ascii="Arial" w:hAnsi="Arial"/>
+        <w:rFonts w:ascii="Times New Roman" w:hAnsi="Times New Roman"/>
         <w:color w:val="404040"/>
         <w:sz w:val="22"/>
       </w:rPr>
@@ -19116,7 +19116,7 @@
     </w:tblStylePr>
     <w:tblStylePr w:type="band1Vert">
       <w:rPr>
-        <w:rFonts w:ascii="Arial" w:hAnsi="Arial"/>
+        <w:rFonts w:ascii="Times New Roman" w:hAnsi="Times New Roman"/>
         <w:color w:val="404040"/>
         <w:sz w:val="22"/>
       </w:rPr>
@@ -19178,7 +19178,7 @@
     </w:tblStylePr>
     <w:tblStylePr w:type="firstRow">
       <w:rPr>
-        <w:rFonts w:ascii="Arial" w:hAnsi="Arial"/>
+        <w:rFonts w:ascii="Times New Roman" w:hAnsi="Times New Roman"/>
         <w:b/>
         <w:color w:val="ffffff"/>
         <w:sz w:val="22"/>
@@ -19322,7 +19322,7 @@
     </w:tcPr>
     <w:tblStylePr w:type="band1Horz">
       <w:rPr>
-        <w:rFonts w:ascii="Arial" w:hAnsi="Arial"/>
+        <w:rFonts w:ascii="Times New Roman" w:hAnsi="Times New Roman"/>
         <w:color w:val="404040"/>
         <w:sz w:val="22"/>
       </w:rPr>
@@ -19341,7 +19341,7 @@
     </w:tblStylePr>
     <w:tblStylePr w:type="band1Vert">
       <w:rPr>
-        <w:rFonts w:ascii="Arial" w:hAnsi="Arial"/>
+        <w:rFonts w:ascii="Times New Roman" w:hAnsi="Times New Roman"/>
         <w:color w:val="404040"/>
         <w:sz w:val="22"/>
       </w:rPr>
@@ -19403,7 +19403,7 @@
     </w:tblStylePr>
     <w:tblStylePr w:type="firstRow">
       <w:rPr>
-        <w:rFonts w:ascii="Arial" w:hAnsi="Arial"/>
+        <w:rFonts w:ascii="Times New Roman" w:hAnsi="Times New Roman"/>
         <w:b/>
         <w:color w:val="ffffff"/>
         <w:sz w:val="22"/>
@@ -19547,7 +19547,7 @@
     </w:tcPr>
     <w:tblStylePr w:type="band1Horz">
       <w:rPr>
-        <w:rFonts w:ascii="Arial" w:hAnsi="Arial"/>
+        <w:rFonts w:ascii="Times New Roman" w:hAnsi="Times New Roman"/>
         <w:color w:val="404040"/>
         <w:sz w:val="22"/>
       </w:rPr>
@@ -19566,7 +19566,7 @@
     </w:tblStylePr>
     <w:tblStylePr w:type="band1Vert">
       <w:rPr>
-        <w:rFonts w:ascii="Arial" w:hAnsi="Arial"/>
+        <w:rFonts w:ascii="Times New Roman" w:hAnsi="Times New Roman"/>
         <w:color w:val="404040"/>
         <w:sz w:val="22"/>
       </w:rPr>
@@ -19628,7 +19628,7 @@
     </w:tblStylePr>
     <w:tblStylePr w:type="firstRow">
       <w:rPr>
-        <w:rFonts w:ascii="Arial" w:hAnsi="Arial"/>
+        <w:rFonts w:ascii="Times New Roman" w:hAnsi="Times New Roman"/>
         <w:b/>
         <w:color w:val="ffffff"/>
         <w:sz w:val="22"/>
@@ -19772,7 +19772,7 @@
     </w:tcPr>
     <w:tblStylePr w:type="band1Horz">
       <w:rPr>
-        <w:rFonts w:ascii="Arial" w:hAnsi="Arial"/>
+        <w:rFonts w:ascii="Times New Roman" w:hAnsi="Times New Roman"/>
         <w:color w:val="404040"/>
         <w:sz w:val="22"/>
       </w:rPr>
@@ -19791,7 +19791,7 @@
     </w:tblStylePr>
     <w:tblStylePr w:type="band1Vert">
       <w:rPr>
-        <w:rFonts w:ascii="Arial" w:hAnsi="Arial"/>
+        <w:rFonts w:ascii="Times New Roman" w:hAnsi="Times New Roman"/>
         <w:color w:val="404040"/>
         <w:sz w:val="22"/>
       </w:rPr>
@@ -19853,7 +19853,7 @@
     </w:tblStylePr>
     <w:tblStylePr w:type="firstRow">
       <w:rPr>
-        <w:rFonts w:ascii="Arial" w:hAnsi="Arial"/>
+        <w:rFonts w:ascii="Times New Roman" w:hAnsi="Times New Roman"/>
         <w:b/>
         <w:color w:val="ffffff"/>
         <w:sz w:val="22"/>
@@ -19997,7 +19997,7 @@
     </w:tcPr>
     <w:tblStylePr w:type="band1Horz">
       <w:rPr>
-        <w:rFonts w:ascii="Arial" w:hAnsi="Arial"/>
+        <w:rFonts w:ascii="Times New Roman" w:hAnsi="Times New Roman"/>
         <w:color w:val="404040"/>
         <w:sz w:val="22"/>
       </w:rPr>
@@ -20016,7 +20016,7 @@
     </w:tblStylePr>
     <w:tblStylePr w:type="band1Vert">
       <w:rPr>
-        <w:rFonts w:ascii="Arial" w:hAnsi="Arial"/>
+        <w:rFonts w:ascii="Times New Roman" w:hAnsi="Times New Roman"/>
         <w:color w:val="404040"/>
         <w:sz w:val="22"/>
       </w:rPr>
@@ -20078,7 +20078,7 @@
     </w:tblStylePr>
     <w:tblStylePr w:type="firstRow">
       <w:rPr>
-        <w:rFonts w:ascii="Arial" w:hAnsi="Arial"/>
+        <w:rFonts w:ascii="Times New Roman" w:hAnsi="Times New Roman"/>
         <w:b/>
         <w:color w:val="ffffff"/>
         <w:sz w:val="22"/>
@@ -20222,7 +20222,7 @@
     </w:tcPr>
     <w:tblStylePr w:type="band1Horz">
       <w:rPr>
-        <w:rFonts w:ascii="Arial" w:hAnsi="Arial"/>
+        <w:rFonts w:ascii="Times New Roman" w:hAnsi="Times New Roman"/>
         <w:color w:val="404040"/>
         <w:sz w:val="22"/>
       </w:rPr>
@@ -20241,7 +20241,7 @@
     </w:tblStylePr>
     <w:tblStylePr w:type="band1Vert">
       <w:rPr>
-        <w:rFonts w:ascii="Arial" w:hAnsi="Arial"/>
+        <w:rFonts w:ascii="Times New Roman" w:hAnsi="Times New Roman"/>
         <w:color w:val="404040"/>
         <w:sz w:val="22"/>
       </w:rPr>
@@ -20303,7 +20303,7 @@
     </w:tblStylePr>
     <w:tblStylePr w:type="firstRow">
       <w:rPr>
-        <w:rFonts w:ascii="Arial" w:hAnsi="Arial"/>
+        <w:rFonts w:ascii="Times New Roman" w:hAnsi="Times New Roman"/>
         <w:b/>
         <w:color w:val="ffffff"/>
         <w:sz w:val="22"/>
@@ -20447,7 +20447,7 @@
     </w:tcPr>
     <w:tblStylePr w:type="band1Horz">
       <w:rPr>
-        <w:rFonts w:ascii="Arial" w:hAnsi="Arial"/>
+        <w:rFonts w:ascii="Times New Roman" w:hAnsi="Times New Roman"/>
         <w:color w:val="404040"/>
         <w:sz w:val="22"/>
       </w:rPr>
@@ -20466,7 +20466,7 @@
     </w:tblStylePr>
     <w:tblStylePr w:type="band1Vert">
       <w:rPr>
-        <w:rFonts w:ascii="Arial" w:hAnsi="Arial"/>
+        <w:rFonts w:ascii="Times New Roman" w:hAnsi="Times New Roman"/>
         <w:color w:val="404040"/>
         <w:sz w:val="22"/>
       </w:rPr>
@@ -20528,7 +20528,7 @@
     </w:tblStylePr>
     <w:tblStylePr w:type="firstRow">
       <w:rPr>
-        <w:rFonts w:ascii="Arial" w:hAnsi="Arial"/>
+        <w:rFonts w:ascii="Times New Roman" w:hAnsi="Times New Roman"/>
         <w:b/>
         <w:color w:val="ffffff"/>
         <w:sz w:val="22"/>
@@ -20739,7 +20739,7 @@
     </w:tblStylePr>
     <w:tblStylePr w:type="firstCol">
       <w:rPr>
-        <w:rFonts w:ascii="Arial" w:hAnsi="Arial"/>
+        <w:rFonts w:ascii="Times New Roman" w:hAnsi="Times New Roman"/>
         <w:b/>
         <w:color w:val="ffffff" w:themeColor="light1"/>
         <w:sz w:val="22"/>
@@ -20761,7 +20761,7 @@
     </w:tblStylePr>
     <w:tblStylePr w:type="firstRow">
       <w:rPr>
-        <w:rFonts w:ascii="Arial" w:hAnsi="Arial"/>
+        <w:rFonts w:ascii="Times New Roman" w:hAnsi="Times New Roman"/>
         <w:b/>
         <w:color w:val="ffffff" w:themeColor="light1"/>
         <w:sz w:val="22"/>
@@ -20800,7 +20800,7 @@
     </w:tblStylePr>
     <w:tblStylePr w:type="lastRow">
       <w:rPr>
-        <w:rFonts w:ascii="Arial" w:hAnsi="Arial"/>
+        <w:rFonts w:ascii="Times New Roman" w:hAnsi="Times New Roman"/>
         <w:b/>
         <w:color w:val="ffffff" w:themeColor="light1"/>
         <w:sz w:val="22"/>
@@ -20871,7 +20871,7 @@
     </w:tblStylePr>
     <w:tblStylePr w:type="wholeTable">
       <w:rPr>
-        <w:rFonts w:ascii="Arial" w:hAnsi="Arial"/>
+        <w:rFonts w:ascii="Times New Roman" w:hAnsi="Times New Roman"/>
         <w:color w:val="ffffff" w:themeColor="light1"/>
         <w:sz w:val="22"/>
       </w:rPr>
@@ -20981,7 +20981,7 @@
     </w:tblStylePr>
     <w:tblStylePr w:type="firstCol">
       <w:rPr>
-        <w:rFonts w:ascii="Arial" w:hAnsi="Arial"/>
+        <w:rFonts w:ascii="Times New Roman" w:hAnsi="Times New Roman"/>
         <w:b/>
         <w:color w:val="ffffff" w:themeColor="light1"/>
         <w:sz w:val="22"/>
@@ -21003,7 +21003,7 @@
     </w:tblStylePr>
     <w:tblStylePr w:type="firstRow">
       <w:rPr>
-        <w:rFonts w:ascii="Arial" w:hAnsi="Arial"/>
+        <w:rFonts w:ascii="Times New Roman" w:hAnsi="Times New Roman"/>
         <w:b/>
         <w:color w:val="ffffff" w:themeColor="light1"/>
         <w:sz w:val="22"/>
@@ -21042,7 +21042,7 @@
     </w:tblStylePr>
     <w:tblStylePr w:type="lastRow">
       <w:rPr>
-        <w:rFonts w:ascii="Arial" w:hAnsi="Arial"/>
+        <w:rFonts w:ascii="Times New Roman" w:hAnsi="Times New Roman"/>
         <w:b/>
         <w:color w:val="ffffff" w:themeColor="light1"/>
         <w:sz w:val="22"/>
@@ -21113,7 +21113,7 @@
     </w:tblStylePr>
     <w:tblStylePr w:type="wholeTable">
       <w:rPr>
-        <w:rFonts w:ascii="Arial" w:hAnsi="Arial"/>
+        <w:rFonts w:ascii="Times New Roman" w:hAnsi="Times New Roman"/>
         <w:color w:val="ffffff" w:themeColor="light1"/>
         <w:sz w:val="22"/>
       </w:rPr>
@@ -21223,7 +21223,7 @@
     </w:tblStylePr>
     <w:tblStylePr w:type="firstCol">
       <w:rPr>
-        <w:rFonts w:ascii="Arial" w:hAnsi="Arial"/>
+        <w:rFonts w:ascii="Times New Roman" w:hAnsi="Times New Roman"/>
         <w:b/>
         <w:color w:val="ffffff" w:themeColor="light1"/>
         <w:sz w:val="22"/>
@@ -21245,7 +21245,7 @@
     </w:tblStylePr>
     <w:tblStylePr w:type="firstRow">
       <w:rPr>
-        <w:rFonts w:ascii="Arial" w:hAnsi="Arial"/>
+        <w:rFonts w:ascii="Times New Roman" w:hAnsi="Times New Roman"/>
         <w:b/>
         <w:color w:val="ffffff" w:themeColor="light1"/>
         <w:sz w:val="22"/>
@@ -21284,7 +21284,7 @@
     </w:tblStylePr>
     <w:tblStylePr w:type="lastRow">
       <w:rPr>
-        <w:rFonts w:ascii="Arial" w:hAnsi="Arial"/>
+        <w:rFonts w:ascii="Times New Roman" w:hAnsi="Times New Roman"/>
         <w:b/>
         <w:color w:val="ffffff" w:themeColor="light1"/>
         <w:sz w:val="22"/>
@@ -21355,7 +21355,7 @@
     </w:tblStylePr>
     <w:tblStylePr w:type="wholeTable">
       <w:rPr>
-        <w:rFonts w:ascii="Arial" w:hAnsi="Arial"/>
+        <w:rFonts w:ascii="Times New Roman" w:hAnsi="Times New Roman"/>
         <w:color w:val="ffffff" w:themeColor="light1"/>
         <w:sz w:val="22"/>
       </w:rPr>
@@ -21465,7 +21465,7 @@
     </w:tblStylePr>
     <w:tblStylePr w:type="firstCol">
       <w:rPr>
-        <w:rFonts w:ascii="Arial" w:hAnsi="Arial"/>
+        <w:rFonts w:ascii="Times New Roman" w:hAnsi="Times New Roman"/>
         <w:b/>
         <w:color w:val="ffffff" w:themeColor="light1"/>
         <w:sz w:val="22"/>
@@ -21487,7 +21487,7 @@
     </w:tblStylePr>
     <w:tblStylePr w:type="firstRow">
       <w:rPr>
-        <w:rFonts w:ascii="Arial" w:hAnsi="Arial"/>
+        <w:rFonts w:ascii="Times New Roman" w:hAnsi="Times New Roman"/>
         <w:b/>
         <w:color w:val="ffffff" w:themeColor="light1"/>
         <w:sz w:val="22"/>
@@ -21526,7 +21526,7 @@
     </w:tblStylePr>
     <w:tblStylePr w:type="lastRow">
       <w:rPr>
-        <w:rFonts w:ascii="Arial" w:hAnsi="Arial"/>
+        <w:rFonts w:ascii="Times New Roman" w:hAnsi="Times New Roman"/>
         <w:b/>
         <w:color w:val="ffffff" w:themeColor="light1"/>
         <w:sz w:val="22"/>
@@ -21597,7 +21597,7 @@
     </w:tblStylePr>
     <w:tblStylePr w:type="wholeTable">
       <w:rPr>
-        <w:rFonts w:ascii="Arial" w:hAnsi="Arial"/>
+        <w:rFonts w:ascii="Times New Roman" w:hAnsi="Times New Roman"/>
         <w:color w:val="ffffff" w:themeColor="light1"/>
         <w:sz w:val="22"/>
       </w:rPr>
@@ -21707,7 +21707,7 @@
     </w:tblStylePr>
     <w:tblStylePr w:type="firstCol">
       <w:rPr>
-        <w:rFonts w:ascii="Arial" w:hAnsi="Arial"/>
+        <w:rFonts w:ascii="Times New Roman" w:hAnsi="Times New Roman"/>
         <w:b/>
         <w:color w:val="ffffff" w:themeColor="light1"/>
         <w:sz w:val="22"/>
@@ -21729,7 +21729,7 @@
     </w:tblStylePr>
     <w:tblStylePr w:type="firstRow">
       <w:rPr>
-        <w:rFonts w:ascii="Arial" w:hAnsi="Arial"/>
+        <w:rFonts w:ascii="Times New Roman" w:hAnsi="Times New Roman"/>
         <w:b/>
         <w:color w:val="ffffff" w:themeColor="light1"/>
         <w:sz w:val="22"/>
@@ -21768,7 +21768,7 @@
     </w:tblStylePr>
     <w:tblStylePr w:type="lastRow">
       <w:rPr>
-        <w:rFonts w:ascii="Arial" w:hAnsi="Arial"/>
+        <w:rFonts w:ascii="Times New Roman" w:hAnsi="Times New Roman"/>
         <w:b/>
         <w:color w:val="ffffff" w:themeColor="light1"/>
         <w:sz w:val="22"/>
@@ -21839,7 +21839,7 @@
     </w:tblStylePr>
     <w:tblStylePr w:type="wholeTable">
       <w:rPr>
-        <w:rFonts w:ascii="Arial" w:hAnsi="Arial"/>
+        <w:rFonts w:ascii="Times New Roman" w:hAnsi="Times New Roman"/>
         <w:color w:val="ffffff" w:themeColor="light1"/>
         <w:sz w:val="22"/>
       </w:rPr>
@@ -21949,7 +21949,7 @@
     </w:tblStylePr>
     <w:tblStylePr w:type="firstCol">
       <w:rPr>
-        <w:rFonts w:ascii="Arial" w:hAnsi="Arial"/>
+        <w:rFonts w:ascii="Times New Roman" w:hAnsi="Times New Roman"/>
         <w:b/>
         <w:color w:val="ffffff" w:themeColor="light1"/>
         <w:sz w:val="22"/>
@@ -21971,7 +21971,7 @@
     </w:tblStylePr>
     <w:tblStylePr w:type="firstRow">
       <w:rPr>
-        <w:rFonts w:ascii="Arial" w:hAnsi="Arial"/>
+        <w:rFonts w:ascii="Times New Roman" w:hAnsi="Times New Roman"/>
         <w:b/>
         <w:color w:val="ffffff" w:themeColor="light1"/>
         <w:sz w:val="22"/>
@@ -22010,7 +22010,7 @@
     </w:tblStylePr>
     <w:tblStylePr w:type="lastRow">
       <w:rPr>
-        <w:rFonts w:ascii="Arial" w:hAnsi="Arial"/>
+        <w:rFonts w:ascii="Times New Roman" w:hAnsi="Times New Roman"/>
         <w:b/>
         <w:color w:val="ffffff" w:themeColor="light1"/>
         <w:sz w:val="22"/>
@@ -22081,7 +22081,7 @@
     </w:tblStylePr>
     <w:tblStylePr w:type="wholeTable">
       <w:rPr>
-        <w:rFonts w:ascii="Arial" w:hAnsi="Arial"/>
+        <w:rFonts w:ascii="Times New Roman" w:hAnsi="Times New Roman"/>
         <w:color w:val="ffffff" w:themeColor="light1"/>
         <w:sz w:val="22"/>
       </w:rPr>
@@ -22191,7 +22191,7 @@
     </w:tblStylePr>
     <w:tblStylePr w:type="firstCol">
       <w:rPr>
-        <w:rFonts w:ascii="Arial" w:hAnsi="Arial"/>
+        <w:rFonts w:ascii="Times New Roman" w:hAnsi="Times New Roman"/>
         <w:b/>
         <w:color w:val="ffffff" w:themeColor="light1"/>
         <w:sz w:val="22"/>
@@ -22213,7 +22213,7 @@
     </w:tblStylePr>
     <w:tblStylePr w:type="firstRow">
       <w:rPr>
-        <w:rFonts w:ascii="Arial" w:hAnsi="Arial"/>
+        <w:rFonts w:ascii="Times New Roman" w:hAnsi="Times New Roman"/>
         <w:b/>
         <w:color w:val="ffffff" w:themeColor="light1"/>
         <w:sz w:val="22"/>
@@ -22252,7 +22252,7 @@
     </w:tblStylePr>
     <w:tblStylePr w:type="lastRow">
       <w:rPr>
-        <w:rFonts w:ascii="Arial" w:hAnsi="Arial"/>
+        <w:rFonts w:ascii="Times New Roman" w:hAnsi="Times New Roman"/>
         <w:b/>
         <w:color w:val="ffffff" w:themeColor="light1"/>
         <w:sz w:val="22"/>
@@ -22323,7 +22323,7 @@
     </w:tblStylePr>
     <w:tblStylePr w:type="wholeTable">
       <w:rPr>
-        <w:rFonts w:ascii="Arial" w:hAnsi="Arial"/>
+        <w:rFonts w:ascii="Times New Roman" w:hAnsi="Times New Roman"/>
         <w:color w:val="ffffff" w:themeColor="light1"/>
         <w:sz w:val="22"/>
       </w:rPr>
@@ -22363,7 +22363,7 @@
     </w:tcPr>
     <w:tblStylePr w:type="band1Horz">
       <w:rPr>
-        <w:rFonts w:ascii="Arial" w:hAnsi="Arial"/>
+        <w:rFonts w:ascii="Times New Roman" w:hAnsi="Times New Roman"/>
         <w:color w:val="404040" w:themeColor="text1"/>
         <w:sz w:val="22"/>
       </w:rPr>
@@ -22396,7 +22396,7 @@
     </w:tblStylePr>
     <w:tblStylePr w:type="band2Horz">
       <w:rPr>
-        <w:rFonts w:ascii="Arial" w:hAnsi="Arial"/>
+        <w:rFonts w:ascii="Times New Roman" w:hAnsi="Times New Roman"/>
         <w:color w:val="404040" w:themeColor="text1"/>
         <w:sz w:val="22"/>
       </w:rPr>
@@ -22586,7 +22586,7 @@
     </w:tcPr>
     <w:tblStylePr w:type="band1Horz">
       <w:rPr>
-        <w:rFonts w:ascii="Arial" w:hAnsi="Arial"/>
+        <w:rFonts w:ascii="Times New Roman" w:hAnsi="Times New Roman"/>
         <w:color w:val="404040" w:themeColor="accent1" w:themeShade="95"/>
         <w:sz w:val="22"/>
       </w:rPr>
@@ -22619,7 +22619,7 @@
     </w:tblStylePr>
     <w:tblStylePr w:type="band2Horz">
       <w:rPr>
-        <w:rFonts w:ascii="Arial" w:hAnsi="Arial"/>
+        <w:rFonts w:ascii="Times New Roman" w:hAnsi="Times New Roman"/>
         <w:color w:val="404040" w:themeColor="accent1" w:themeShade="95"/>
         <w:sz w:val="22"/>
       </w:rPr>
@@ -22809,7 +22809,7 @@
     </w:tcPr>
     <w:tblStylePr w:type="band1Horz">
       <w:rPr>
-        <w:rFonts w:ascii="Arial" w:hAnsi="Arial"/>
+        <w:rFonts w:ascii="Times New Roman" w:hAnsi="Times New Roman"/>
         <w:color w:val="404040" w:themeColor="accent2" w:themeTint="97" w:themeShade="95"/>
         <w:sz w:val="22"/>
       </w:rPr>
@@ -22842,7 +22842,7 @@
     </w:tblStylePr>
     <w:tblStylePr w:type="band2Horz">
       <w:rPr>
-        <w:rFonts w:ascii="Arial" w:hAnsi="Arial"/>
+        <w:rFonts w:ascii="Times New Roman" w:hAnsi="Times New Roman"/>
         <w:color w:val="404040" w:themeColor="accent2" w:themeTint="97" w:themeShade="95"/>
         <w:sz w:val="22"/>
       </w:rPr>
@@ -23032,7 +23032,7 @@
     </w:tcPr>
     <w:tblStylePr w:type="band1Horz">
       <w:rPr>
-        <w:rFonts w:ascii="Arial" w:hAnsi="Arial"/>
+        <w:rFonts w:ascii="Times New Roman" w:hAnsi="Times New Roman"/>
         <w:color w:val="404040" w:themeColor="accent3" w:themeTint="98" w:themeShade="95"/>
         <w:sz w:val="22"/>
       </w:rPr>
@@ -23065,7 +23065,7 @@
     </w:tblStylePr>
     <w:tblStylePr w:type="band2Horz">
       <w:rPr>
-        <w:rFonts w:ascii="Arial" w:hAnsi="Arial"/>
+        <w:rFonts w:ascii="Times New Roman" w:hAnsi="Times New Roman"/>
         <w:color w:val="404040" w:themeColor="accent3" w:themeTint="98" w:themeShade="95"/>
         <w:sz w:val="22"/>
       </w:rPr>
@@ -23255,7 +23255,7 @@
     </w:tcPr>
     <w:tblStylePr w:type="band1Horz">
       <w:rPr>
-        <w:rFonts w:ascii="Arial" w:hAnsi="Arial"/>
+        <w:rFonts w:ascii="Times New Roman" w:hAnsi="Times New Roman"/>
         <w:color w:val="404040" w:themeColor="accent4" w:themeTint="9A" w:themeShade="95"/>
         <w:sz w:val="22"/>
       </w:rPr>
@@ -23288,7 +23288,7 @@
     </w:tblStylePr>
     <w:tblStylePr w:type="band2Horz">
       <w:rPr>
-        <w:rFonts w:ascii="Arial" w:hAnsi="Arial"/>
+        <w:rFonts w:ascii="Times New Roman" w:hAnsi="Times New Roman"/>
         <w:color w:val="404040" w:themeColor="accent4" w:themeTint="9A" w:themeShade="95"/>
         <w:sz w:val="22"/>
       </w:rPr>
@@ -23478,7 +23478,7 @@
     </w:tcPr>
     <w:tblStylePr w:type="band1Horz">
       <w:rPr>
-        <w:rFonts w:ascii="Arial" w:hAnsi="Arial"/>
+        <w:rFonts w:ascii="Times New Roman" w:hAnsi="Times New Roman"/>
         <w:color w:val="404040" w:themeColor="accent5" w:themeTint="9A" w:themeShade="95"/>
         <w:sz w:val="22"/>
       </w:rPr>
@@ -23511,7 +23511,7 @@
     </w:tblStylePr>
     <w:tblStylePr w:type="band2Horz">
       <w:rPr>
-        <w:rFonts w:ascii="Arial" w:hAnsi="Arial"/>
+        <w:rFonts w:ascii="Times New Roman" w:hAnsi="Times New Roman"/>
         <w:color w:val="404040" w:themeColor="accent5" w:themeTint="9A" w:themeShade="95"/>
         <w:sz w:val="22"/>
       </w:rPr>
@@ -23701,7 +23701,7 @@
     </w:tcPr>
     <w:tblStylePr w:type="band1Horz">
       <w:rPr>
-        <w:rFonts w:ascii="Arial" w:hAnsi="Arial"/>
+        <w:rFonts w:ascii="Times New Roman" w:hAnsi="Times New Roman"/>
         <w:color w:val="404040" w:themeColor="accent6" w:themeTint="98" w:themeShade="95"/>
         <w:sz w:val="22"/>
       </w:rPr>
@@ -23734,7 +23734,7 @@
     </w:tblStylePr>
     <w:tblStylePr w:type="band2Horz">
       <w:rPr>
-        <w:rFonts w:ascii="Arial" w:hAnsi="Arial"/>
+        <w:rFonts w:ascii="Times New Roman" w:hAnsi="Times New Roman"/>
         <w:color w:val="404040" w:themeColor="accent6" w:themeTint="98" w:themeShade="95"/>
         <w:sz w:val="22"/>
       </w:rPr>
@@ -23923,7 +23923,7 @@
     </w:tcPr>
     <w:tblStylePr w:type="band1Horz">
       <w:rPr>
-        <w:rFonts w:ascii="Arial" w:hAnsi="Arial"/>
+        <w:rFonts w:ascii="Times New Roman" w:hAnsi="Times New Roman"/>
         <w:color w:val="4a4a4a" w:themeColor="text1" w:themeTint="80" w:themeShade="95"/>
         <w:sz w:val="22"/>
       </w:rPr>
@@ -23956,7 +23956,7 @@
     </w:tblStylePr>
     <w:tblStylePr w:type="band2Horz">
       <w:rPr>
-        <w:rFonts w:ascii="Arial" w:hAnsi="Arial"/>
+        <w:rFonts w:ascii="Times New Roman" w:hAnsi="Times New Roman"/>
         <w:color w:val="4a4a4a" w:themeColor="text1" w:themeTint="80" w:themeShade="95"/>
         <w:sz w:val="22"/>
       </w:rPr>
@@ -23987,7 +23987,7 @@
     </w:tblStylePr>
     <w:tblStylePr w:type="firstCol">
       <w:rPr>
-        <w:rFonts w:ascii="Arial" w:hAnsi="Arial"/>
+        <w:rFonts w:ascii="Times New Roman" w:hAnsi="Times New Roman"/>
         <w:i/>
         <w:color w:val="4a4a4a" w:themeColor="text1" w:themeTint="80" w:themeShade="95"/>
         <w:sz w:val="22"/>
@@ -24013,7 +24013,7 @@
     </w:tblStylePr>
     <w:tblStylePr w:type="firstRow">
       <w:rPr>
-        <w:rFonts w:ascii="Arial" w:hAnsi="Arial"/>
+        <w:rFonts w:ascii="Times New Roman" w:hAnsi="Times New Roman"/>
         <w:i/>
         <w:color w:val="4a4a4a" w:themeColor="text1" w:themeTint="80" w:themeShade="95"/>
         <w:sz w:val="22"/>
@@ -24038,7 +24038,7 @@
     </w:tblStylePr>
     <w:tblStylePr w:type="lastCol">
       <w:rPr>
-        <w:rFonts w:ascii="Arial" w:hAnsi="Arial"/>
+        <w:rFonts w:ascii="Times New Roman" w:hAnsi="Times New Roman"/>
         <w:i/>
         <w:color w:val="4a4a4a" w:themeColor="text1" w:themeTint="80" w:themeShade="95"/>
         <w:sz w:val="22"/>
@@ -24063,7 +24063,7 @@
     </w:tblStylePr>
     <w:tblStylePr w:type="lastRow">
       <w:rPr>
-        <w:rFonts w:ascii="Arial" w:hAnsi="Arial"/>
+        <w:rFonts w:ascii="Times New Roman" w:hAnsi="Times New Roman"/>
         <w:i/>
         <w:color w:val="4a4a4a" w:themeColor="text1" w:themeTint="80" w:themeShade="95"/>
         <w:sz w:val="22"/>
@@ -24140,7 +24140,7 @@
     </w:tblStylePr>
     <w:tblStylePr w:type="wholeTable">
       <w:rPr>
-        <w:rFonts w:ascii="Arial" w:hAnsi="Arial"/>
+        <w:rFonts w:ascii="Times New Roman" w:hAnsi="Times New Roman"/>
         <w:color w:val="4a4a4a" w:themeColor="text1" w:themeTint="80" w:themeShade="95"/>
         <w:sz w:val="22"/>
       </w:rPr>
@@ -24179,7 +24179,7 @@
     </w:tcPr>
     <w:tblStylePr w:type="band1Horz">
       <w:rPr>
-        <w:rFonts w:ascii="Arial" w:hAnsi="Arial"/>
+        <w:rFonts w:ascii="Times New Roman" w:hAnsi="Times New Roman"/>
         <w:color w:val="254275" w:themeColor="accent1" w:themeShade="95"/>
         <w:sz w:val="22"/>
       </w:rPr>
@@ -24212,7 +24212,7 @@
     </w:tblStylePr>
     <w:tblStylePr w:type="band2Horz">
       <w:rPr>
-        <w:rFonts w:ascii="Arial" w:hAnsi="Arial"/>
+        <w:rFonts w:ascii="Times New Roman" w:hAnsi="Times New Roman"/>
         <w:color w:val="254275" w:themeColor="accent1" w:themeShade="95"/>
         <w:sz w:val="22"/>
       </w:rPr>
@@ -24243,7 +24243,7 @@
     </w:tblStylePr>
     <w:tblStylePr w:type="firstCol">
       <w:rPr>
-        <w:rFonts w:ascii="Arial" w:hAnsi="Arial"/>
+        <w:rFonts w:ascii="Times New Roman" w:hAnsi="Times New Roman"/>
         <w:i/>
         <w:color w:val="254275" w:themeColor="accent1" w:themeShade="95"/>
         <w:sz w:val="22"/>
@@ -24269,7 +24269,7 @@
     </w:tblStylePr>
     <w:tblStylePr w:type="firstRow">
       <w:rPr>
-        <w:rFonts w:ascii="Arial" w:hAnsi="Arial"/>
+        <w:rFonts w:ascii="Times New Roman" w:hAnsi="Times New Roman"/>
         <w:i/>
         <w:color w:val="254275" w:themeColor="accent1" w:themeShade="95"/>
         <w:sz w:val="22"/>
@@ -24294,7 +24294,7 @@
     </w:tblStylePr>
     <w:tblStylePr w:type="lastCol">
       <w:rPr>
-        <w:rFonts w:ascii="Arial" w:hAnsi="Arial"/>
+        <w:rFonts w:ascii="Times New Roman" w:hAnsi="Times New Roman"/>
         <w:i/>
         <w:color w:val="254275" w:themeColor="accent1" w:themeShade="95"/>
         <w:sz w:val="22"/>
@@ -24319,7 +24319,7 @@
     </w:tblStylePr>
     <w:tblStylePr w:type="lastRow">
       <w:rPr>
-        <w:rFonts w:ascii="Arial" w:hAnsi="Arial"/>
+        <w:rFonts w:ascii="Times New Roman" w:hAnsi="Times New Roman"/>
         <w:i/>
         <w:color w:val="254275" w:themeColor="accent1" w:themeShade="95"/>
         <w:sz w:val="22"/>
@@ -24396,7 +24396,7 @@
     </w:tblStylePr>
     <w:tblStylePr w:type="wholeTable">
       <w:rPr>
-        <w:rFonts w:ascii="Arial" w:hAnsi="Arial"/>
+        <w:rFonts w:ascii="Times New Roman" w:hAnsi="Times New Roman"/>
         <w:color w:val="254275" w:themeColor="accent1" w:themeShade="95"/>
         <w:sz w:val="22"/>
       </w:rPr>
@@ -24435,7 +24435,7 @@
     </w:tcPr>
     <w:tblStylePr w:type="band1Horz">
       <w:rPr>
-        <w:rFonts w:ascii="Arial" w:hAnsi="Arial"/>
+        <w:rFonts w:ascii="Times New Roman" w:hAnsi="Times New Roman"/>
         <w:color w:val="cb5d12" w:themeColor="accent2" w:themeTint="97" w:themeShade="95"/>
         <w:sz w:val="22"/>
       </w:rPr>
@@ -24468,7 +24468,7 @@
     </w:tblStylePr>
     <w:tblStylePr w:type="band2Horz">
       <w:rPr>
-        <w:rFonts w:ascii="Arial" w:hAnsi="Arial"/>
+        <w:rFonts w:ascii="Times New Roman" w:hAnsi="Times New Roman"/>
         <w:color w:val="cb5d12" w:themeColor="accent2" w:themeTint="97" w:themeShade="95"/>
         <w:sz w:val="22"/>
       </w:rPr>
@@ -24499,7 +24499,7 @@
     </w:tblStylePr>
     <w:tblStylePr w:type="firstCol">
       <w:rPr>
-        <w:rFonts w:ascii="Arial" w:hAnsi="Arial"/>
+        <w:rFonts w:ascii="Times New Roman" w:hAnsi="Times New Roman"/>
         <w:i/>
         <w:color w:val="cb5d12" w:themeColor="accent2" w:themeTint="97" w:themeShade="95"/>
         <w:sz w:val="22"/>
@@ -24525,7 +24525,7 @@
     </w:tblStylePr>
     <w:tblStylePr w:type="firstRow">
       <w:rPr>
-        <w:rFonts w:ascii="Arial" w:hAnsi="Arial"/>
+        <w:rFonts w:ascii="Times New Roman" w:hAnsi="Times New Roman"/>
         <w:i/>
         <w:color w:val="cb5d12" w:themeColor="accent2" w:themeTint="97" w:themeShade="95"/>
         <w:sz w:val="22"/>
@@ -24550,7 +24550,7 @@
     </w:tblStylePr>
     <w:tblStylePr w:type="lastCol">
       <w:rPr>
-        <w:rFonts w:ascii="Arial" w:hAnsi="Arial"/>
+        <w:rFonts w:ascii="Times New Roman" w:hAnsi="Times New Roman"/>
         <w:i/>
         <w:color w:val="cb5d12" w:themeColor="accent2" w:themeTint="97" w:themeShade="95"/>
         <w:sz w:val="22"/>
@@ -24575,7 +24575,7 @@
     </w:tblStylePr>
     <w:tblStylePr w:type="lastRow">
       <w:rPr>
-        <w:rFonts w:ascii="Arial" w:hAnsi="Arial"/>
+        <w:rFonts w:ascii="Times New Roman" w:hAnsi="Times New Roman"/>
         <w:i/>
         <w:color w:val="cb5d12" w:themeColor="accent2" w:themeTint="97" w:themeShade="95"/>
         <w:sz w:val="22"/>
@@ -24652,7 +24652,7 @@
     </w:tblStylePr>
     <w:tblStylePr w:type="wholeTable">
       <w:rPr>
-        <w:rFonts w:ascii="Arial" w:hAnsi="Arial"/>
+        <w:rFonts w:ascii="Times New Roman" w:hAnsi="Times New Roman"/>
         <w:color w:val="cb5d12" w:themeColor="accent2" w:themeTint="97" w:themeShade="95"/>
         <w:sz w:val="22"/>
       </w:rPr>
@@ -24691,7 +24691,7 @@
     </w:tcPr>
     <w:tblStylePr w:type="band1Horz">
       <w:rPr>
-        <w:rFonts w:ascii="Arial" w:hAnsi="Arial"/>
+        <w:rFonts w:ascii="Times New Roman" w:hAnsi="Times New Roman"/>
         <w:color w:val="767676" w:themeColor="accent3" w:themeTint="98" w:themeShade="95"/>
         <w:sz w:val="22"/>
       </w:rPr>
@@ -24724,7 +24724,7 @@
     </w:tblStylePr>
     <w:tblStylePr w:type="band2Horz">
       <w:rPr>
-        <w:rFonts w:ascii="Arial" w:hAnsi="Arial"/>
+        <w:rFonts w:ascii="Times New Roman" w:hAnsi="Times New Roman"/>
         <w:color w:val="767676" w:themeColor="accent3" w:themeTint="98" w:themeShade="95"/>
         <w:sz w:val="22"/>
       </w:rPr>
@@ -24755,7 +24755,7 @@
     </w:tblStylePr>
     <w:tblStylePr w:type="firstCol">
       <w:rPr>
-        <w:rFonts w:ascii="Arial" w:hAnsi="Arial"/>
+        <w:rFonts w:ascii="Times New Roman" w:hAnsi="Times New Roman"/>
         <w:i/>
         <w:color w:val="767676" w:themeColor="accent3" w:themeTint="98" w:themeShade="95"/>
         <w:sz w:val="22"/>
@@ -24781,7 +24781,7 @@
     </w:tblStylePr>
     <w:tblStylePr w:type="firstRow">
       <w:rPr>
-        <w:rFonts w:ascii="Arial" w:hAnsi="Arial"/>
+        <w:rFonts w:ascii="Times New Roman" w:hAnsi="Times New Roman"/>
         <w:i/>
         <w:color w:val="767676" w:themeColor="accent3" w:themeTint="98" w:themeShade="95"/>
         <w:sz w:val="22"/>
@@ -24806,7 +24806,7 @@
     </w:tblStylePr>
     <w:tblStylePr w:type="lastCol">
       <w:rPr>
-        <w:rFonts w:ascii="Arial" w:hAnsi="Arial"/>
+        <w:rFonts w:ascii="Times New Roman" w:hAnsi="Times New Roman"/>
         <w:i/>
         <w:color w:val="767676" w:themeColor="accent3" w:themeTint="98" w:themeShade="95"/>
         <w:sz w:val="22"/>
@@ -24831,7 +24831,7 @@
     </w:tblStylePr>
     <w:tblStylePr w:type="lastRow">
       <w:rPr>
-        <w:rFonts w:ascii="Arial" w:hAnsi="Arial"/>
+        <w:rFonts w:ascii="Times New Roman" w:hAnsi="Times New Roman"/>
         <w:i/>
         <w:color w:val="767676" w:themeColor="accent3" w:themeTint="98" w:themeShade="95"/>
         <w:sz w:val="22"/>
@@ -24908,7 +24908,7 @@
     </w:tblStylePr>
     <w:tblStylePr w:type="wholeTable">
       <w:rPr>
-        <w:rFonts w:ascii="Arial" w:hAnsi="Arial"/>
+        <w:rFonts w:ascii="Times New Roman" w:hAnsi="Times New Roman"/>
         <w:color w:val="767676" w:themeColor="accent3" w:themeTint="98" w:themeShade="95"/>
         <w:sz w:val="22"/>
       </w:rPr>
@@ -24947,7 +24947,7 @@
     </w:tcPr>
     <w:tblStylePr w:type="band1Horz">
       <w:rPr>
-        <w:rFonts w:ascii="Arial" w:hAnsi="Arial"/>
+        <w:rFonts w:ascii="Times New Roman" w:hAnsi="Times New Roman"/>
         <w:color w:val="d09d00" w:themeColor="accent4" w:themeTint="9A" w:themeShade="95"/>
         <w:sz w:val="22"/>
       </w:rPr>
@@ -24980,7 +24980,7 @@
     </w:tblStylePr>
     <w:tblStylePr w:type="band2Horz">
       <w:rPr>
-        <w:rFonts w:ascii="Arial" w:hAnsi="Arial"/>
+        <w:rFonts w:ascii="Times New Roman" w:hAnsi="Times New Roman"/>
         <w:color w:val="d09d00" w:themeColor="accent4" w:themeTint="9A" w:themeShade="95"/>
         <w:sz w:val="22"/>
       </w:rPr>
@@ -25011,7 +25011,7 @@
     </w:tblStylePr>
     <w:tblStylePr w:type="firstCol">
       <w:rPr>
-        <w:rFonts w:ascii="Arial" w:hAnsi="Arial"/>
+        <w:rFonts w:ascii="Times New Roman" w:hAnsi="Times New Roman"/>
         <w:i/>
         <w:color w:val="d09d00" w:themeColor="accent4" w:themeTint="9A" w:themeShade="95"/>
         <w:sz w:val="22"/>
@@ -25037,7 +25037,7 @@
     </w:tblStylePr>
     <w:tblStylePr w:type="firstRow">
       <w:rPr>
-        <w:rFonts w:ascii="Arial" w:hAnsi="Arial"/>
+        <w:rFonts w:ascii="Times New Roman" w:hAnsi="Times New Roman"/>
         <w:i/>
         <w:color w:val="d09d00" w:themeColor="accent4" w:themeTint="9A" w:themeShade="95"/>
         <w:sz w:val="22"/>
@@ -25062,7 +25062,7 @@
     </w:tblStylePr>
     <w:tblStylePr w:type="lastCol">
       <w:rPr>
-        <w:rFonts w:ascii="Arial" w:hAnsi="Arial"/>
+        <w:rFonts w:ascii="Times New Roman" w:hAnsi="Times New Roman"/>
         <w:i/>
         <w:color w:val="d09d00" w:themeColor="accent4" w:themeTint="9A" w:themeShade="95"/>
         <w:sz w:val="22"/>
@@ -25087,7 +25087,7 @@
     </w:tblStylePr>
     <w:tblStylePr w:type="lastRow">
       <w:rPr>
-        <w:rFonts w:ascii="Arial" w:hAnsi="Arial"/>
+        <w:rFonts w:ascii="Times New Roman" w:hAnsi="Times New Roman"/>
         <w:i/>
         <w:color w:val="d09d00" w:themeColor="accent4" w:themeTint="9A" w:themeShade="95"/>
         <w:sz w:val="22"/>
@@ -25164,7 +25164,7 @@
     </w:tblStylePr>
     <w:tblStylePr w:type="wholeTable">
       <w:rPr>
-        <w:rFonts w:ascii="Arial" w:hAnsi="Arial"/>
+        <w:rFonts w:ascii="Times New Roman" w:hAnsi="Times New Roman"/>
         <w:color w:val="d09d00" w:themeColor="accent4" w:themeTint="9A" w:themeShade="95"/>
         <w:sz w:val="22"/>
       </w:rPr>
@@ -25203,7 +25203,7 @@
     </w:tcPr>
     <w:tblStylePr w:type="band1Horz">
       <w:rPr>
-        <w:rFonts w:ascii="Arial" w:hAnsi="Arial"/>
+        <w:rFonts w:ascii="Times New Roman" w:hAnsi="Times New Roman"/>
         <w:color w:val="2e74b3" w:themeColor="accent5" w:themeTint="9A" w:themeShade="95"/>
         <w:sz w:val="22"/>
       </w:rPr>
@@ -25236,7 +25236,7 @@
     </w:tblStylePr>
     <w:tblStylePr w:type="band2Horz">
       <w:rPr>
-        <w:rFonts w:ascii="Arial" w:hAnsi="Arial"/>
+        <w:rFonts w:ascii="Times New Roman" w:hAnsi="Times New Roman"/>
         <w:color w:val="2e74b3" w:themeColor="accent5" w:themeTint="9A" w:themeShade="95"/>
         <w:sz w:val="22"/>
       </w:rPr>
@@ -25267,7 +25267,7 @@
     </w:tblStylePr>
     <w:tblStylePr w:type="firstCol">
       <w:rPr>
-        <w:rFonts w:ascii="Arial" w:hAnsi="Arial"/>
+        <w:rFonts w:ascii="Times New Roman" w:hAnsi="Times New Roman"/>
         <w:i/>
         <w:color w:val="2e74b3" w:themeColor="accent5" w:themeTint="9A" w:themeShade="95"/>
         <w:sz w:val="22"/>
@@ -25293,7 +25293,7 @@
     </w:tblStylePr>
     <w:tblStylePr w:type="firstRow">
       <w:rPr>
-        <w:rFonts w:ascii="Arial" w:hAnsi="Arial"/>
+        <w:rFonts w:ascii="Times New Roman" w:hAnsi="Times New Roman"/>
         <w:i/>
         <w:color w:val="2e74b3" w:themeColor="accent5" w:themeTint="9A" w:themeShade="95"/>
         <w:sz w:val="22"/>
@@ -25318,7 +25318,7 @@
     </w:tblStylePr>
     <w:tblStylePr w:type="lastCol">
       <w:rPr>
-        <w:rFonts w:ascii="Arial" w:hAnsi="Arial"/>
+        <w:rFonts w:ascii="Times New Roman" w:hAnsi="Times New Roman"/>
         <w:i/>
         <w:color w:val="2e74b3" w:themeColor="accent5" w:themeTint="9A" w:themeShade="95"/>
         <w:sz w:val="22"/>
@@ -25343,7 +25343,7 @@
     </w:tblStylePr>
     <w:tblStylePr w:type="lastRow">
       <w:rPr>
-        <w:rFonts w:ascii="Arial" w:hAnsi="Arial"/>
+        <w:rFonts w:ascii="Times New Roman" w:hAnsi="Times New Roman"/>
         <w:i/>
         <w:color w:val="2e74b3" w:themeColor="accent5" w:themeTint="9A" w:themeShade="95"/>
         <w:sz w:val="22"/>
@@ -25420,7 +25420,7 @@
     </w:tblStylePr>
     <w:tblStylePr w:type="wholeTable">
       <w:rPr>
-        <w:rFonts w:ascii="Arial" w:hAnsi="Arial"/>
+        <w:rFonts w:ascii="Times New Roman" w:hAnsi="Times New Roman"/>
         <w:color w:val="2e74b3" w:themeColor="accent5" w:themeTint="9A" w:themeShade="95"/>
         <w:sz w:val="22"/>
       </w:rPr>
@@ -25459,7 +25459,7 @@
     </w:tcPr>
     <w:tblStylePr w:type="band1Horz">
       <w:rPr>
-        <w:rFonts w:ascii="Arial" w:hAnsi="Arial"/>
+        <w:rFonts w:ascii="Times New Roman" w:hAnsi="Times New Roman"/>
         <w:color w:val="5e923c" w:themeColor="accent6" w:themeTint="98" w:themeShade="95"/>
         <w:sz w:val="22"/>
       </w:rPr>
@@ -25492,7 +25492,7 @@
     </w:tblStylePr>
     <w:tblStylePr w:type="band2Horz">
       <w:rPr>
-        <w:rFonts w:ascii="Arial" w:hAnsi="Arial"/>
+        <w:rFonts w:ascii="Times New Roman" w:hAnsi="Times New Roman"/>
         <w:color w:val="5e923c" w:themeColor="accent6" w:themeTint="98" w:themeShade="95"/>
         <w:sz w:val="22"/>
       </w:rPr>
@@ -25523,7 +25523,7 @@
     </w:tblStylePr>
     <w:tblStylePr w:type="firstCol">
       <w:rPr>
-        <w:rFonts w:ascii="Arial" w:hAnsi="Arial"/>
+        <w:rFonts w:ascii="Times New Roman" w:hAnsi="Times New Roman"/>
         <w:i/>
         <w:color w:val="5e923c" w:themeColor="accent6" w:themeTint="98" w:themeShade="95"/>
         <w:sz w:val="22"/>
@@ -25549,7 +25549,7 @@
     </w:tblStylePr>
     <w:tblStylePr w:type="firstRow">
       <w:rPr>
-        <w:rFonts w:ascii="Arial" w:hAnsi="Arial"/>
+        <w:rFonts w:ascii="Times New Roman" w:hAnsi="Times New Roman"/>
         <w:i/>
         <w:color w:val="5e923c" w:themeColor="accent6" w:themeTint="98" w:themeShade="95"/>
         <w:sz w:val="22"/>
@@ -25574,7 +25574,7 @@
     </w:tblStylePr>
     <w:tblStylePr w:type="lastCol">
       <w:rPr>
-        <w:rFonts w:ascii="Arial" w:hAnsi="Arial"/>
+        <w:rFonts w:ascii="Times New Roman" w:hAnsi="Times New Roman"/>
         <w:i/>
         <w:color w:val="5e923c" w:themeColor="accent6" w:themeTint="98" w:themeShade="95"/>
         <w:sz w:val="22"/>
@@ -25599,7 +25599,7 @@
     </w:tblStylePr>
     <w:tblStylePr w:type="lastRow">
       <w:rPr>
-        <w:rFonts w:ascii="Arial" w:hAnsi="Arial"/>
+        <w:rFonts w:ascii="Times New Roman" w:hAnsi="Times New Roman"/>
         <w:i/>
         <w:color w:val="5e923c" w:themeColor="accent6" w:themeTint="98" w:themeShade="95"/>
         <w:sz w:val="22"/>
@@ -25676,7 +25676,7 @@
     </w:tblStylePr>
     <w:tblStylePr w:type="wholeTable">
       <w:rPr>
-        <w:rFonts w:ascii="Arial" w:hAnsi="Arial"/>
+        <w:rFonts w:ascii="Times New Roman" w:hAnsi="Times New Roman"/>
         <w:color w:val="5e923c" w:themeColor="accent6" w:themeTint="98" w:themeShade="95"/>
         <w:sz w:val="22"/>
       </w:rPr>
@@ -25716,7 +25716,7 @@
     </w:tcPr>
     <w:tblStylePr w:type="band1Horz">
       <w:rPr>
-        <w:rFonts w:ascii="Arial" w:hAnsi="Arial"/>
+        <w:rFonts w:ascii="Times New Roman" w:hAnsi="Times New Roman"/>
         <w:color w:val="404040"/>
         <w:sz w:val="22"/>
       </w:rPr>
@@ -25734,7 +25734,7 @@
     </w:tblStylePr>
     <w:tblStylePr w:type="band1Vert">
       <w:rPr>
-        <w:rFonts w:ascii="Arial" w:hAnsi="Arial"/>
+        <w:rFonts w:ascii="Times New Roman" w:hAnsi="Times New Roman"/>
         <w:color w:val="404040"/>
         <w:sz w:val="22"/>
       </w:rPr>
@@ -25752,7 +25752,7 @@
     </w:tblStylePr>
     <w:tblStylePr w:type="band2Horz">
       <w:rPr>
-        <w:rFonts w:ascii="Arial" w:hAnsi="Arial"/>
+        <w:rFonts w:ascii="Times New Roman" w:hAnsi="Times New Roman"/>
         <w:color w:val="404040"/>
         <w:sz w:val="22"/>
       </w:rPr>
@@ -25771,7 +25771,7 @@
     </w:tblStylePr>
     <w:tblStylePr w:type="band2Vert">
       <w:rPr>
-        <w:rFonts w:ascii="Arial" w:hAnsi="Arial"/>
+        <w:rFonts w:ascii="Times New Roman" w:hAnsi="Times New Roman"/>
         <w:color w:val="404040"/>
         <w:sz w:val="22"/>
       </w:rPr>
@@ -25790,7 +25790,7 @@
     </w:tblStylePr>
     <w:tblStylePr w:type="firstCol">
       <w:rPr>
-        <w:rFonts w:ascii="Arial" w:hAnsi="Arial"/>
+        <w:rFonts w:ascii="Times New Roman" w:hAnsi="Times New Roman"/>
         <w:color w:val="f2f2f2"/>
         <w:sz w:val="22"/>
       </w:rPr>
@@ -25809,7 +25809,7 @@
     </w:tblStylePr>
     <w:tblStylePr w:type="firstRow">
       <w:rPr>
-        <w:rFonts w:ascii="Arial" w:hAnsi="Arial"/>
+        <w:rFonts w:ascii="Times New Roman" w:hAnsi="Times New Roman"/>
         <w:color w:val="f2f2f2"/>
         <w:sz w:val="22"/>
       </w:rPr>
@@ -25828,7 +25828,7 @@
     </w:tblStylePr>
     <w:tblStylePr w:type="lastCol">
       <w:rPr>
-        <w:rFonts w:ascii="Arial" w:hAnsi="Arial"/>
+        <w:rFonts w:ascii="Times New Roman" w:hAnsi="Times New Roman"/>
         <w:color w:val="f2f2f2"/>
         <w:sz w:val="22"/>
       </w:rPr>
@@ -25847,7 +25847,7 @@
     </w:tblStylePr>
     <w:tblStylePr w:type="lastRow">
       <w:rPr>
-        <w:rFonts w:ascii="Arial" w:hAnsi="Arial"/>
+        <w:rFonts w:ascii="Times New Roman" w:hAnsi="Times New Roman"/>
         <w:color w:val="f2f2f2"/>
         <w:sz w:val="22"/>
       </w:rPr>
@@ -25953,7 +25953,7 @@
     </w:tcPr>
     <w:tblStylePr w:type="band1Horz">
       <w:rPr>
-        <w:rFonts w:ascii="Arial" w:hAnsi="Arial"/>
+        <w:rFonts w:ascii="Times New Roman" w:hAnsi="Times New Roman"/>
         <w:color w:val="404040"/>
         <w:sz w:val="22"/>
       </w:rPr>
@@ -25971,7 +25971,7 @@
     </w:tblStylePr>
     <w:tblStylePr w:type="band1Vert">
       <w:rPr>
-        <w:rFonts w:ascii="Arial" w:hAnsi="Arial"/>
+        <w:rFonts w:ascii="Times New Roman" w:hAnsi="Times New Roman"/>
         <w:color w:val="404040"/>
         <w:sz w:val="22"/>
       </w:rPr>
@@ -25989,7 +25989,7 @@
     </w:tblStylePr>
     <w:tblStylePr w:type="band2Horz">
       <w:rPr>
-        <w:rFonts w:ascii="Arial" w:hAnsi="Arial"/>
+        <w:rFonts w:ascii="Times New Roman" w:hAnsi="Times New Roman"/>
         <w:color w:val="404040"/>
         <w:sz w:val="22"/>
       </w:rPr>
@@ -26008,7 +26008,7 @@
     </w:tblStylePr>
     <w:tblStylePr w:type="band2Vert">
       <w:rPr>
-        <w:rFonts w:ascii="Arial" w:hAnsi="Arial"/>
+        <w:rFonts w:ascii="Times New Roman" w:hAnsi="Times New Roman"/>
         <w:color w:val="404040"/>
         <w:sz w:val="22"/>
       </w:rPr>
@@ -26027,7 +26027,7 @@
     </w:tblStylePr>
     <w:tblStylePr w:type="firstCol">
       <w:rPr>
-        <w:rFonts w:ascii="Arial" w:hAnsi="Arial"/>
+        <w:rFonts w:ascii="Times New Roman" w:hAnsi="Times New Roman"/>
         <w:color w:val="f2f2f2"/>
         <w:sz w:val="22"/>
       </w:rPr>
@@ -26046,7 +26046,7 @@
     </w:tblStylePr>
     <w:tblStylePr w:type="firstRow">
       <w:rPr>
-        <w:rFonts w:ascii="Arial" w:hAnsi="Arial"/>
+        <w:rFonts w:ascii="Times New Roman" w:hAnsi="Times New Roman"/>
         <w:color w:val="f2f2f2"/>
         <w:sz w:val="22"/>
       </w:rPr>
@@ -26065,7 +26065,7 @@
     </w:tblStylePr>
     <w:tblStylePr w:type="lastCol">
       <w:rPr>
-        <w:rFonts w:ascii="Arial" w:hAnsi="Arial"/>
+        <w:rFonts w:ascii="Times New Roman" w:hAnsi="Times New Roman"/>
         <w:color w:val="f2f2f2"/>
         <w:sz w:val="22"/>
       </w:rPr>
@@ -26084,7 +26084,7 @@
     </w:tblStylePr>
     <w:tblStylePr w:type="lastRow">
       <w:rPr>
-        <w:rFonts w:ascii="Arial" w:hAnsi="Arial"/>
+        <w:rFonts w:ascii="Times New Roman" w:hAnsi="Times New Roman"/>
         <w:color w:val="f2f2f2"/>
         <w:sz w:val="22"/>
       </w:rPr>
@@ -26190,7 +26190,7 @@
     </w:tcPr>
     <w:tblStylePr w:type="band1Horz">
       <w:rPr>
-        <w:rFonts w:ascii="Arial" w:hAnsi="Arial"/>
+        <w:rFonts w:ascii="Times New Roman" w:hAnsi="Times New Roman"/>
         <w:color w:val="404040"/>
         <w:sz w:val="22"/>
       </w:rPr>
@@ -26208,7 +26208,7 @@
     </w:tblStylePr>
     <w:tblStylePr w:type="band1Vert">
       <w:rPr>
-        <w:rFonts w:ascii="Arial" w:hAnsi="Arial"/>
+        <w:rFonts w:ascii="Times New Roman" w:hAnsi="Times New Roman"/>
         <w:color w:val="404040"/>
         <w:sz w:val="22"/>
       </w:rPr>
@@ -26226,7 +26226,7 @@
     </w:tblStylePr>
     <w:tblStylePr w:type="band2Horz">
       <w:rPr>
-        <w:rFonts w:ascii="Arial" w:hAnsi="Arial"/>
+        <w:rFonts w:ascii="Times New Roman" w:hAnsi="Times New Roman"/>
         <w:color w:val="404040"/>
         <w:sz w:val="22"/>
       </w:rPr>
@@ -26245,7 +26245,7 @@
     </w:tblStylePr>
     <w:tblStylePr w:type="band2Vert">
       <w:rPr>
-        <w:rFonts w:ascii="Arial" w:hAnsi="Arial"/>
+        <w:rFonts w:ascii="Times New Roman" w:hAnsi="Times New Roman"/>
         <w:color w:val="404040"/>
         <w:sz w:val="22"/>
       </w:rPr>
@@ -26264,7 +26264,7 @@
     </w:tblStylePr>
     <w:tblStylePr w:type="firstCol">
       <w:rPr>
-        <w:rFonts w:ascii="Arial" w:hAnsi="Arial"/>
+        <w:rFonts w:ascii="Times New Roman" w:hAnsi="Times New Roman"/>
         <w:color w:val="f2f2f2"/>
         <w:sz w:val="22"/>
       </w:rPr>
@@ -26283,7 +26283,7 @@
     </w:tblStylePr>
     <w:tblStylePr w:type="firstRow">
       <w:rPr>
-        <w:rFonts w:ascii="Arial" w:hAnsi="Arial"/>
+        <w:rFonts w:ascii="Times New Roman" w:hAnsi="Times New Roman"/>
         <w:color w:val="f2f2f2"/>
         <w:sz w:val="22"/>
       </w:rPr>
@@ -26302,7 +26302,7 @@
     </w:tblStylePr>
     <w:tblStylePr w:type="lastCol">
       <w:rPr>
-        <w:rFonts w:ascii="Arial" w:hAnsi="Arial"/>
+        <w:rFonts w:ascii="Times New Roman" w:hAnsi="Times New Roman"/>
         <w:color w:val="f2f2f2"/>
         <w:sz w:val="22"/>
       </w:rPr>
@@ -26321,7 +26321,7 @@
     </w:tblStylePr>
     <w:tblStylePr w:type="lastRow">
       <w:rPr>
-        <w:rFonts w:ascii="Arial" w:hAnsi="Arial"/>
+        <w:rFonts w:ascii="Times New Roman" w:hAnsi="Times New Roman"/>
         <w:color w:val="f2f2f2"/>
         <w:sz w:val="22"/>
       </w:rPr>
@@ -26427,7 +26427,7 @@
     </w:tcPr>
     <w:tblStylePr w:type="band1Horz">
       <w:rPr>
-        <w:rFonts w:ascii="Arial" w:hAnsi="Arial"/>
+        <w:rFonts w:ascii="Times New Roman" w:hAnsi="Times New Roman"/>
         <w:color w:val="404040"/>
         <w:sz w:val="22"/>
       </w:rPr>
@@ -26445,7 +26445,7 @@
     </w:tblStylePr>
     <w:tblStylePr w:type="band1Vert">
       <w:rPr>
-        <w:rFonts w:ascii="Arial" w:hAnsi="Arial"/>
+        <w:rFonts w:ascii="Times New Roman" w:hAnsi="Times New Roman"/>
         <w:color w:val="404040"/>
         <w:sz w:val="22"/>
       </w:rPr>
@@ -26463,7 +26463,7 @@
     </w:tblStylePr>
     <w:tblStylePr w:type="band2Horz">
       <w:rPr>
-        <w:rFonts w:ascii="Arial" w:hAnsi="Arial"/>
+        <w:rFonts w:ascii="Times New Roman" w:hAnsi="Times New Roman"/>
         <w:color w:val="404040"/>
         <w:sz w:val="22"/>
       </w:rPr>
@@ -26482,7 +26482,7 @@
     </w:tblStylePr>
     <w:tblStylePr w:type="band2Vert">
       <w:rPr>
-        <w:rFonts w:ascii="Arial" w:hAnsi="Arial"/>
+        <w:rFonts w:ascii="Times New Roman" w:hAnsi="Times New Roman"/>
         <w:color w:val="404040"/>
         <w:sz w:val="22"/>
       </w:rPr>
@@ -26501,7 +26501,7 @@
     </w:tblStylePr>
     <w:tblStylePr w:type="firstCol">
       <w:rPr>
-        <w:rFonts w:ascii="Arial" w:hAnsi="Arial"/>
+        <w:rFonts w:ascii="Times New Roman" w:hAnsi="Times New Roman"/>
         <w:color w:val="f2f2f2"/>
         <w:sz w:val="22"/>
       </w:rPr>
@@ -26520,7 +26520,7 @@
     </w:tblStylePr>
     <w:tblStylePr w:type="firstRow">
       <w:rPr>
-        <w:rFonts w:ascii="Arial" w:hAnsi="Arial"/>
+        <w:rFonts w:ascii="Times New Roman" w:hAnsi="Times New Roman"/>
         <w:color w:val="f2f2f2"/>
         <w:sz w:val="22"/>
       </w:rPr>
@@ -26539,7 +26539,7 @@
     </w:tblStylePr>
     <w:tblStylePr w:type="lastCol">
       <w:rPr>
-        <w:rFonts w:ascii="Arial" w:hAnsi="Arial"/>
+        <w:rFonts w:ascii="Times New Roman" w:hAnsi="Times New Roman"/>
         <w:color w:val="f2f2f2"/>
         <w:sz w:val="22"/>
       </w:rPr>
@@ -26558,7 +26558,7 @@
     </w:tblStylePr>
     <w:tblStylePr w:type="lastRow">
       <w:rPr>
-        <w:rFonts w:ascii="Arial" w:hAnsi="Arial"/>
+        <w:rFonts w:ascii="Times New Roman" w:hAnsi="Times New Roman"/>
         <w:color w:val="f2f2f2"/>
         <w:sz w:val="22"/>
       </w:rPr>
@@ -26664,7 +26664,7 @@
     </w:tcPr>
     <w:tblStylePr w:type="band1Horz">
       <w:rPr>
-        <w:rFonts w:ascii="Arial" w:hAnsi="Arial"/>
+        <w:rFonts w:ascii="Times New Roman" w:hAnsi="Times New Roman"/>
         <w:color w:val="404040"/>
         <w:sz w:val="22"/>
       </w:rPr>
@@ -26682,7 +26682,7 @@
     </w:tblStylePr>
     <w:tblStylePr w:type="band1Vert">
       <w:rPr>
-        <w:rFonts w:ascii="Arial" w:hAnsi="Arial"/>
+        <w:rFonts w:ascii="Times New Roman" w:hAnsi="Times New Roman"/>
         <w:color w:val="404040"/>
         <w:sz w:val="22"/>
       </w:rPr>
@@ -26700,7 +26700,7 @@
     </w:tblStylePr>
     <w:tblStylePr w:type="band2Horz">
       <w:rPr>
-        <w:rFonts w:ascii="Arial" w:hAnsi="Arial"/>
+        <w:rFonts w:ascii="Times New Roman" w:hAnsi="Times New Roman"/>
         <w:color w:val="404040"/>
         <w:sz w:val="22"/>
       </w:rPr>
@@ -26719,7 +26719,7 @@
     </w:tblStylePr>
     <w:tblStylePr w:type="band2Vert">
       <w:rPr>
-        <w:rFonts w:ascii="Arial" w:hAnsi="Arial"/>
+        <w:rFonts w:ascii="Times New Roman" w:hAnsi="Times New Roman"/>
         <w:color w:val="404040"/>
         <w:sz w:val="22"/>
       </w:rPr>
@@ -26738,7 +26738,7 @@
     </w:tblStylePr>
     <w:tblStylePr w:type="firstCol">
       <w:rPr>
-        <w:rFonts w:ascii="Arial" w:hAnsi="Arial"/>
+        <w:rFonts w:ascii="Times New Roman" w:hAnsi="Times New Roman"/>
         <w:color w:val="f2f2f2"/>
         <w:sz w:val="22"/>
       </w:rPr>
@@ -26757,7 +26757,7 @@
     </w:tblStylePr>
     <w:tblStylePr w:type="firstRow">
       <w:rPr>
-        <w:rFonts w:ascii="Arial" w:hAnsi="Arial"/>
+        <w:rFonts w:ascii="Times New Roman" w:hAnsi="Times New Roman"/>
         <w:color w:val="f2f2f2"/>
         <w:sz w:val="22"/>
       </w:rPr>
@@ -26776,7 +26776,7 @@
     </w:tblStylePr>
     <w:tblStylePr w:type="lastCol">
       <w:rPr>
-        <w:rFonts w:ascii="Arial" w:hAnsi="Arial"/>
+        <w:rFonts w:ascii="Times New Roman" w:hAnsi="Times New Roman"/>
         <w:color w:val="f2f2f2"/>
         <w:sz w:val="22"/>
       </w:rPr>
@@ -26795,7 +26795,7 @@
     </w:tblStylePr>
     <w:tblStylePr w:type="lastRow">
       <w:rPr>
-        <w:rFonts w:ascii="Arial" w:hAnsi="Arial"/>
+        <w:rFonts w:ascii="Times New Roman" w:hAnsi="Times New Roman"/>
         <w:color w:val="f2f2f2"/>
         <w:sz w:val="22"/>
       </w:rPr>
@@ -26901,7 +26901,7 @@
     </w:tcPr>
     <w:tblStylePr w:type="band1Horz">
       <w:rPr>
-        <w:rFonts w:ascii="Arial" w:hAnsi="Arial"/>
+        <w:rFonts w:ascii="Times New Roman" w:hAnsi="Times New Roman"/>
         <w:color w:val="404040"/>
         <w:sz w:val="22"/>
       </w:rPr>
@@ -26919,7 +26919,7 @@
     </w:tblStylePr>
     <w:tblStylePr w:type="band1Vert">
       <w:rPr>
-        <w:rFonts w:ascii="Arial" w:hAnsi="Arial"/>
+        <w:rFonts w:ascii="Times New Roman" w:hAnsi="Times New Roman"/>
         <w:color w:val="404040"/>
         <w:sz w:val="22"/>
       </w:rPr>
@@ -26937,7 +26937,7 @@
     </w:tblStylePr>
     <w:tblStylePr w:type="band2Horz">
       <w:rPr>
-        <w:rFonts w:ascii="Arial" w:hAnsi="Arial"/>
+        <w:rFonts w:ascii="Times New Roman" w:hAnsi="Times New Roman"/>
         <w:color w:val="404040"/>
         <w:sz w:val="22"/>
       </w:rPr>
@@ -26956,7 +26956,7 @@
     </w:tblStylePr>
     <w:tblStylePr w:type="band2Vert">
       <w:rPr>
-        <w:rFonts w:ascii="Arial" w:hAnsi="Arial"/>
+        <w:rFonts w:ascii="Times New Roman" w:hAnsi="Times New Roman"/>
         <w:color w:val="404040"/>
         <w:sz w:val="22"/>
       </w:rPr>
@@ -26975,7 +26975,7 @@
     </w:tblStylePr>
     <w:tblStylePr w:type="firstCol">
       <w:rPr>
-        <w:rFonts w:ascii="Arial" w:hAnsi="Arial"/>
+        <w:rFonts w:ascii="Times New Roman" w:hAnsi="Times New Roman"/>
         <w:color w:val="f2f2f2"/>
         <w:sz w:val="22"/>
       </w:rPr>
@@ -26994,7 +26994,7 @@
     </w:tblStylePr>
     <w:tblStylePr w:type="firstRow">
       <w:rPr>
-        <w:rFonts w:ascii="Arial" w:hAnsi="Arial"/>
+        <w:rFonts w:ascii="Times New Roman" w:hAnsi="Times New Roman"/>
         <w:color w:val="f2f2f2"/>
         <w:sz w:val="22"/>
       </w:rPr>
@@ -27013,7 +27013,7 @@
     </w:tblStylePr>
     <w:tblStylePr w:type="lastCol">
       <w:rPr>
-        <w:rFonts w:ascii="Arial" w:hAnsi="Arial"/>
+        <w:rFonts w:ascii="Times New Roman" w:hAnsi="Times New Roman"/>
         <w:color w:val="f2f2f2"/>
         <w:sz w:val="22"/>
       </w:rPr>
@@ -27032,7 +27032,7 @@
     </w:tblStylePr>
     <w:tblStylePr w:type="lastRow">
       <w:rPr>
-        <w:rFonts w:ascii="Arial" w:hAnsi="Arial"/>
+        <w:rFonts w:ascii="Times New Roman" w:hAnsi="Times New Roman"/>
         <w:color w:val="f2f2f2"/>
         <w:sz w:val="22"/>
       </w:rPr>
@@ -27138,7 +27138,7 @@
     </w:tcPr>
     <w:tblStylePr w:type="band1Horz">
       <w:rPr>
-        <w:rFonts w:ascii="Arial" w:hAnsi="Arial"/>
+        <w:rFonts w:ascii="Times New Roman" w:hAnsi="Times New Roman"/>
         <w:color w:val="404040"/>
         <w:sz w:val="22"/>
       </w:rPr>
@@ -27156,7 +27156,7 @@
     </w:tblStylePr>
     <w:tblStylePr w:type="band1Vert">
       <w:rPr>
-        <w:rFonts w:ascii="Arial" w:hAnsi="Arial"/>
+        <w:rFonts w:ascii="Times New Roman" w:hAnsi="Times New Roman"/>
         <w:color w:val="404040"/>
         <w:sz w:val="22"/>
       </w:rPr>
@@ -27174,7 +27174,7 @@
     </w:tblStylePr>
     <w:tblStylePr w:type="band2Horz">
       <w:rPr>
-        <w:rFonts w:ascii="Arial" w:hAnsi="Arial"/>
+        <w:rFonts w:ascii="Times New Roman" w:hAnsi="Times New Roman"/>
         <w:color w:val="404040"/>
         <w:sz w:val="22"/>
       </w:rPr>
@@ -27193,7 +27193,7 @@
     </w:tblStylePr>
     <w:tblStylePr w:type="band2Vert">
       <w:rPr>
-        <w:rFonts w:ascii="Arial" w:hAnsi="Arial"/>
+        <w:rFonts w:ascii="Times New Roman" w:hAnsi="Times New Roman"/>
         <w:color w:val="404040"/>
         <w:sz w:val="22"/>
       </w:rPr>
@@ -27212,7 +27212,7 @@
     </w:tblStylePr>
     <w:tblStylePr w:type="firstCol">
       <w:rPr>
-        <w:rFonts w:ascii="Arial" w:hAnsi="Arial"/>
+        <w:rFonts w:ascii="Times New Roman" w:hAnsi="Times New Roman"/>
         <w:color w:val="f2f2f2"/>
         <w:sz w:val="22"/>
       </w:rPr>
@@ -27231,7 +27231,7 @@
     </w:tblStylePr>
     <w:tblStylePr w:type="firstRow">
       <w:rPr>
-        <w:rFonts w:ascii="Arial" w:hAnsi="Arial"/>
+        <w:rFonts w:ascii="Times New Roman" w:hAnsi="Times New Roman"/>
         <w:color w:val="f2f2f2"/>
         <w:sz w:val="22"/>
       </w:rPr>
@@ -27250,7 +27250,7 @@
     </w:tblStylePr>
     <w:tblStylePr w:type="lastCol">
       <w:rPr>
-        <w:rFonts w:ascii="Arial" w:hAnsi="Arial"/>
+        <w:rFonts w:ascii="Times New Roman" w:hAnsi="Times New Roman"/>
         <w:color w:val="f2f2f2"/>
         <w:sz w:val="22"/>
       </w:rPr>
@@ -27269,7 +27269,7 @@
     </w:tblStylePr>
     <w:tblStylePr w:type="lastRow">
       <w:rPr>
-        <w:rFonts w:ascii="Arial" w:hAnsi="Arial"/>
+        <w:rFonts w:ascii="Times New Roman" w:hAnsi="Times New Roman"/>
         <w:color w:val="f2f2f2"/>
         <w:sz w:val="22"/>
       </w:rPr>
@@ -27382,7 +27382,7 @@
     </w:tcPr>
     <w:tblStylePr w:type="band1Horz">
       <w:rPr>
-        <w:rFonts w:ascii="Arial" w:hAnsi="Arial"/>
+        <w:rFonts w:ascii="Times New Roman" w:hAnsi="Times New Roman"/>
         <w:color w:val="404040"/>
         <w:sz w:val="22"/>
       </w:rPr>
@@ -27400,7 +27400,7 @@
     </w:tblStylePr>
     <w:tblStylePr w:type="band1Vert">
       <w:rPr>
-        <w:rFonts w:ascii="Arial" w:hAnsi="Arial"/>
+        <w:rFonts w:ascii="Times New Roman" w:hAnsi="Times New Roman"/>
         <w:color w:val="404040"/>
         <w:sz w:val="22"/>
       </w:rPr>
@@ -27418,7 +27418,7 @@
     </w:tblStylePr>
     <w:tblStylePr w:type="band2Horz">
       <w:rPr>
-        <w:rFonts w:ascii="Arial" w:hAnsi="Arial"/>
+        <w:rFonts w:ascii="Times New Roman" w:hAnsi="Times New Roman"/>
         <w:color w:val="404040"/>
         <w:sz w:val="22"/>
       </w:rPr>
@@ -27437,7 +27437,7 @@
     </w:tblStylePr>
     <w:tblStylePr w:type="band2Vert">
       <w:rPr>
-        <w:rFonts w:ascii="Arial" w:hAnsi="Arial"/>
+        <w:rFonts w:ascii="Times New Roman" w:hAnsi="Times New Roman"/>
         <w:color w:val="404040"/>
         <w:sz w:val="22"/>
       </w:rPr>
@@ -27456,7 +27456,7 @@
     </w:tblStylePr>
     <w:tblStylePr w:type="firstCol">
       <w:rPr>
-        <w:rFonts w:ascii="Arial" w:hAnsi="Arial"/>
+        <w:rFonts w:ascii="Times New Roman" w:hAnsi="Times New Roman"/>
         <w:color w:val="f2f2f2"/>
         <w:sz w:val="22"/>
       </w:rPr>
@@ -27475,7 +27475,7 @@
     </w:tblStylePr>
     <w:tblStylePr w:type="firstRow">
       <w:rPr>
-        <w:rFonts w:ascii="Arial" w:hAnsi="Arial"/>
+        <w:rFonts w:ascii="Times New Roman" w:hAnsi="Times New Roman"/>
         <w:color w:val="f2f2f2"/>
         <w:sz w:val="22"/>
       </w:rPr>
@@ -27494,7 +27494,7 @@
     </w:tblStylePr>
     <w:tblStylePr w:type="lastCol">
       <w:rPr>
-        <w:rFonts w:ascii="Arial" w:hAnsi="Arial"/>
+        <w:rFonts w:ascii="Times New Roman" w:hAnsi="Times New Roman"/>
         <w:color w:val="f2f2f2"/>
         <w:sz w:val="22"/>
       </w:rPr>
@@ -27513,7 +27513,7 @@
     </w:tblStylePr>
     <w:tblStylePr w:type="lastRow">
       <w:rPr>
-        <w:rFonts w:ascii="Arial" w:hAnsi="Arial"/>
+        <w:rFonts w:ascii="Times New Roman" w:hAnsi="Times New Roman"/>
         <w:color w:val="f2f2f2"/>
         <w:sz w:val="22"/>
       </w:rPr>
@@ -27626,7 +27626,7 @@
     </w:tcPr>
     <w:tblStylePr w:type="band1Horz">
       <w:rPr>
-        <w:rFonts w:ascii="Arial" w:hAnsi="Arial"/>
+        <w:rFonts w:ascii="Times New Roman" w:hAnsi="Times New Roman"/>
         <w:color w:val="404040"/>
         <w:sz w:val="22"/>
       </w:rPr>
@@ -27644,7 +27644,7 @@
     </w:tblStylePr>
     <w:tblStylePr w:type="band1Vert">
       <w:rPr>
-        <w:rFonts w:ascii="Arial" w:hAnsi="Arial"/>
+        <w:rFonts w:ascii="Times New Roman" w:hAnsi="Times New Roman"/>
         <w:color w:val="404040"/>
         <w:sz w:val="22"/>
       </w:rPr>
@@ -27662,7 +27662,7 @@
     </w:tblStylePr>
     <w:tblStylePr w:type="band2Horz">
       <w:rPr>
-        <w:rFonts w:ascii="Arial" w:hAnsi="Arial"/>
+        <w:rFonts w:ascii="Times New Roman" w:hAnsi="Times New Roman"/>
         <w:color w:val="404040"/>
         <w:sz w:val="22"/>
       </w:rPr>
@@ -27681,7 +27681,7 @@
     </w:tblStylePr>
     <w:tblStylePr w:type="band2Vert">
       <w:rPr>
-        <w:rFonts w:ascii="Arial" w:hAnsi="Arial"/>
+        <w:rFonts w:ascii="Times New Roman" w:hAnsi="Times New Roman"/>
         <w:color w:val="404040"/>
         <w:sz w:val="22"/>
       </w:rPr>
@@ -27700,7 +27700,7 @@
     </w:tblStylePr>
     <w:tblStylePr w:type="firstCol">
       <w:rPr>
-        <w:rFonts w:ascii="Arial" w:hAnsi="Arial"/>
+        <w:rFonts w:ascii="Times New Roman" w:hAnsi="Times New Roman"/>
         <w:color w:val="f2f2f2"/>
         <w:sz w:val="22"/>
       </w:rPr>
@@ -27719,7 +27719,7 @@
     </w:tblStylePr>
     <w:tblStylePr w:type="firstRow">
       <w:rPr>
-        <w:rFonts w:ascii="Arial" w:hAnsi="Arial"/>
+        <w:rFonts w:ascii="Times New Roman" w:hAnsi="Times New Roman"/>
         <w:color w:val="f2f2f2"/>
         <w:sz w:val="22"/>
       </w:rPr>
@@ -27738,7 +27738,7 @@
     </w:tblStylePr>
     <w:tblStylePr w:type="lastCol">
       <w:rPr>
-        <w:rFonts w:ascii="Arial" w:hAnsi="Arial"/>
+        <w:rFonts w:ascii="Times New Roman" w:hAnsi="Times New Roman"/>
         <w:color w:val="f2f2f2"/>
         <w:sz w:val="22"/>
       </w:rPr>
@@ -27757,7 +27757,7 @@
     </w:tblStylePr>
     <w:tblStylePr w:type="lastRow">
       <w:rPr>
-        <w:rFonts w:ascii="Arial" w:hAnsi="Arial"/>
+        <w:rFonts w:ascii="Times New Roman" w:hAnsi="Times New Roman"/>
         <w:color w:val="f2f2f2"/>
         <w:sz w:val="22"/>
       </w:rPr>
@@ -27870,7 +27870,7 @@
     </w:tcPr>
     <w:tblStylePr w:type="band1Horz">
       <w:rPr>
-        <w:rFonts w:ascii="Arial" w:hAnsi="Arial"/>
+        <w:rFonts w:ascii="Times New Roman" w:hAnsi="Times New Roman"/>
         <w:color w:val="404040"/>
         <w:sz w:val="22"/>
       </w:rPr>
@@ -27888,7 +27888,7 @@
     </w:tblStylePr>
     <w:tblStylePr w:type="band1Vert">
       <w:rPr>
-        <w:rFonts w:ascii="Arial" w:hAnsi="Arial"/>
+        <w:rFonts w:ascii="Times New Roman" w:hAnsi="Times New Roman"/>
         <w:color w:val="404040"/>
         <w:sz w:val="22"/>
       </w:rPr>
@@ -27906,7 +27906,7 @@
     </w:tblStylePr>
     <w:tblStylePr w:type="band2Horz">
       <w:rPr>
-        <w:rFonts w:ascii="Arial" w:hAnsi="Arial"/>
+        <w:rFonts w:ascii="Times New Roman" w:hAnsi="Times New Roman"/>
         <w:color w:val="404040"/>
         <w:sz w:val="22"/>
       </w:rPr>
@@ -27925,7 +27925,7 @@
     </w:tblStylePr>
     <w:tblStylePr w:type="band2Vert">
       <w:rPr>
-        <w:rFonts w:ascii="Arial" w:hAnsi="Arial"/>
+        <w:rFonts w:ascii="Times New Roman" w:hAnsi="Times New Roman"/>
         <w:color w:val="404040"/>
         <w:sz w:val="22"/>
       </w:rPr>
@@ -27944,7 +27944,7 @@
     </w:tblStylePr>
     <w:tblStylePr w:type="firstCol">
       <w:rPr>
-        <w:rFonts w:ascii="Arial" w:hAnsi="Arial"/>
+        <w:rFonts w:ascii="Times New Roman" w:hAnsi="Times New Roman"/>
         <w:color w:val="f2f2f2"/>
         <w:sz w:val="22"/>
       </w:rPr>
@@ -27963,7 +27963,7 @@
     </w:tblStylePr>
     <w:tblStylePr w:type="firstRow">
       <w:rPr>
-        <w:rFonts w:ascii="Arial" w:hAnsi="Arial"/>
+        <w:rFonts w:ascii="Times New Roman" w:hAnsi="Times New Roman"/>
         <w:color w:val="f2f2f2"/>
         <w:sz w:val="22"/>
       </w:rPr>
@@ -27982,7 +27982,7 @@
     </w:tblStylePr>
     <w:tblStylePr w:type="lastCol">
       <w:rPr>
-        <w:rFonts w:ascii="Arial" w:hAnsi="Arial"/>
+        <w:rFonts w:ascii="Times New Roman" w:hAnsi="Times New Roman"/>
         <w:color w:val="f2f2f2"/>
         <w:sz w:val="22"/>
       </w:rPr>
@@ -28001,7 +28001,7 @@
     </w:tblStylePr>
     <w:tblStylePr w:type="lastRow">
       <w:rPr>
-        <w:rFonts w:ascii="Arial" w:hAnsi="Arial"/>
+        <w:rFonts w:ascii="Times New Roman" w:hAnsi="Times New Roman"/>
         <w:color w:val="f2f2f2"/>
         <w:sz w:val="22"/>
       </w:rPr>
@@ -28114,7 +28114,7 @@
     </w:tcPr>
     <w:tblStylePr w:type="band1Horz">
       <w:rPr>
-        <w:rFonts w:ascii="Arial" w:hAnsi="Arial"/>
+        <w:rFonts w:ascii="Times New Roman" w:hAnsi="Times New Roman"/>
         <w:color w:val="404040"/>
         <w:sz w:val="22"/>
       </w:rPr>
@@ -28132,7 +28132,7 @@
     </w:tblStylePr>
     <w:tblStylePr w:type="band1Vert">
       <w:rPr>
-        <w:rFonts w:ascii="Arial" w:hAnsi="Arial"/>
+        <w:rFonts w:ascii="Times New Roman" w:hAnsi="Times New Roman"/>
         <w:color w:val="404040"/>
         <w:sz w:val="22"/>
       </w:rPr>
@@ -28150,7 +28150,7 @@
     </w:tblStylePr>
     <w:tblStylePr w:type="band2Horz">
       <w:rPr>
-        <w:rFonts w:ascii="Arial" w:hAnsi="Arial"/>
+        <w:rFonts w:ascii="Times New Roman" w:hAnsi="Times New Roman"/>
         <w:color w:val="404040"/>
         <w:sz w:val="22"/>
       </w:rPr>
@@ -28169,7 +28169,7 @@
     </w:tblStylePr>
     <w:tblStylePr w:type="band2Vert">
       <w:rPr>
-        <w:rFonts w:ascii="Arial" w:hAnsi="Arial"/>
+        <w:rFonts w:ascii="Times New Roman" w:hAnsi="Times New Roman"/>
         <w:color w:val="404040"/>
         <w:sz w:val="22"/>
       </w:rPr>
@@ -28188,7 +28188,7 @@
     </w:tblStylePr>
     <w:tblStylePr w:type="firstCol">
       <w:rPr>
-        <w:rFonts w:ascii="Arial" w:hAnsi="Arial"/>
+        <w:rFonts w:ascii="Times New Roman" w:hAnsi="Times New Roman"/>
         <w:color w:val="f2f2f2"/>
         <w:sz w:val="22"/>
       </w:rPr>
@@ -28207,7 +28207,7 @@
     </w:tblStylePr>
     <w:tblStylePr w:type="firstRow">
       <w:rPr>
-        <w:rFonts w:ascii="Arial" w:hAnsi="Arial"/>
+        <w:rFonts w:ascii="Times New Roman" w:hAnsi="Times New Roman"/>
         <w:color w:val="f2f2f2"/>
         <w:sz w:val="22"/>
       </w:rPr>
@@ -28226,7 +28226,7 @@
     </w:tblStylePr>
     <w:tblStylePr w:type="lastCol">
       <w:rPr>
-        <w:rFonts w:ascii="Arial" w:hAnsi="Arial"/>
+        <w:rFonts w:ascii="Times New Roman" w:hAnsi="Times New Roman"/>
         <w:color w:val="f2f2f2"/>
         <w:sz w:val="22"/>
       </w:rPr>
@@ -28245,7 +28245,7 @@
     </w:tblStylePr>
     <w:tblStylePr w:type="lastRow">
       <w:rPr>
-        <w:rFonts w:ascii="Arial" w:hAnsi="Arial"/>
+        <w:rFonts w:ascii="Times New Roman" w:hAnsi="Times New Roman"/>
         <w:color w:val="f2f2f2"/>
         <w:sz w:val="22"/>
       </w:rPr>
@@ -28358,7 +28358,7 @@
     </w:tcPr>
     <w:tblStylePr w:type="band1Horz">
       <w:rPr>
-        <w:rFonts w:ascii="Arial" w:hAnsi="Arial"/>
+        <w:rFonts w:ascii="Times New Roman" w:hAnsi="Times New Roman"/>
         <w:color w:val="404040"/>
         <w:sz w:val="22"/>
       </w:rPr>
@@ -28376,7 +28376,7 @@
     </w:tblStylePr>
     <w:tblStylePr w:type="band1Vert">
       <w:rPr>
-        <w:rFonts w:ascii="Arial" w:hAnsi="Arial"/>
+        <w:rFonts w:ascii="Times New Roman" w:hAnsi="Times New Roman"/>
         <w:color w:val="404040"/>
         <w:sz w:val="22"/>
       </w:rPr>
@@ -28394,7 +28394,7 @@
     </w:tblStylePr>
     <w:tblStylePr w:type="band2Horz">
       <w:rPr>
-        <w:rFonts w:ascii="Arial" w:hAnsi="Arial"/>
+        <w:rFonts w:ascii="Times New Roman" w:hAnsi="Times New Roman"/>
         <w:color w:val="404040"/>
         <w:sz w:val="22"/>
       </w:rPr>
@@ -28413,7 +28413,7 @@
     </w:tblStylePr>
     <w:tblStylePr w:type="band2Vert">
       <w:rPr>
-        <w:rFonts w:ascii="Arial" w:hAnsi="Arial"/>
+        <w:rFonts w:ascii="Times New Roman" w:hAnsi="Times New Roman"/>
         <w:color w:val="404040"/>
         <w:sz w:val="22"/>
       </w:rPr>
@@ -28432,7 +28432,7 @@
     </w:tblStylePr>
     <w:tblStylePr w:type="firstCol">
       <w:rPr>
-        <w:rFonts w:ascii="Arial" w:hAnsi="Arial"/>
+        <w:rFonts w:ascii="Times New Roman" w:hAnsi="Times New Roman"/>
         <w:color w:val="f2f2f2"/>
         <w:sz w:val="22"/>
       </w:rPr>
@@ -28451,7 +28451,7 @@
     </w:tblStylePr>
     <w:tblStylePr w:type="firstRow">
       <w:rPr>
-        <w:rFonts w:ascii="Arial" w:hAnsi="Arial"/>
+        <w:rFonts w:ascii="Times New Roman" w:hAnsi="Times New Roman"/>
         <w:color w:val="f2f2f2"/>
         <w:sz w:val="22"/>
       </w:rPr>
@@ -28470,7 +28470,7 @@
     </w:tblStylePr>
     <w:tblStylePr w:type="lastCol">
       <w:rPr>
-        <w:rFonts w:ascii="Arial" w:hAnsi="Arial"/>
+        <w:rFonts w:ascii="Times New Roman" w:hAnsi="Times New Roman"/>
         <w:color w:val="f2f2f2"/>
         <w:sz w:val="22"/>
       </w:rPr>
@@ -28489,7 +28489,7 @@
     </w:tblStylePr>
     <w:tblStylePr w:type="lastRow">
       <w:rPr>
-        <w:rFonts w:ascii="Arial" w:hAnsi="Arial"/>
+        <w:rFonts w:ascii="Times New Roman" w:hAnsi="Times New Roman"/>
         <w:color w:val="f2f2f2"/>
         <w:sz w:val="22"/>
       </w:rPr>
@@ -28602,7 +28602,7 @@
     </w:tcPr>
     <w:tblStylePr w:type="band1Horz">
       <w:rPr>
-        <w:rFonts w:ascii="Arial" w:hAnsi="Arial"/>
+        <w:rFonts w:ascii="Times New Roman" w:hAnsi="Times New Roman"/>
         <w:color w:val="404040"/>
         <w:sz w:val="22"/>
       </w:rPr>
@@ -28620,7 +28620,7 @@
     </w:tblStylePr>
     <w:tblStylePr w:type="band1Vert">
       <w:rPr>
-        <w:rFonts w:ascii="Arial" w:hAnsi="Arial"/>
+        <w:rFonts w:ascii="Times New Roman" w:hAnsi="Times New Roman"/>
         <w:color w:val="404040"/>
         <w:sz w:val="22"/>
       </w:rPr>
@@ -28638,7 +28638,7 @@
     </w:tblStylePr>
     <w:tblStylePr w:type="band2Horz">
       <w:rPr>
-        <w:rFonts w:ascii="Arial" w:hAnsi="Arial"/>
+        <w:rFonts w:ascii="Times New Roman" w:hAnsi="Times New Roman"/>
         <w:color w:val="404040"/>
         <w:sz w:val="22"/>
       </w:rPr>
@@ -28657,7 +28657,7 @@
     </w:tblStylePr>
     <w:tblStylePr w:type="band2Vert">
       <w:rPr>
-        <w:rFonts w:ascii="Arial" w:hAnsi="Arial"/>
+        <w:rFonts w:ascii="Times New Roman" w:hAnsi="Times New Roman"/>
         <w:color w:val="404040"/>
         <w:sz w:val="22"/>
       </w:rPr>
@@ -28676,7 +28676,7 @@
     </w:tblStylePr>
     <w:tblStylePr w:type="firstCol">
       <w:rPr>
-        <w:rFonts w:ascii="Arial" w:hAnsi="Arial"/>
+        <w:rFonts w:ascii="Times New Roman" w:hAnsi="Times New Roman"/>
         <w:color w:val="f2f2f2"/>
         <w:sz w:val="22"/>
       </w:rPr>
@@ -28695,7 +28695,7 @@
     </w:tblStylePr>
     <w:tblStylePr w:type="firstRow">
       <w:rPr>
-        <w:rFonts w:ascii="Arial" w:hAnsi="Arial"/>
+        <w:rFonts w:ascii="Times New Roman" w:hAnsi="Times New Roman"/>
         <w:color w:val="f2f2f2"/>
         <w:sz w:val="22"/>
       </w:rPr>
@@ -28714,7 +28714,7 @@
     </w:tblStylePr>
     <w:tblStylePr w:type="lastCol">
       <w:rPr>
-        <w:rFonts w:ascii="Arial" w:hAnsi="Arial"/>
+        <w:rFonts w:ascii="Times New Roman" w:hAnsi="Times New Roman"/>
         <w:color w:val="f2f2f2"/>
         <w:sz w:val="22"/>
       </w:rPr>
@@ -28733,7 +28733,7 @@
     </w:tblStylePr>
     <w:tblStylePr w:type="lastRow">
       <w:rPr>
-        <w:rFonts w:ascii="Arial" w:hAnsi="Arial"/>
+        <w:rFonts w:ascii="Times New Roman" w:hAnsi="Times New Roman"/>
         <w:color w:val="f2f2f2"/>
         <w:sz w:val="22"/>
       </w:rPr>
@@ -28846,7 +28846,7 @@
     </w:tcPr>
     <w:tblStylePr w:type="band1Horz">
       <w:rPr>
-        <w:rFonts w:ascii="Arial" w:hAnsi="Arial"/>
+        <w:rFonts w:ascii="Times New Roman" w:hAnsi="Times New Roman"/>
         <w:color w:val="404040"/>
         <w:sz w:val="22"/>
       </w:rPr>
@@ -28864,7 +28864,7 @@
     </w:tblStylePr>
     <w:tblStylePr w:type="band1Vert">
       <w:rPr>
-        <w:rFonts w:ascii="Arial" w:hAnsi="Arial"/>
+        <w:rFonts w:ascii="Times New Roman" w:hAnsi="Times New Roman"/>
         <w:color w:val="404040"/>
         <w:sz w:val="22"/>
       </w:rPr>
@@ -28882,7 +28882,7 @@
     </w:tblStylePr>
     <w:tblStylePr w:type="band2Horz">
       <w:rPr>
-        <w:rFonts w:ascii="Arial" w:hAnsi="Arial"/>
+        <w:rFonts w:ascii="Times New Roman" w:hAnsi="Times New Roman"/>
         <w:color w:val="404040"/>
         <w:sz w:val="22"/>
       </w:rPr>
@@ -28901,7 +28901,7 @@
     </w:tblStylePr>
     <w:tblStylePr w:type="band2Vert">
       <w:rPr>
-        <w:rFonts w:ascii="Arial" w:hAnsi="Arial"/>
+        <w:rFonts w:ascii="Times New Roman" w:hAnsi="Times New Roman"/>
         <w:color w:val="404040"/>
         <w:sz w:val="22"/>
       </w:rPr>
@@ -28920,7 +28920,7 @@
     </w:tblStylePr>
     <w:tblStylePr w:type="firstCol">
       <w:rPr>
-        <w:rFonts w:ascii="Arial" w:hAnsi="Arial"/>
+        <w:rFonts w:ascii="Times New Roman" w:hAnsi="Times New Roman"/>
         <w:color w:val="f2f2f2"/>
         <w:sz w:val="22"/>
       </w:rPr>
@@ -28939,7 +28939,7 @@
     </w:tblStylePr>
     <w:tblStylePr w:type="firstRow">
       <w:rPr>
-        <w:rFonts w:ascii="Arial" w:hAnsi="Arial"/>
+        <w:rFonts w:ascii="Times New Roman" w:hAnsi="Times New Roman"/>
         <w:color w:val="f2f2f2"/>
         <w:sz w:val="22"/>
       </w:rPr>
@@ -28958,7 +28958,7 @@
     </w:tblStylePr>
     <w:tblStylePr w:type="lastCol">
       <w:rPr>
-        <w:rFonts w:ascii="Arial" w:hAnsi="Arial"/>
+        <w:rFonts w:ascii="Times New Roman" w:hAnsi="Times New Roman"/>
         <w:color w:val="f2f2f2"/>
         <w:sz w:val="22"/>
       </w:rPr>
@@ -28977,7 +28977,7 @@
     </w:tblStylePr>
     <w:tblStylePr w:type="lastRow">
       <w:rPr>
-        <w:rFonts w:ascii="Arial" w:hAnsi="Arial"/>
+        <w:rFonts w:ascii="Times New Roman" w:hAnsi="Times New Roman"/>
         <w:color w:val="f2f2f2"/>
         <w:sz w:val="22"/>
       </w:rPr>
@@ -29087,7 +29087,7 @@
     </w:tcPr>
     <w:tblStylePr w:type="band1Horz">
       <w:rPr>
-        <w:rFonts w:ascii="Arial" w:hAnsi="Arial"/>
+        <w:rFonts w:ascii="Times New Roman" w:hAnsi="Times New Roman"/>
         <w:color w:val="404040"/>
         <w:sz w:val="22"/>
       </w:rPr>
@@ -29149,7 +29149,7 @@
     </w:tblStylePr>
     <w:tblStylePr w:type="firstCol">
       <w:rPr>
-        <w:rFonts w:ascii="Arial" w:hAnsi="Arial"/>
+        <w:rFonts w:ascii="Times New Roman" w:hAnsi="Times New Roman"/>
         <w:color w:val="404040"/>
         <w:sz w:val="22"/>
       </w:rPr>
@@ -29167,7 +29167,7 @@
     </w:tblStylePr>
     <w:tblStylePr w:type="firstRow">
       <w:rPr>
-        <w:rFonts w:ascii="Arial" w:hAnsi="Arial"/>
+        <w:rFonts w:ascii="Times New Roman" w:hAnsi="Times New Roman"/>
         <w:color w:val="404040"/>
         <w:sz w:val="22"/>
       </w:rPr>
@@ -29187,7 +29187,7 @@
     </w:tblStylePr>
     <w:tblStylePr w:type="lastCol">
       <w:rPr>
-        <w:rFonts w:ascii="Arial" w:hAnsi="Arial"/>
+        <w:rFonts w:ascii="Times New Roman" w:hAnsi="Times New Roman"/>
         <w:color w:val="404040"/>
         <w:sz w:val="22"/>
       </w:rPr>
@@ -29207,7 +29207,7 @@
     </w:tblStylePr>
     <w:tblStylePr w:type="lastRow">
       <w:rPr>
-        <w:rFonts w:ascii="Arial" w:hAnsi="Arial"/>
+        <w:rFonts w:ascii="Times New Roman" w:hAnsi="Times New Roman"/>
         <w:color w:val="404040"/>
         <w:sz w:val="22"/>
       </w:rPr>
@@ -29318,7 +29318,7 @@
     </w:tcPr>
     <w:tblStylePr w:type="band1Horz">
       <w:rPr>
-        <w:rFonts w:ascii="Arial" w:hAnsi="Arial"/>
+        <w:rFonts w:ascii="Times New Roman" w:hAnsi="Times New Roman"/>
         <w:color w:val="404040"/>
         <w:sz w:val="22"/>
       </w:rPr>
@@ -29380,7 +29380,7 @@
     </w:tblStylePr>
     <w:tblStylePr w:type="firstCol">
       <w:rPr>
-        <w:rFonts w:ascii="Arial" w:hAnsi="Arial"/>
+        <w:rFonts w:ascii="Times New Roman" w:hAnsi="Times New Roman"/>
         <w:color w:val="404040"/>
         <w:sz w:val="22"/>
       </w:rPr>
@@ -29398,7 +29398,7 @@
     </w:tblStylePr>
     <w:tblStylePr w:type="firstRow">
       <w:rPr>
-        <w:rFonts w:ascii="Arial" w:hAnsi="Arial"/>
+        <w:rFonts w:ascii="Times New Roman" w:hAnsi="Times New Roman"/>
         <w:color w:val="404040"/>
         <w:sz w:val="22"/>
       </w:rPr>
@@ -29418,7 +29418,7 @@
     </w:tblStylePr>
     <w:tblStylePr w:type="lastCol">
       <w:rPr>
-        <w:rFonts w:ascii="Arial" w:hAnsi="Arial"/>
+        <w:rFonts w:ascii="Times New Roman" w:hAnsi="Times New Roman"/>
         <w:color w:val="404040"/>
         <w:sz w:val="22"/>
       </w:rPr>
@@ -29438,7 +29438,7 @@
     </w:tblStylePr>
     <w:tblStylePr w:type="lastRow">
       <w:rPr>
-        <w:rFonts w:ascii="Arial" w:hAnsi="Arial"/>
+        <w:rFonts w:ascii="Times New Roman" w:hAnsi="Times New Roman"/>
         <w:color w:val="404040"/>
         <w:sz w:val="22"/>
       </w:rPr>
@@ -29549,7 +29549,7 @@
     </w:tcPr>
     <w:tblStylePr w:type="band1Horz">
       <w:rPr>
-        <w:rFonts w:ascii="Arial" w:hAnsi="Arial"/>
+        <w:rFonts w:ascii="Times New Roman" w:hAnsi="Times New Roman"/>
         <w:color w:val="404040"/>
         <w:sz w:val="22"/>
       </w:rPr>
@@ -29611,7 +29611,7 @@
     </w:tblStylePr>
     <w:tblStylePr w:type="firstCol">
       <w:rPr>
-        <w:rFonts w:ascii="Arial" w:hAnsi="Arial"/>
+        <w:rFonts w:ascii="Times New Roman" w:hAnsi="Times New Roman"/>
         <w:color w:val="404040"/>
         <w:sz w:val="22"/>
       </w:rPr>
@@ -29629,7 +29629,7 @@
     </w:tblStylePr>
     <w:tblStylePr w:type="firstRow">
       <w:rPr>
-        <w:rFonts w:ascii="Arial" w:hAnsi="Arial"/>
+        <w:rFonts w:ascii="Times New Roman" w:hAnsi="Times New Roman"/>
         <w:color w:val="404040"/>
         <w:sz w:val="22"/>
       </w:rPr>
@@ -29649,7 +29649,7 @@
     </w:tblStylePr>
     <w:tblStylePr w:type="lastCol">
       <w:rPr>
-        <w:rFonts w:ascii="Arial" w:hAnsi="Arial"/>
+        <w:rFonts w:ascii="Times New Roman" w:hAnsi="Times New Roman"/>
         <w:color w:val="404040"/>
         <w:sz w:val="22"/>
       </w:rPr>
@@ -29669,7 +29669,7 @@
     </w:tblStylePr>
     <w:tblStylePr w:type="lastRow">
       <w:rPr>
-        <w:rFonts w:ascii="Arial" w:hAnsi="Arial"/>
+        <w:rFonts w:ascii="Times New Roman" w:hAnsi="Times New Roman"/>
         <w:color w:val="404040"/>
         <w:sz w:val="22"/>
       </w:rPr>
@@ -29780,7 +29780,7 @@
     </w:tcPr>
     <w:tblStylePr w:type="band1Horz">
       <w:rPr>
-        <w:rFonts w:ascii="Arial" w:hAnsi="Arial"/>
+        <w:rFonts w:ascii="Times New Roman" w:hAnsi="Times New Roman"/>
         <w:color w:val="404040"/>
         <w:sz w:val="22"/>
       </w:rPr>
@@ -29842,7 +29842,7 @@
     </w:tblStylePr>
     <w:tblStylePr w:type="firstCol">
       <w:rPr>
-        <w:rFonts w:ascii="Arial" w:hAnsi="Arial"/>
+        <w:rFonts w:ascii="Times New Roman" w:hAnsi="Times New Roman"/>
         <w:color w:val="404040"/>
         <w:sz w:val="22"/>
       </w:rPr>
@@ -29860,7 +29860,7 @@
     </w:tblStylePr>
     <w:tblStylePr w:type="firstRow">
       <w:rPr>
-        <w:rFonts w:ascii="Arial" w:hAnsi="Arial"/>
+        <w:rFonts w:ascii="Times New Roman" w:hAnsi="Times New Roman"/>
         <w:color w:val="404040"/>
         <w:sz w:val="22"/>
       </w:rPr>
@@ -29880,7 +29880,7 @@
     </w:tblStylePr>
     <w:tblStylePr w:type="lastCol">
       <w:rPr>
-        <w:rFonts w:ascii="Arial" w:hAnsi="Arial"/>
+        <w:rFonts w:ascii="Times New Roman" w:hAnsi="Times New Roman"/>
         <w:color w:val="404040"/>
         <w:sz w:val="22"/>
       </w:rPr>
@@ -29900,7 +29900,7 @@
     </w:tblStylePr>
     <w:tblStylePr w:type="lastRow">
       <w:rPr>
-        <w:rFonts w:ascii="Arial" w:hAnsi="Arial"/>
+        <w:rFonts w:ascii="Times New Roman" w:hAnsi="Times New Roman"/>
         <w:color w:val="404040"/>
         <w:sz w:val="22"/>
       </w:rPr>
@@ -30011,7 +30011,7 @@
     </w:tcPr>
     <w:tblStylePr w:type="band1Horz">
       <w:rPr>
-        <w:rFonts w:ascii="Arial" w:hAnsi="Arial"/>
+        <w:rFonts w:ascii="Times New Roman" w:hAnsi="Times New Roman"/>
         <w:color w:val="404040"/>
         <w:sz w:val="22"/>
       </w:rPr>
@@ -30073,7 +30073,7 @@
     </w:tblStylePr>
     <w:tblStylePr w:type="firstCol">
       <w:rPr>
-        <w:rFonts w:ascii="Arial" w:hAnsi="Arial"/>
+        <w:rFonts w:ascii="Times New Roman" w:hAnsi="Times New Roman"/>
         <w:color w:val="404040"/>
         <w:sz w:val="22"/>
       </w:rPr>
@@ -30091,7 +30091,7 @@
     </w:tblStylePr>
     <w:tblStylePr w:type="firstRow">
       <w:rPr>
-        <w:rFonts w:ascii="Arial" w:hAnsi="Arial"/>
+        <w:rFonts w:ascii="Times New Roman" w:hAnsi="Times New Roman"/>
         <w:color w:val="404040"/>
         <w:sz w:val="22"/>
       </w:rPr>
@@ -30111,7 +30111,7 @@
     </w:tblStylePr>
     <w:tblStylePr w:type="lastCol">
       <w:rPr>
-        <w:rFonts w:ascii="Arial" w:hAnsi="Arial"/>
+        <w:rFonts w:ascii="Times New Roman" w:hAnsi="Times New Roman"/>
         <w:color w:val="404040"/>
         <w:sz w:val="22"/>
       </w:rPr>
@@ -30131,7 +30131,7 @@
     </w:tblStylePr>
     <w:tblStylePr w:type="lastRow">
       <w:rPr>
-        <w:rFonts w:ascii="Arial" w:hAnsi="Arial"/>
+        <w:rFonts w:ascii="Times New Roman" w:hAnsi="Times New Roman"/>
         <w:color w:val="404040"/>
         <w:sz w:val="22"/>
       </w:rPr>
@@ -30242,7 +30242,7 @@
     </w:tcPr>
     <w:tblStylePr w:type="band1Horz">
       <w:rPr>
-        <w:rFonts w:ascii="Arial" w:hAnsi="Arial"/>
+        <w:rFonts w:ascii="Times New Roman" w:hAnsi="Times New Roman"/>
         <w:color w:val="404040"/>
         <w:sz w:val="22"/>
       </w:rPr>
@@ -30304,7 +30304,7 @@
     </w:tblStylePr>
     <w:tblStylePr w:type="firstCol">
       <w:rPr>
-        <w:rFonts w:ascii="Arial" w:hAnsi="Arial"/>
+        <w:rFonts w:ascii="Times New Roman" w:hAnsi="Times New Roman"/>
         <w:color w:val="404040"/>
         <w:sz w:val="22"/>
       </w:rPr>
@@ -30322,7 +30322,7 @@
     </w:tblStylePr>
     <w:tblStylePr w:type="firstRow">
       <w:rPr>
-        <w:rFonts w:ascii="Arial" w:hAnsi="Arial"/>
+        <w:rFonts w:ascii="Times New Roman" w:hAnsi="Times New Roman"/>
         <w:color w:val="404040"/>
         <w:sz w:val="22"/>
       </w:rPr>
@@ -30342,7 +30342,7 @@
     </w:tblStylePr>
     <w:tblStylePr w:type="lastCol">
       <w:rPr>
-        <w:rFonts w:ascii="Arial" w:hAnsi="Arial"/>
+        <w:rFonts w:ascii="Times New Roman" w:hAnsi="Times New Roman"/>
         <w:color w:val="404040"/>
         <w:sz w:val="22"/>
       </w:rPr>
@@ -30362,7 +30362,7 @@
     </w:tblStylePr>
     <w:tblStylePr w:type="lastRow">
       <w:rPr>
-        <w:rFonts w:ascii="Arial" w:hAnsi="Arial"/>
+        <w:rFonts w:ascii="Times New Roman" w:hAnsi="Times New Roman"/>
         <w:color w:val="404040"/>
         <w:sz w:val="22"/>
       </w:rPr>
@@ -30473,7 +30473,7 @@
     </w:tcPr>
     <w:tblStylePr w:type="band1Horz">
       <w:rPr>
-        <w:rFonts w:ascii="Arial" w:hAnsi="Arial"/>
+        <w:rFonts w:ascii="Times New Roman" w:hAnsi="Times New Roman"/>
         <w:color w:val="404040"/>
         <w:sz w:val="22"/>
       </w:rPr>
@@ -30535,7 +30535,7 @@
     </w:tblStylePr>
     <w:tblStylePr w:type="firstCol">
       <w:rPr>
-        <w:rFonts w:ascii="Arial" w:hAnsi="Arial"/>
+        <w:rFonts w:ascii="Times New Roman" w:hAnsi="Times New Roman"/>
         <w:color w:val="404040"/>
         <w:sz w:val="22"/>
       </w:rPr>
@@ -30553,7 +30553,7 @@
     </w:tblStylePr>
     <w:tblStylePr w:type="firstRow">
       <w:rPr>
-        <w:rFonts w:ascii="Arial" w:hAnsi="Arial"/>
+        <w:rFonts w:ascii="Times New Roman" w:hAnsi="Times New Roman"/>
         <w:color w:val="404040"/>
         <w:sz w:val="22"/>
       </w:rPr>
@@ -30573,7 +30573,7 @@
     </w:tblStylePr>
     <w:tblStylePr w:type="lastCol">
       <w:rPr>
-        <w:rFonts w:ascii="Arial" w:hAnsi="Arial"/>
+        <w:rFonts w:ascii="Times New Roman" w:hAnsi="Times New Roman"/>
         <w:color w:val="404040"/>
         <w:sz w:val="22"/>
       </w:rPr>
@@ -30593,7 +30593,7 @@
     </w:tblStylePr>
     <w:tblStylePr w:type="lastRow">
       <w:rPr>
-        <w:rFonts w:ascii="Arial" w:hAnsi="Arial"/>
+        <w:rFonts w:ascii="Times New Roman" w:hAnsi="Times New Roman"/>
         <w:color w:val="404040"/>
         <w:sz w:val="22"/>
       </w:rPr>
@@ -30694,7 +30694,7 @@
       <w:outlineLvl w:val="6"/>
     </w:pPr>
     <w:rPr>
-      <w:rFonts w:ascii="Arial" w:hAnsi="Arial" w:eastAsia="Arial" w:cs="Arial"/>
+      <w:rFonts w:ascii="Times New Roman" w:hAnsi="Times New Roman" w:eastAsia="Times New Roman" w:cs="Times New Roman"/>
       <w:color w:val="595959" w:themeColor="text1" w:themeTint="A6"/>
     </w:rPr>
   </w:style>
@@ -30715,7 +30715,7 @@
       <w:outlineLvl w:val="7"/>
     </w:pPr>
     <w:rPr>
-      <w:rFonts w:ascii="Arial" w:hAnsi="Arial" w:eastAsia="Arial" w:cs="Arial"/>
+      <w:rFonts w:ascii="Times New Roman" w:hAnsi="Times New Roman" w:eastAsia="Times New Roman" w:cs="Times New Roman"/>
       <w:i/>
       <w:iCs/>
       <w:color w:val="272727" w:themeColor="text1" w:themeTint="D8"/>
@@ -30738,7 +30738,7 @@
       <w:outlineLvl w:val="8"/>
     </w:pPr>
     <w:rPr>
-      <w:rFonts w:ascii="Arial" w:hAnsi="Arial" w:eastAsia="Arial" w:cs="Arial"/>
+      <w:rFonts w:ascii="Times New Roman" w:hAnsi="Times New Roman" w:eastAsia="Times New Roman" w:cs="Times New Roman"/>
       <w:i/>
       <w:iCs/>
       <w:color w:val="272727" w:themeColor="text1" w:themeTint="D8"/>
@@ -30755,7 +30755,7 @@
       <w:ind/>
     </w:pPr>
     <w:rPr>
-      <w:rFonts w:ascii="Arial" w:hAnsi="Arial" w:eastAsia="Arial" w:cs="Arial"/>
+      <w:rFonts w:ascii="Times New Roman" w:hAnsi="Times New Roman" w:eastAsia="Times New Roman" w:cs="Times New Roman"/>
       <w:color w:val="0f4761" w:themeColor="accent1" w:themeShade="BF"/>
       <w:sz w:val="40"/>
       <w:szCs w:val="40"/>
@@ -30772,7 +30772,7 @@
       <w:ind/>
     </w:pPr>
     <w:rPr>
-      <w:rFonts w:ascii="Arial" w:hAnsi="Arial" w:eastAsia="Arial" w:cs="Arial"/>
+      <w:rFonts w:ascii="Times New Roman" w:hAnsi="Times New Roman" w:eastAsia="Times New Roman" w:cs="Times New Roman"/>
       <w:color w:val="0f4761" w:themeColor="accent1" w:themeShade="BF"/>
       <w:sz w:val="32"/>
       <w:szCs w:val="32"/>
@@ -30789,7 +30789,7 @@
       <w:ind/>
     </w:pPr>
     <w:rPr>
-      <w:rFonts w:ascii="Arial" w:hAnsi="Arial" w:eastAsia="Arial" w:cs="Arial"/>
+      <w:rFonts w:ascii="Times New Roman" w:hAnsi="Times New Roman" w:eastAsia="Times New Roman" w:cs="Times New Roman"/>
       <w:color w:val="0f4761" w:themeColor="accent1" w:themeShade="BF"/>
       <w:sz w:val="28"/>
       <w:szCs w:val="28"/>
@@ -30806,7 +30806,7 @@
       <w:ind/>
     </w:pPr>
     <w:rPr>
-      <w:rFonts w:ascii="Arial" w:hAnsi="Arial" w:eastAsia="Arial" w:cs="Arial"/>
+      <w:rFonts w:ascii="Times New Roman" w:hAnsi="Times New Roman" w:eastAsia="Times New Roman" w:cs="Times New Roman"/>
       <w:i/>
       <w:iCs/>
       <w:color w:val="0f4761" w:themeColor="accent1" w:themeShade="BF"/>
@@ -30823,7 +30823,7 @@
       <w:ind/>
     </w:pPr>
     <w:rPr>
-      <w:rFonts w:ascii="Arial" w:hAnsi="Arial" w:eastAsia="Arial" w:cs="Arial"/>
+      <w:rFonts w:ascii="Times New Roman" w:hAnsi="Times New Roman" w:eastAsia="Times New Roman" w:cs="Times New Roman"/>
       <w:color w:val="0f4761" w:themeColor="accent1" w:themeShade="BF"/>
     </w:rPr>
   </w:style>
@@ -30838,7 +30838,7 @@
       <w:ind/>
     </w:pPr>
     <w:rPr>
-      <w:rFonts w:ascii="Arial" w:hAnsi="Arial" w:eastAsia="Arial" w:cs="Arial"/>
+      <w:rFonts w:ascii="Times New Roman" w:hAnsi="Times New Roman" w:eastAsia="Times New Roman" w:cs="Times New Roman"/>
       <w:i/>
       <w:iCs/>
       <w:color w:val="595959" w:themeColor="text1" w:themeTint="A6"/>
@@ -30855,7 +30855,7 @@
       <w:ind/>
     </w:pPr>
     <w:rPr>
-      <w:rFonts w:ascii="Arial" w:hAnsi="Arial" w:eastAsia="Arial" w:cs="Arial"/>
+      <w:rFonts w:ascii="Times New Roman" w:hAnsi="Times New Roman" w:eastAsia="Times New Roman" w:cs="Times New Roman"/>
       <w:color w:val="595959" w:themeColor="text1" w:themeTint="A6"/>
     </w:rPr>
   </w:style>
@@ -30870,7 +30870,7 @@
       <w:ind/>
     </w:pPr>
     <w:rPr>
-      <w:rFonts w:ascii="Arial" w:hAnsi="Arial" w:eastAsia="Arial" w:cs="Arial"/>
+      <w:rFonts w:ascii="Times New Roman" w:hAnsi="Times New Roman" w:eastAsia="Times New Roman" w:cs="Times New Roman"/>
       <w:i/>
       <w:iCs/>
       <w:color w:val="272727" w:themeColor="text1" w:themeTint="D8"/>
@@ -30887,7 +30887,7 @@
       <w:ind/>
     </w:pPr>
     <w:rPr>
-      <w:rFonts w:ascii="Arial" w:hAnsi="Arial" w:eastAsia="Arial" w:cs="Arial"/>
+      <w:rFonts w:ascii="Times New Roman" w:hAnsi="Times New Roman" w:eastAsia="Times New Roman" w:cs="Times New Roman"/>
       <w:i/>
       <w:iCs/>
       <w:color w:val="272727" w:themeColor="text1" w:themeTint="D8"/>
@@ -30904,7 +30904,7 @@
       <w:ind/>
     </w:pPr>
     <w:rPr>
-      <w:rFonts w:ascii="Arial" w:hAnsi="Arial" w:eastAsia="Arial" w:cs="Arial"/>
+      <w:rFonts w:ascii="Times New Roman" w:hAnsi="Times New Roman" w:eastAsia="Times New Roman" w:cs="Times New Roman"/>
       <w:spacing w:val="-10"/>
       <w:sz w:val="56"/>
       <w:szCs w:val="56"/>
@@ -31756,7 +31756,7 @@
     </w:pPr>
     <w:rPr>
       <w:rFonts w:ascii="Times New Roman" w:hAnsi="Times New Roman" w:eastAsia="Times New Roman" w:cs="Times New Roman"/>
-      <w:lang w:eastAsia="es-MX"/>
+      <w:lang w:eastAsia="Times New Roman"/>
     </w:rPr>
   </w:style>
   <w:style w:type="character" w:styleId="722" w:default="1">
@@ -32002,7 +32002,7 @@
     </w:pPr>
     <w:rPr>
       <w:rFonts w:ascii="Times New Roman" w:hAnsi="Times New Roman" w:eastAsia="Times New Roman" w:cs="Times New Roman"/>
-      <w:lang w:eastAsia="es-MX"/>
+      <w:lang w:eastAsia="Times New Roman"/>
     </w:rPr>
   </w:style>
   <w:style w:type="paragraph" w:styleId="727">
@@ -32033,7 +32033,7 @@
     </w:pPr>
     <w:rPr>
       <w:rFonts w:ascii="Times New Roman" w:hAnsi="Times New Roman" w:eastAsia="Times New Roman" w:cs="Times New Roman"/>
-      <w:lang w:eastAsia="es-MX"/>
+      <w:lang w:eastAsia="Times New Roman"/>
     </w:rPr>
   </w:style>
   <w:style w:type="paragraph" w:styleId="729">
@@ -32050,7 +32050,7 @@
     <w:rPr>
       <w:rFonts w:asciiTheme="minorHAnsi" w:hAnsiTheme="minorHAnsi" w:eastAsiaTheme="minorEastAsia" w:cstheme="minorBidi"/>
       <w:sz w:val="21"/>
-      <w:lang w:val="es-ES" w:eastAsia="en-US"/>
+      <w:lang w:val="es-ES" w:eastAsia="Times New Roman"/>
     </w:rPr>
   </w:style>
   <w:style w:type="table" w:styleId="730">
@@ -32258,7 +32258,7 @@
       <w:ind/>
     </w:pPr>
     <w:rPr>
-      <w:rFonts w:ascii="Georgia" w:hAnsi="Georgia" w:eastAsia="Georgia" w:cs="Georgia"/>
+      <w:rFonts w:ascii="Times New Roman" w:hAnsi="Times New Roman" w:eastAsia="Times New Roman" w:cs="Times New Roman"/>
       <w:i/>
       <w:color w:val="666666"/>
       <w:sz w:val="48"/>

</xml_diff>

<commit_message>
feat: add BocchiLoading component for dynamic loading state with animated visuals and messages
</commit_message>
<xml_diff>
--- a/public/templates/PLANTILLA PROTOCOLO COLABORATIVO.docx
+++ b/public/templates/PLANTILLA PROTOCOLO COLABORATIVO.docx
@@ -746,130 +746,19 @@
     </w:tbl>
     <w:p>
       <w:pPr>
-        <w:pBdr/>
-        <w:spacing w:line="360" w:lineRule="auto"/>
-        <w:ind/>
-        <w:jc w:val="both"/>
+        <w:spacing w:before="0" w:after="0" w:line="20" w:lineRule="exact"/>
         <w:rPr>
-          <w:b/>
-          <w:bCs/>
+          <w:sz w:val="2"/>
+          <w:szCs w:val="2"/>
         </w:rPr>
       </w:pPr>
-      <w:r>
-        <w:rPr>
-          <w:b/>
-          <w:bCs/>
-          <w:rtl w:val="0"/>
-        </w:rPr>
-      </w:r>
-      <w:r>
-        <w:rPr>
-          <w:b/>
-          <w:bCs/>
-        </w:rPr>
-      </w:r>
-    </w:p>
-    <w:p>
-      <w:pPr>
-        <w:pBdr/>
-        <w:spacing/>
-        <w:ind/>
-        <w:jc w:val="both"/>
-        <w:rPr>
-          <w:b/>
-        </w:rPr>
-      </w:pPr>
-      <w:r>
-        <w:rPr>
-          <w:b/>
-          <w:bCs/>
-          <w:rtl w:val="0"/>
-        </w:rPr>
-      </w:r>
-      <w:r>
-        <w:rPr>
-          <w:b/>
-        </w:rPr>
-      </w:r>
-    </w:p>
-    <w:p>
-      <w:pPr>
-        <w:pBdr/>
-        <w:spacing/>
-        <w:ind/>
-        <w:jc w:val="both"/>
-        <w:rPr>
-          <w:b/>
-        </w:rPr>
-      </w:pPr>
-      <w:r>
-        <w:rPr>
-          <w:b/>
-          <w:bCs/>
-          <w:rtl w:val="0"/>
-        </w:rPr>
-      </w:r>
-      <w:r>
-        <w:rPr>
-          <w:b/>
-        </w:rPr>
-      </w:r>
-    </w:p>
-    <w:p>
-      <w:pPr>
-        <w:pBdr/>
-        <w:spacing/>
-        <w:ind/>
-        <w:jc w:val="center"/>
-        <w:rPr>
-          <w:b/>
-          <w:bCs/>
-        </w:rPr>
-      </w:pPr>
-      <w:r>
-        <w:rPr>
-          <w:b/>
-          <w:bCs/>
-          <w:rtl w:val="0"/>
-        </w:rPr>
-      </w:r>
-      <w:r>
-        <w:rPr>
-          <w:b/>
-          <w:bCs/>
-        </w:rPr>
-      </w:r>
-    </w:p>
-    <w:p>
-      <w:pPr>
-        <w:pBdr/>
-        <w:spacing/>
-        <w:ind/>
-        <w:rPr>
-          <w:b/>
-          <w:bCs/>
-        </w:rPr>
-      </w:pPr>
-      <w:r>
-        <w:rPr>
-          <w:b/>
-          <w:bCs/>
-          <w:rtl w:val="0"/>
-        </w:rPr>
-      </w:r>
-      <w:r>
-        <w:rPr>
-          <w:b/>
-          <w:bCs/>
-        </w:rPr>
-      </w:r>
     </w:p>
     <w:sectPr>
       <w:headerReference w:type="default" r:id="rId8"/>
       <w:footerReference w:type="default" r:id="rId9"/>
       <w:footnotePr/>
       <w:endnotePr/>
-      <w:type w:val="nextPage"/>
+      <w:type w:val="continuous"/>
       <w:pgSz w:h="15840" w:orient="portrait" w:w="12240"/>
       <w:pgMar w:top="1985" w:right="1701" w:bottom="1417" w:left="1701" w:header="708" w:footer="708" w:gutter="0"/>
       <w:pgNumType w:start="1"/>

</xml_diff>